<commit_message>
Draft_088: QR + QRL on one Appendix A page; Full Codebook from p. 2
- Drop page break between Quick-Reference and Legend
- Page break before FULL CODEBOOK
- Lookup note and spacing tightened to fit p. 1
</commit_message>
<xml_diff>
--- a/thesis/003_ThesisProposal_Draft_088.docx
+++ b/thesis/003_ThesisProposal_Draft_088.docx
@@ -12261,7 +12261,7 @@
     <w:p>
       <w:pPr>
         <w:keepNext w:val="1"/>
-        <w:spacing w:before="40" w:after="20" w:line="264" w:lineRule="auto"/>
+        <w:spacing w:before="60" w:after="40" w:line="220" w:lineRule="auto"/>
         <w:jc w:val="left"/>
         <w:rPr/>
       </w:pPr>
@@ -12286,7 +12286,7 @@
     </w:p>
     <w:p>
       <w:pPr>
-        <w:spacing w:before="20" w:after="20" w:line="240" w:lineRule="auto"/>
+        <w:spacing w:before="20" w:after="20" w:line="220" w:lineRule="auto"/>
         <w:jc w:val="both"/>
         <w:rPr/>
       </w:pPr>
@@ -12297,13 +12297,13 @@
           <w:sz w:val="22"/>
           <w:szCs w:val="22"/>
         </w:rPr>
-        <w:t>• Lookup: Quick-Reference + Legend (pp. 1–2). Full Codebook from p. 3. Coding sheet columns at end.</w:t>
+        <w:t>• Lookup: Quick-Reference + Legend (p. 1). Full Codebook from p. 2. Coding sheet columns at end.</w:t>
       </w:r>
     </w:p>
     <w:p>
       <w:pPr>
         <w:keepNext w:val="1"/>
-        <w:spacing w:before="20" w:after="20" w:line="240" w:lineRule="auto"/>
+        <w:spacing w:before="60" w:after="40" w:line="220" w:lineRule="auto"/>
         <w:ind w:firstLine="720"/>
         <w:jc w:val="left"/>
         <w:rPr/>
@@ -12329,7 +12329,7 @@
     </w:p>
     <w:p>
       <w:pPr>
-        <w:spacing w:before="20" w:after="20" w:line="240" w:lineRule="auto"/>
+        <w:spacing w:before="20" w:after="20" w:line="220" w:lineRule="auto"/>
         <w:jc w:val="both"/>
         <w:rPr/>
       </w:pPr>
@@ -12355,7 +12355,7 @@
     <w:p>
       <w:pPr>
         <w:keepNext w:val="1"/>
-        <w:spacing w:before="20" w:after="20" w:line="240" w:lineRule="auto"/>
+        <w:spacing w:before="20" w:after="20" w:line="220" w:lineRule="auto"/>
         <w:jc w:val="left"/>
         <w:rPr/>
       </w:pPr>
@@ -12380,7 +12380,7 @@
     </w:p>
     <w:p>
       <w:pPr>
-        <w:spacing w:before="20" w:after="20" w:line="240" w:lineRule="auto"/>
+        <w:spacing w:before="20" w:after="20" w:line="220" w:lineRule="auto"/>
         <w:ind w:left="240" w:firstLine="0"/>
         <w:jc w:val="both"/>
         <w:rPr/>
@@ -12406,7 +12406,7 @@
     </w:p>
     <w:p>
       <w:pPr>
-        <w:spacing w:before="20" w:after="20" w:line="240" w:lineRule="auto"/>
+        <w:spacing w:before="20" w:after="20" w:line="220" w:lineRule="auto"/>
         <w:ind w:left="240" w:firstLine="0"/>
         <w:jc w:val="both"/>
         <w:rPr/>
@@ -12433,7 +12433,7 @@
     </w:p>
     <w:p>
       <w:pPr>
-        <w:spacing w:before="20" w:after="20" w:line="240" w:lineRule="auto"/>
+        <w:spacing w:before="20" w:after="20" w:line="220" w:lineRule="auto"/>
         <w:ind w:left="240" w:firstLine="0"/>
         <w:jc w:val="both"/>
         <w:rPr/>
@@ -12459,7 +12459,7 @@
     </w:p>
     <w:p>
       <w:pPr>
-        <w:spacing w:before="20" w:after="20" w:line="240" w:lineRule="auto"/>
+        <w:spacing w:before="20" w:after="20" w:line="220" w:lineRule="auto"/>
         <w:ind w:left="240" w:firstLine="0"/>
         <w:jc w:val="both"/>
         <w:rPr/>
@@ -12486,7 +12486,7 @@
     <w:p>
       <w:pPr>
         <w:keepNext w:val="1"/>
-        <w:spacing w:before="20" w:after="20" w:line="240" w:lineRule="auto"/>
+        <w:spacing w:before="20" w:after="20" w:line="220" w:lineRule="auto"/>
         <w:ind w:firstLine="720"/>
         <w:jc w:val="left"/>
         <w:rPr/>
@@ -12512,7 +12512,7 @@
     </w:p>
     <w:p>
       <w:pPr>
-        <w:spacing w:before="20" w:after="20" w:line="240" w:lineRule="auto"/>
+        <w:spacing w:before="20" w:after="20" w:line="220" w:lineRule="auto"/>
         <w:ind w:left="240" w:firstLine="720"/>
         <w:jc w:val="both"/>
         <w:rPr/>
@@ -12538,7 +12538,7 @@
     </w:p>
     <w:p>
       <w:pPr>
-        <w:spacing w:before="20" w:after="20" w:line="240" w:lineRule="auto"/>
+        <w:spacing w:before="20" w:after="20" w:line="220" w:lineRule="auto"/>
         <w:ind w:left="240" w:firstLine="720"/>
         <w:jc w:val="both"/>
         <w:rPr/>
@@ -12564,7 +12564,7 @@
     </w:p>
     <w:p>
       <w:pPr>
-        <w:spacing w:before="20" w:after="20" w:line="240" w:lineRule="auto"/>
+        <w:spacing w:before="20" w:after="20" w:line="220" w:lineRule="auto"/>
         <w:ind w:left="240" w:firstLine="0"/>
         <w:jc w:val="both"/>
         <w:rPr/>
@@ -12591,7 +12591,7 @@
     <w:p>
       <w:pPr>
         <w:keepNext w:val="1"/>
-        <w:spacing w:before="20" w:after="20" w:line="240" w:lineRule="auto"/>
+        <w:spacing w:before="20" w:after="20" w:line="220" w:lineRule="auto"/>
         <w:ind w:firstLine="720"/>
         <w:jc w:val="left"/>
         <w:rPr/>
@@ -12617,7 +12617,7 @@
     </w:p>
     <w:p>
       <w:pPr>
-        <w:spacing w:before="20" w:after="20" w:line="240" w:lineRule="auto"/>
+        <w:spacing w:before="20" w:after="20" w:line="220" w:lineRule="auto"/>
         <w:ind w:left="240" w:firstLine="720"/>
         <w:jc w:val="both"/>
         <w:rPr/>
@@ -12647,7 +12647,7 @@
     </w:p>
     <w:p>
       <w:pPr>
-        <w:spacing w:before="20" w:after="20" w:line="240" w:lineRule="auto"/>
+        <w:spacing w:before="20" w:after="20" w:line="220" w:lineRule="auto"/>
         <w:ind w:left="240" w:firstLine="720"/>
         <w:jc w:val="both"/>
         <w:rPr/>
@@ -12677,7 +12677,7 @@
     </w:p>
     <w:p>
       <w:pPr>
-        <w:spacing w:before="20" w:after="20" w:line="240" w:lineRule="auto"/>
+        <w:spacing w:before="20" w:after="20" w:line="220" w:lineRule="auto"/>
         <w:ind w:left="240" w:firstLine="720"/>
         <w:jc w:val="both"/>
         <w:rPr/>
@@ -12707,7 +12707,7 @@
     </w:p>
     <w:p>
       <w:pPr>
-        <w:spacing w:before="20" w:after="20" w:line="240" w:lineRule="auto"/>
+        <w:spacing w:before="20" w:after="20" w:line="220" w:lineRule="auto"/>
         <w:ind w:left="240" w:firstLine="0"/>
         <w:jc w:val="both"/>
         <w:rPr/>
@@ -12738,7 +12738,7 @@
     <w:p>
       <w:pPr>
         <w:keepNext w:val="1"/>
-        <w:spacing w:before="20" w:after="20" w:line="240" w:lineRule="auto"/>
+        <w:spacing w:before="20" w:after="20" w:line="220" w:lineRule="auto"/>
         <w:ind w:firstLine="720"/>
         <w:jc w:val="left"/>
         <w:rPr/>
@@ -12764,7 +12764,7 @@
     </w:p>
     <w:p>
       <w:pPr>
-        <w:spacing w:before="20" w:after="20" w:line="240" w:lineRule="auto"/>
+        <w:spacing w:before="20" w:after="20" w:line="220" w:lineRule="auto"/>
         <w:jc w:val="both"/>
         <w:rPr/>
         <w:ind w:left="360" w:hanging="360"/>
@@ -12791,16 +12791,14 @@
     </w:p>
     <w:p>
       <w:pPr>
-        <w:spacing w:line="240" w:lineRule="auto" w:before="0" w:after="0"/>
-      </w:pPr>
-      <w:r>
-        <w:br w:type="page"/>
-      </w:r>
+        <w:spacing w:line="220" w:lineRule="auto" w:before="20" w:after="20"/>
+      </w:pPr>
+      <w:r/>
     </w:p>
     <w:p>
       <w:pPr>
         <w:keepNext w:val="1"/>
-        <w:spacing w:before="80" w:after="40" w:line="240" w:lineRule="auto"/>
+        <w:spacing w:before="60" w:after="40" w:line="220" w:lineRule="auto"/>
         <w:jc w:val="left"/>
         <w:rPr/>
       </w:pPr>
@@ -12826,7 +12824,7 @@
     <w:p>
       <w:pPr>
         <w:keepNext w:val="1"/>
-        <w:spacing w:before="20" w:after="20" w:line="240" w:lineRule="auto"/>
+        <w:spacing w:before="20" w:after="20" w:line="220" w:lineRule="auto"/>
         <w:ind w:firstLine="720"/>
         <w:jc w:val="both"/>
         <w:rPr/>
@@ -12891,7 +12889,7 @@
           </w:tcPr>
           <w:p>
             <w:pPr>
-              <w:spacing w:before="0" w:after="0" w:line="288" w:lineRule="auto"/>
+              <w:spacing w:before="20" w:after="20" w:line="220" w:lineRule="auto"/>
               <w:jc w:val="both"/>
               <w:rPr/>
             </w:pPr>
@@ -12925,7 +12923,7 @@
           </w:tcPr>
           <w:p>
             <w:pPr>
-              <w:spacing w:before="0" w:after="0" w:line="288" w:lineRule="auto"/>
+              <w:spacing w:before="20" w:after="20" w:line="220" w:lineRule="auto"/>
               <w:jc w:val="both"/>
               <w:rPr/>
             </w:pPr>
@@ -12960,7 +12958,7 @@
           <w:tcPr/>
           <w:p>
             <w:pPr>
-              <w:spacing w:before="0" w:after="0" w:line="288" w:lineRule="auto"/>
+              <w:spacing w:before="20" w:after="20" w:line="220" w:lineRule="auto"/>
               <w:jc w:val="both"/>
               <w:rPr/>
             </w:pPr>
@@ -12999,7 +12997,7 @@
           </w:p>
           <w:p>
             <w:pPr>
-              <w:spacing w:before="0" w:after="0" w:line="288" w:lineRule="auto"/>
+              <w:spacing w:before="20" w:after="20" w:line="220" w:lineRule="auto"/>
               <w:jc w:val="both"/>
               <w:rPr/>
             </w:pPr>
@@ -13038,7 +13036,7 @@
           </w:p>
           <w:p>
             <w:pPr>
-              <w:spacing w:before="0" w:after="0" w:line="288" w:lineRule="auto"/>
+              <w:spacing w:before="20" w:after="20" w:line="220" w:lineRule="auto"/>
               <w:jc w:val="both"/>
               <w:rPr/>
             </w:pPr>
@@ -13077,7 +13075,7 @@
           </w:p>
           <w:p>
             <w:pPr>
-              <w:spacing w:before="0" w:after="0" w:line="288" w:lineRule="auto"/>
+              <w:spacing w:before="20" w:after="20" w:line="220" w:lineRule="auto"/>
               <w:jc w:val="both"/>
               <w:rPr/>
             </w:pPr>
@@ -13119,7 +13117,7 @@
           <w:tcPr/>
           <w:p>
             <w:pPr>
-              <w:spacing w:before="0" w:after="0" w:line="288" w:lineRule="auto"/>
+              <w:spacing w:before="20" w:after="20" w:line="220" w:lineRule="auto"/>
               <w:jc w:val="both"/>
               <w:rPr/>
             </w:pPr>
@@ -13162,7 +13160,7 @@
           </w:p>
           <w:p>
             <w:pPr>
-              <w:spacing w:before="0" w:after="0" w:line="288" w:lineRule="auto"/>
+              <w:spacing w:before="20" w:after="20" w:line="220" w:lineRule="auto"/>
               <w:jc w:val="both"/>
               <w:rPr/>
             </w:pPr>
@@ -13205,7 +13203,7 @@
           </w:p>
           <w:p>
             <w:pPr>
-              <w:spacing w:before="0" w:after="0" w:line="288" w:lineRule="auto"/>
+              <w:spacing w:before="20" w:after="20" w:line="220" w:lineRule="auto"/>
               <w:jc w:val="both"/>
               <w:rPr/>
             </w:pPr>
@@ -13257,7 +13255,7 @@
           <w:tcPr/>
           <w:p>
             <w:pPr>
-              <w:spacing w:before="0" w:after="0" w:line="288" w:lineRule="auto"/>
+              <w:spacing w:before="20" w:after="20" w:line="220" w:lineRule="auto"/>
               <w:jc w:val="both"/>
               <w:rPr/>
             </w:pPr>
@@ -13286,7 +13284,7 @@
           </w:p>
           <w:p>
             <w:pPr>
-              <w:spacing w:before="0" w:after="0" w:line="288" w:lineRule="auto"/>
+              <w:spacing w:before="20" w:after="20" w:line="220" w:lineRule="auto"/>
               <w:jc w:val="both"/>
               <w:rPr/>
             </w:pPr>
@@ -13327,7 +13325,7 @@
           <w:tcPr/>
           <w:p>
             <w:pPr>
-              <w:spacing w:before="0" w:after="0" w:line="288" w:lineRule="auto"/>
+              <w:spacing w:before="20" w:after="20" w:line="220" w:lineRule="auto"/>
               <w:jc w:val="both"/>
               <w:rPr/>
             </w:pPr>
@@ -13356,7 +13354,7 @@
           </w:p>
           <w:p>
             <w:pPr>
-              <w:spacing w:before="0" w:after="0" w:line="288" w:lineRule="auto"/>
+              <w:spacing w:before="20" w:after="20" w:line="220" w:lineRule="auto"/>
               <w:jc w:val="both"/>
               <w:rPr/>
             </w:pPr>
@@ -13389,7 +13387,7 @@
     <w:p>
       <w:pPr>
         <w:keepNext w:val="1"/>
-        <w:spacing w:before="40" w:after="20" w:line="240" w:lineRule="auto"/>
+        <w:spacing w:before="20" w:after="20" w:line="220" w:lineRule="auto"/>
         <w:jc w:val="left"/>
         <w:rPr/>
       </w:pPr>
@@ -13414,7 +13412,7 @@
     </w:p>
     <w:p>
       <w:pPr>
-        <w:spacing w:before="20" w:after="20" w:line="240" w:lineRule="auto"/>
+        <w:spacing w:before="20" w:after="20" w:line="220" w:lineRule="auto"/>
         <w:ind w:firstLine="720"/>
         <w:jc w:val="both"/>
         <w:rPr/>
@@ -13676,7 +13674,7 @@
     </w:p>
     <w:p>
       <w:pPr>
-        <w:spacing w:before="20" w:after="20" w:line="240" w:lineRule="auto"/>
+        <w:spacing w:before="20" w:after="20" w:line="220" w:lineRule="auto"/>
         <w:ind w:firstLine="720"/>
         <w:jc w:val="both"/>
         <w:rPr/>
@@ -13691,7 +13689,7 @@
           <w:sz w:val="22"/>
           <w:rtl w:val="0"/>
         </w:rPr>
-        <w:t>• See type/function color tables below. Full rules in Full Codebook (from next page).</w:t>
+        <w:t>• Full rules in Full Codebook (from next page).</w:t>
       </w:r>
       <w:r>
         <w:rPr>
@@ -13720,6 +13718,9 @@
         <w:jc w:val="left"/>
         <w:rPr/>
       </w:pPr>
+      <w:r>
+        <w:br w:type="page"/>
+      </w:r>
       <w:r>
         <w:rPr>
           <w:rFonts w:ascii="Georgia" w:hAnsi="Georgia" w:cs="Georgia" w:eastAsia="Georgia"/>
@@ -21965,19 +21966,7 @@
           <w:strike w:val="0"/>
           <w:color w:val="000000"/>
         </w:rPr>
-        <w:t xml:space="preserve"> be on developing and optimizing eco-bricks using a mixture of SUPs and UCO developed through trial and error. SUPs recovered from various donors from the [REDACTED] and UCO. The preliminary trials established that molding faces some difficulty with increased ratios of UCO to SUPs. </w:t>
-      </w:r>
-      <w:r>
-        <w:rPr>
-          <w:rFonts w:ascii="Georgia" w:hAnsi="Georgia" w:cs="Georgia" w:eastAsia="Georgia"/>
-          <w:sz w:val="22"/>
-          <w:szCs w:val="22"/>
-          <w:b w:val="0"/>
-          <w:bCs w:val="0"/>
-          <w:strike w:val="0"/>
-          <w:color w:val="000000"/>
-        </w:rPr>
-        <w:t>Thus</w:t>
+        <w:t xml:space="preserve"> be on developing and optimizing eco-bricks using a mixture of SUPs and UCO developed through trial and error. SUPs recovered from various donors from the [REDACTED] and UCO. The preliminary trials established that molding faces some difficulty with increased ratios of UCO to SUPs. Thus</w:t>
       </w:r>
       <w:r>
         <w:rPr>
@@ -22038,19 +22027,7 @@
           <w:strike w:val="0"/>
           <w:color w:val="000000"/>
         </w:rPr>
-        <w:t xml:space="preserve"> used, starting with UCO to SUPs 1:1 as treatment 1, a decreasing ratio of UCO to SUPs. At equal parts by weight of UCO and SUPs, optimization started at Treatment 1 with a 1:1 ratio. Treatments 2–5 proceeded similarly, increasing the ratio of UCO to SUPs. Density measurements, water absorption, and drop tests were all performed and observed. A self-testing protocol based on current literature was used. The density was calculated relative to mass and volume; however, the water absorption test yielded inconsistent findings. A drop test was also performed, which revealed that the eco-bricks from all treatments were significantly damaged at the height of one meter, making them a weak, unsuitable material to use in building walkways. This study is essential for getting insights into eco-brick manufacture because the workability of SUPs and UCOs as raw materials is proven. The research findings do not apply to buildings. </w:t>
-      </w:r>
-      <w:r>
-        <w:rPr>
-          <w:rFonts w:ascii="Georgia" w:hAnsi="Georgia" w:cs="Georgia" w:eastAsia="Georgia"/>
-          <w:sz w:val="22"/>
-          <w:szCs w:val="22"/>
-          <w:b w:val="0"/>
-          <w:bCs w:val="0"/>
-          <w:strike w:val="0"/>
-          <w:color w:val="000000"/>
-        </w:rPr>
-        <w:t>Therefore</w:t>
+        <w:t xml:space="preserve"> used, starting with UCO to SUPs 1:1 as treatment 1, a decreasing ratio of UCO to SUPs. At equal parts by weight of UCO and SUPs, optimization started at Treatment 1 with a 1:1 ratio. Treatments 2–5 proceeded similarly, increasing the ratio of UCO to SUPs. Density measurements, water absorption, and drop tests were all performed and observed. A self-testing protocol based on current literature was used. The density was calculated relative to mass and volume; however, the water absorption test yielded inconsistent findings. A drop test was also performed, which revealed that the eco-bricks from all treatments were significantly damaged at the height of one meter, making them a weak, unsuitable material to use in building walkways. This study is essential for getting insights into eco-brick manufacture because the workability of SUPs and UCOs as raw materials is proven. The research findings do not apply to buildings. Therefore</w:t>
       </w:r>
       <w:r>
         <w:rPr>
@@ -22191,19 +22168,7 @@
           <w:strike w:val="0"/>
           <w:color w:val="000000"/>
         </w:rPr>
-        <w:t xml:space="preserve"> aimed to evaluate the embryo toxicity, lethality, and teratogenicity of Ziziphus talanai-infused nanozeolite pellets on Danio rerio was performed at the Biology and Chemistry Laboratory of Pampanga State Agricultural University from October 2023 to January 2024. Various treatments in the formulation of pellets and laboratory experiments were set up using Completely Randomized Design (CRD). The study showed that cassava starch as combined with Ziziphus talanai-infused nanozeolite at 1:9 ratio improved the water-holding capacity of derived pellets, </w:t>
-      </w:r>
-      <w:r>
-        <w:rPr>
-          <w:rFonts w:ascii="Georgia" w:hAnsi="Georgia" w:cs="Georgia" w:eastAsia="Georgia"/>
-          <w:sz w:val="22"/>
-          <w:szCs w:val="22"/>
-          <w:b w:val="0"/>
-          <w:bCs w:val="0"/>
-          <w:strike w:val="0"/>
-          <w:color w:val="000000"/>
-        </w:rPr>
-        <w:t>thus</w:t>
+        <w:t xml:space="preserve"> aimed to evaluate the embryo toxicity, lethality, and teratogenicity of Ziziphus talanai-infused nanozeolite pellets on Danio rerio was performed at the Biology and Chemistry Laboratory of Pampanga State Agricultural University from October 2023 to January 2024. Various treatments in the formulation of pellets and laboratory experiments were set up using Completely Randomized Design (CRD). The study showed that cassava starch as combined with Ziziphus talanai-infused nanozeolite at 1:9 ratio improved the water-holding capacity of derived pellets, thus</w:t>
       </w:r>
       <w:r>
         <w:rPr>
@@ -22301,19 +22266,7 @@
           <w:strike w:val="0"/>
           <w:color w:val="000000"/>
         </w:rPr>
-        <w:t xml:space="preserve"> that such observation was induced by the Z. talanai-infused nanozeolite pellet suspension. </w:t>
-      </w:r>
-      <w:r>
-        <w:rPr>
-          <w:rFonts w:ascii="Georgia" w:hAnsi="Georgia" w:cs="Georgia" w:eastAsia="Georgia"/>
-          <w:sz w:val="22"/>
-          <w:szCs w:val="22"/>
-          <w:b w:val="0"/>
-          <w:bCs w:val="0"/>
-          <w:strike w:val="0"/>
-          <w:color w:val="000000"/>
-        </w:rPr>
-        <w:t>Hence</w:t>
+        <w:t xml:space="preserve"> that such observation was induced by the Z. talanai-infused nanozeolite pellet suspension. Hence</w:t>
       </w:r>
       <w:r>
         <w:rPr>
@@ -22692,19 +22645,7 @@
           <w:strike w:val="0"/>
           <w:color w:val="000000"/>
         </w:rPr>
-        <w:t xml:space="preserve">It is well recognized that heavy metals harm human health through the food chain. The danger to human health associated with consuming fish contaminated with heavy metals were assessed. This study aimed to determine the presence of lead in the flesh part of selected fish species, Common carp (Cyprinus carpio), Roho labeo (Labeo rohita), and Silver carp (Hypophthalmichthys molitrix), in addition to determine the Knowledge, Attitude, and Practices (KAP) of fishers along the Pampanga River. A test method used is Inductively Coupled Plasma — Optical Emission Spectrometry (ICP-OES) in identifying heavy metals in biota. The self-administered questionnaires were distributed to 20 respondents, questionnaires compromised of socio-demographic characteristics and the KAP’s of fishers along the Pampanga River. Data analyses were done using SPSS (version 23). Data were explored using descriptive statistics. The results show that lead in any of the selected fish, with a &lt;0.013 mg/kg result is below the FAO and WHO’s allowed limits of 2 mg/kg and 0.5 mg/kg, respectively. Based on the result from KAP Analysis, knowledge scored M=1.7200 with SD equivalent to 0.10052 which is interpreted as poor knowledge. The attitude score M=3.1150 and SD=0.093330 which means a moderate attitude and lastly, practices score M = 2.8850 and SD = .13485 which is equivalent to have good practices. </w:t>
-      </w:r>
-      <w:r>
-        <w:rPr>
-          <w:rFonts w:ascii="Georgia" w:hAnsi="Georgia" w:cs="Georgia" w:eastAsia="Georgia"/>
-          <w:sz w:val="22"/>
-          <w:szCs w:val="22"/>
-          <w:b w:val="0"/>
-          <w:bCs w:val="0"/>
-          <w:strike w:val="0"/>
-          <w:color w:val="000000"/>
-        </w:rPr>
-        <w:t>Thus</w:t>
+        <w:t>It is well recognized that heavy metals harm human health through the food chain. The danger to human health associated with consuming fish contaminated with heavy metals were assessed. This study aimed to determine the presence of lead in the flesh part of selected fish species, Common carp (Cyprinus carpio), Roho labeo (Labeo rohita), and Silver carp (Hypophthalmichthys molitrix), in addition to determine the Knowledge, Attitude, and Practices (KAP) of fishers along the Pampanga River. A test method used is Inductively Coupled Plasma — Optical Emission Spectrometry (ICP-OES) in identifying heavy metals in biota. The self-administered questionnaires were distributed to 20 respondents, questionnaires compromised of socio-demographic characteristics and the KAP’s of fishers along the Pampanga River. Data analyses were done using SPSS (version 23). Data were explored using descriptive statistics. The results show that lead in any of the selected fish, with a &lt;0.013 mg/kg result is below the FAO and WHO’s allowed limits of 2 mg/kg and 0.5 mg/kg, respectively. Based on the result from KAP Analysis, knowledge scored M=1.7200 with SD equivalent to 0.10052 which is interpreted as poor knowledge. The attitude score M=3.1150 and SD=0.093330 which means a moderate attitude and lastly, practices score M = 2.8850 and SD = .13485 which is equivalent to have good practices. Thus</w:t>
       </w:r>
       <w:r>
         <w:rPr>
@@ -22882,19 +22823,7 @@
           <w:strike w:val="0"/>
           <w:color w:val="000000"/>
         </w:rPr>
-        <w:t xml:space="preserve">Currently, Central Luzon together with Calabarzon are regions that hold a pivotal position in the Philippines’ fishing industry. However, due to their adjacency to [REDACTED], which is highly polluted due to anthropogenic activities, these regions become vulnerable to bacterial infestation. Mycobacteriosis is a significant concern in cultivated milkfish, impacting both fish health and aquaculture productivity is reported in [REDACTED] and in parts of Central Luzon. </w:t>
-      </w:r>
-      <w:r>
-        <w:rPr>
-          <w:rFonts w:ascii="Georgia" w:hAnsi="Georgia" w:cs="Georgia" w:eastAsia="Georgia"/>
-          <w:sz w:val="22"/>
-          <w:szCs w:val="22"/>
-          <w:b w:val="0"/>
-          <w:bCs w:val="0"/>
-          <w:strike w:val="0"/>
-          <w:color w:val="000000"/>
-        </w:rPr>
-        <w:t>Hence</w:t>
+        <w:t>Currently, Central Luzon together with Calabarzon are regions that hold a pivotal position in the Philippines’ fishing industry. However, due to their adjacency to [REDACTED], which is highly polluted due to anthropogenic activities, these regions become vulnerable to bacterial infestation. Mycobacteriosis is a significant concern in cultivated milkfish, impacting both fish health and aquaculture productivity is reported in [REDACTED] and in parts of Central Luzon. Hence</w:t>
       </w:r>
       <w:r>
         <w:rPr>
@@ -23073,19 +23002,7 @@
           <w:strike w:val="0"/>
           <w:color w:val="000000"/>
         </w:rPr>
-        <w:t xml:space="preserve">Antimicrobial resistance is a major threat to public health worldwide, making infections difficult to treat. This problem calls for developing novel and alternative strategies to attenuate microorganisms without inducing resistance. </w:t>
-      </w:r>
-      <w:r>
-        <w:rPr>
-          <w:rFonts w:ascii="Georgia" w:hAnsi="Georgia" w:cs="Georgia" w:eastAsia="Georgia"/>
-          <w:sz w:val="22"/>
-          <w:szCs w:val="22"/>
-          <w:b w:val="0"/>
-          <w:bCs w:val="0"/>
-          <w:strike w:val="0"/>
-          <w:color w:val="000000"/>
-        </w:rPr>
-        <w:t>Hence</w:t>
+        <w:t>Antimicrobial resistance is a major threat to public health worldwide, making infections difficult to treat. This problem calls for developing novel and alternative strategies to attenuate microorganisms without inducing resistance. Hence</w:t>
       </w:r>
       <w:r>
         <w:rPr>
@@ -23764,19 +23681,7 @@
           <w:strike w:val="0"/>
           <w:color w:val="000000"/>
         </w:rPr>
-        <w:t xml:space="preserve"> public health concerns associated with transmitting pathogenic bacteria, emphasized this research’s need. </w:t>
-      </w:r>
-      <w:r>
-        <w:rPr>
-          <w:rFonts w:ascii="Georgia" w:hAnsi="Georgia" w:cs="Georgia" w:eastAsia="Georgia"/>
-          <w:sz w:val="22"/>
-          <w:szCs w:val="22"/>
-          <w:b w:val="0"/>
-          <w:bCs w:val="0"/>
-          <w:strike w:val="0"/>
-          <w:color w:val="000000"/>
-        </w:rPr>
-        <w:t>Thus</w:t>
+        <w:t xml:space="preserve"> public health concerns associated with transmitting pathogenic bacteria, emphasized this research’s need. Thus</w:t>
       </w:r>
       <w:r>
         <w:rPr>
@@ -23837,19 +23742,7 @@
           <w:strike w:val="0"/>
           <w:color w:val="000000"/>
         </w:rPr>
-        <w:t xml:space="preserve"> public health risks associated with the handling and purchasing of second-hand clothing. This study, </w:t>
-      </w:r>
-      <w:r>
-        <w:rPr>
-          <w:rFonts w:ascii="Georgia" w:hAnsi="Georgia" w:cs="Georgia" w:eastAsia="Georgia"/>
-          <w:sz w:val="22"/>
-          <w:szCs w:val="22"/>
-          <w:b w:val="0"/>
-          <w:bCs w:val="0"/>
-          <w:strike w:val="0"/>
-          <w:color w:val="000000"/>
-        </w:rPr>
-        <w:t>therefore</w:t>
+        <w:t xml:space="preserve"> public health risks associated with the handling and purchasing of second-hand clothing. This study, therefore</w:t>
       </w:r>
       <w:r>
         <w:rPr>
@@ -24337,19 +24230,7 @@
           <w:strike w:val="0"/>
           <w:color w:val="000000"/>
         </w:rPr>
-        <w:t xml:space="preserve">Wetlands are becoming popular as important tourist destinations due to their unique natural beauty and diverse wildlife. These vital ecosystems are at risk from the unregulated and unsustainable tourist visits that cause detrimental effects on the environment and host communities. </w:t>
-      </w:r>
-      <w:r>
-        <w:rPr>
-          <w:rFonts w:ascii="Georgia" w:hAnsi="Georgia" w:cs="Georgia" w:eastAsia="Georgia"/>
-          <w:sz w:val="22"/>
-          <w:szCs w:val="22"/>
-          <w:b w:val="0"/>
-          <w:bCs w:val="0"/>
-          <w:strike w:val="0"/>
-          <w:color w:val="000000"/>
-        </w:rPr>
-        <w:t>Hence</w:t>
+        <w:t>Wetlands are becoming popular as important tourist destinations due to their unique natural beauty and diverse wildlife. These vital ecosystems are at risk from the unregulated and unsustainable tourist visits that cause detrimental effects on the environment and host communities. Hence</w:t>
       </w:r>
       <w:r>
         <w:rPr>
@@ -24409,19 +24290,7 @@
           <w:strike w:val="0"/>
           <w:color w:val="000000"/>
         </w:rPr>
-        <w:t xml:space="preserve"> be considered. This study used Boullon’s Carrying Capacity Mathematical Model adopted from the Ecosystems Research and Development Bureau for computing the Tourism Carrying Capacity (TCC) of Sasmuan Pampanga Coastal Wetlands. Data on the parameters needed in TCC were collected through Key Informant Interviews, direct observation of the site, and a questionnaire-based survey for the tourism-related preferences and residents’ perceived impact of tourism activities. The Real Carrying Capacity per day was found to be a total of 13 boats and 156 visitors for fishing activity on the river stretch of [REDACTED], 14 visitors in the [REDACTED], while 420 visitors for aquaculture farm fishing I and 317 visitors in aquaculture farm fishing II, while 8 visitors for bangus feeding I and a total of 9 visitors for bangus feeding II. Only 5 visitors were allowed for birdwatching and 65 visitors for swimming activity. The results revealed that present visitations in these activities are still below the carrying capacity. For descriptive statistics, three-hundred fifty (350) respondents from five coastal barangays of SPCW were purposively selected. Results showed that respondents perceived tourism activities have a positive impact and equal perceptions in ecological (62.00%), economic (59.71%), social (59.71%), and visitor experiences aspects (50.86%). However, tourism activities in the area are perceived to have a negative impact on SPCW’s local facilities (54.00%). </w:t>
-      </w:r>
-      <w:r>
-        <w:rPr>
-          <w:rFonts w:ascii="Georgia" w:hAnsi="Georgia" w:cs="Georgia" w:eastAsia="Georgia"/>
-          <w:sz w:val="22"/>
-          <w:szCs w:val="22"/>
-          <w:b w:val="0"/>
-          <w:bCs w:val="0"/>
-          <w:strike w:val="0"/>
-          <w:color w:val="000000"/>
-        </w:rPr>
-        <w:t>Thus</w:t>
+        <w:t xml:space="preserve"> be considered. This study used Boullon’s Carrying Capacity Mathematical Model adopted from the Ecosystems Research and Development Bureau for computing the Tourism Carrying Capacity (TCC) of Sasmuan Pampanga Coastal Wetlands. Data on the parameters needed in TCC were collected through Key Informant Interviews, direct observation of the site, and a questionnaire-based survey for the tourism-related preferences and residents’ perceived impact of tourism activities. The Real Carrying Capacity per day was found to be a total of 13 boats and 156 visitors for fishing activity on the river stretch of [REDACTED], 14 visitors in the [REDACTED], while 420 visitors for aquaculture farm fishing I and 317 visitors in aquaculture farm fishing II, while 8 visitors for bangus feeding I and a total of 9 visitors for bangus feeding II. Only 5 visitors were allowed for birdwatching and 65 visitors for swimming activity. The results revealed that present visitations in these activities are still below the carrying capacity. For descriptive statistics, three-hundred fifty (350) respondents from five coastal barangays of SPCW were purposively selected. Results showed that respondents perceived tourism activities have a positive impact and equal perceptions in ecological (62.00%), economic (59.71%), social (59.71%), and visitor experiences aspects (50.86%). However, tourism activities in the area are perceived to have a negative impact on SPCW’s local facilities (54.00%). Thus</w:t>
       </w:r>
       <w:r>
         <w:rPr>
@@ -24563,19 +24432,7 @@
           <w:strike w:val="0"/>
           <w:color w:val="000000"/>
         </w:rPr>
-        <w:t xml:space="preserve">Many farmers have been facing many problems towards their crops. One of the common factors affecting the production of eggplant is the pathogenic diseases. The fungal disease commonly found in Eggplant (Solanum melongena) is Cercospora leaf spot, a plant-pathogenic fungus, Cercospora melongenae. </w:t>
-      </w:r>
-      <w:r>
-        <w:rPr>
-          <w:rFonts w:ascii="Georgia" w:hAnsi="Georgia" w:cs="Georgia" w:eastAsia="Georgia"/>
-          <w:sz w:val="22"/>
-          <w:szCs w:val="22"/>
-          <w:b w:val="0"/>
-          <w:bCs w:val="0"/>
-          <w:strike w:val="0"/>
-          <w:color w:val="000000"/>
-        </w:rPr>
-        <w:t>Therefore</w:t>
+        <w:t>Many farmers have been facing many problems towards their crops. One of the common factors affecting the production of eggplant is the pathogenic diseases. The fungal disease commonly found in Eggplant (Solanum melongena) is Cercospora leaf spot, a plant-pathogenic fungus, Cercospora melongenae. Therefore</w:t>
       </w:r>
       <w:r>
         <w:rPr>
@@ -24635,19 +24492,7 @@
           <w:strike w:val="0"/>
           <w:color w:val="000000"/>
         </w:rPr>
-        <w:t xml:space="preserve"> of Trichoderma harzianum, an endophytic fungus, as a biocontrol agent for Cercospora leaf spot-on eggplants in the Philippines. Cercospora melongenae is a plant-pathogenic fungus that causes significant damage to eggplant crops, and the overuse of chemical pesticides has adverse effects on human health and the environment. As such, using alternative approaches, such as endophytic fungi, has gained attention from researchers. The study used thirty isolated leaf samples, twenty-one subcultures has been done and four different pathogenic fungi were identified. Moreover, there is an antagonistic effect of Trichoderma hazianum against the pathogenic fungi that cause disease in eggplant crops. </w:t>
-      </w:r>
-      <w:r>
-        <w:rPr>
-          <w:rFonts w:ascii="Georgia" w:hAnsi="Georgia" w:cs="Georgia" w:eastAsia="Georgia"/>
-          <w:sz w:val="22"/>
-          <w:szCs w:val="22"/>
-          <w:b w:val="0"/>
-          <w:bCs w:val="0"/>
-          <w:strike w:val="0"/>
-          <w:color w:val="000000"/>
-        </w:rPr>
-        <w:t>Hence</w:t>
+        <w:t xml:space="preserve"> of Trichoderma harzianum, an endophytic fungus, as a biocontrol agent for Cercospora leaf spot-on eggplants in the Philippines. Cercospora melongenae is a plant-pathogenic fungus that causes significant damage to eggplant crops, and the overuse of chemical pesticides has adverse effects on human health and the environment. As such, using alternative approaches, such as endophytic fungi, has gained attention from researchers. The study used thirty isolated leaf samples, twenty-one subcultures has been done and four different pathogenic fungi were identified. Moreover, there is an antagonistic effect of Trichoderma hazianum against the pathogenic fungi that cause disease in eggplant crops. Hence</w:t>
       </w:r>
       <w:r>
         <w:rPr>
@@ -25453,19 +25298,7 @@
           <w:strike w:val="0"/>
           <w:color w:val="000000"/>
         </w:rPr>
-        <w:t xml:space="preserve">Canine heartworm (Dirofilaria immitis) infection is a significant health concern for dogs in many regions. This study investigated the association between clinical signs and microscopy/serological detection of heartworm at the [REDACTED]. Canines below six months of age and those receiving annual macrocyclic lactones were excluded. A questionnaire was utilized to collect data, and 100 single step rapid test kits canine heartworm Ag (AccuVet®) were employed along with direct blood smears. However, no positive results were observed in the diagnostic tests conducted. </w:t>
-      </w:r>
-      <w:r>
-        <w:rPr>
-          <w:rFonts w:ascii="Georgia" w:hAnsi="Georgia" w:cs="Georgia" w:eastAsia="Georgia"/>
-          <w:sz w:val="22"/>
-          <w:szCs w:val="22"/>
-          <w:b w:val="0"/>
-          <w:bCs w:val="0"/>
-          <w:strike w:val="0"/>
-          <w:color w:val="000000"/>
-        </w:rPr>
-        <w:t>Thus</w:t>
+        <w:t>Canine heartworm (Dirofilaria immitis) infection is a significant health concern for dogs in many regions. This study investigated the association between clinical signs and microscopy/serological detection of heartworm at the [REDACTED]. Canines below six months of age and those receiving annual macrocyclic lactones were excluded. A questionnaire was utilized to collect data, and 100 single step rapid test kits canine heartworm Ag (AccuVet®) were employed along with direct blood smears. However, no positive results were observed in the diagnostic tests conducted. Thus</w:t>
       </w:r>
       <w:r>
         <w:rPr>
@@ -25762,19 +25595,7 @@
           <w:strike w:val="0"/>
           <w:color w:val="000000"/>
         </w:rPr>
-        <w:t xml:space="preserve"> health risks to aquatic species and humans through seafood consumption. This study was conducted to detect microplastics in Whiteleg shrimp (Litopenaeus vannamei) sold at the [REDACTED]. A total of 10 shrimp samples per stall were collected, equating to 30 shrimps overall from the 3 stalls available. Composite sampling was applied in this study; </w:t>
-      </w:r>
-      <w:r>
-        <w:rPr>
-          <w:rFonts w:ascii="Georgia" w:hAnsi="Georgia" w:cs="Georgia" w:eastAsia="Georgia"/>
-          <w:sz w:val="22"/>
-          <w:szCs w:val="22"/>
-          <w:b w:val="0"/>
-          <w:bCs w:val="0"/>
-          <w:strike w:val="0"/>
-          <w:color w:val="000000"/>
-        </w:rPr>
-        <w:t>hence</w:t>
+        <w:t xml:space="preserve"> health risks to aquatic species and humans through seafood consumption. This study was conducted to detect microplastics in Whiteleg shrimp (Litopenaeus vannamei) sold at the [REDACTED]. A total of 10 shrimp samples per stall were collected, equating to 30 shrimps overall from the 3 stalls available. Composite sampling was applied in this study; hence</w:t>
       </w:r>
       <w:r>
         <w:rPr>
@@ -26042,19 +25863,7 @@
           <w:strike w:val="0"/>
           <w:color w:val="000000"/>
         </w:rPr>
-        <w:t xml:space="preserve">The African swine fever (ASF) is an ongoing global disease of swine presenting clinical signs similar to hog cholera and causing significant socioeconomic problems. Studies on the detection of ASF virus focus on using viremic blood and lymph tissues from infected pigs at the farm level. </w:t>
-      </w:r>
-      <w:r>
-        <w:rPr>
-          <w:rFonts w:ascii="Georgia" w:hAnsi="Georgia" w:cs="Georgia" w:eastAsia="Georgia"/>
-          <w:sz w:val="22"/>
-          <w:szCs w:val="22"/>
-          <w:b w:val="0"/>
-          <w:bCs w:val="0"/>
-          <w:strike w:val="0"/>
-          <w:color w:val="000000"/>
-        </w:rPr>
-        <w:t>Hence</w:t>
+        <w:t>The African swine fever (ASF) is an ongoing global disease of swine presenting clinical signs similar to hog cholera and causing significant socioeconomic problems. Studies on the detection of ASF virus focus on using viremic blood and lymph tissues from infected pigs at the farm level. Hence</w:t>
       </w:r>
       <w:r>
         <w:rPr>
@@ -27334,19 +27143,7 @@
           <w:strike w:val="0"/>
           <w:color w:val="000000"/>
         </w:rPr>
-        <w:t xml:space="preserve">The study was conducted at [REDACTED], from November 2022 to February 2023 to determine the effect of rooting hormones on monstera cuttings. The study used Complete Randomized Design (CRD) with four replications. The pot experiment comprised of main treatments: T1- Control (Water), T2- Aloe Vera gel, T3- Coconut water, T4- Moringa leaves extract, and T5- ANAA. Data were evaluated using Analysis of Variance (ANOVA). Based on the results of the study, different rooting hormones did not significantly influence the days to shoot emergence, number of shoots, number of leaves, number of adventitious roots, root diameter, length of the longest roots, number of rooted cuttings, and percentage of survival cuttings. Additionally, alternative rooting hormones and synthetic hormone applications had varying survival rates. The highest survival was found in ANAA, followed by control water (distilled or filtered water), coconut water, and aloe vera gel, and the lowest survival was found in moringa leaf extract. </w:t>
-      </w:r>
-      <w:r>
-        <w:rPr>
-          <w:rFonts w:ascii="Georgia" w:hAnsi="Georgia" w:cs="Georgia" w:eastAsia="Georgia"/>
-          <w:sz w:val="22"/>
-          <w:szCs w:val="22"/>
-          <w:b w:val="0"/>
-          <w:bCs w:val="0"/>
-          <w:strike w:val="0"/>
-          <w:color w:val="000000"/>
-        </w:rPr>
-        <w:t>In conclusion</w:t>
+        <w:t>The study was conducted at [REDACTED], from November 2022 to February 2023 to determine the effect of rooting hormones on monstera cuttings. The study used Complete Randomized Design (CRD) with four replications. The pot experiment comprised of main treatments: T1- Control (Water), T2- Aloe Vera gel, T3- Coconut water, T4- Moringa leaves extract, and T5- ANAA. Data were evaluated using Analysis of Variance (ANOVA). Based on the results of the study, different rooting hormones did not significantly influence the days to shoot emergence, number of shoots, number of leaves, number of adventitious roots, root diameter, length of the longest roots, number of rooted cuttings, and percentage of survival cuttings. Additionally, alternative rooting hormones and synthetic hormone applications had varying survival rates. The highest survival was found in ANAA, followed by control water (distilled or filtered water), coconut water, and aloe vera gel, and the lowest survival was found in moringa leaf extract. In conclusion</w:t>
       </w:r>
       <w:r>
         <w:rPr>
@@ -27525,19 +27322,7 @@
           <w:strike w:val="0"/>
           <w:color w:val="000000"/>
         </w:rPr>
-        <w:t xml:space="preserve">The study was conducted to determine the growth and yield performance of sweet potatoes treated with seaweed extract foliar spray from December 2023 to February 2024 in [REDACTED]. The experiment utilized a Randomized Complete Block Design (RCBD) with five treatments replicated four times. Based on the results of the study, there are significant differences in the length of vines at 60 days after planting (DAP), while other parameters showed no significant differences. These include length of vines at 30 DAP and 70 DAP, number of marketable tubers per plant, number of non-marketable tubers per plant, length of tubers per plant, weight of tubers per plant, diameter of tubers per plant, computed yield per hectare, and cost and return analysis among the seaweed extract treatments. The study found that sweet potatoes treated with different seaweed extract foliar sprays showed varying levels of growth and yield. According to the Super Bureau's VSP6, all treatments had the highest mean values across all parameters. However, the positive control had the highest mean values for vine length, weight of tubers per plant, and marketable yield per sample area. </w:t>
-      </w:r>
-      <w:r>
-        <w:rPr>
-          <w:rFonts w:ascii="Georgia" w:hAnsi="Georgia" w:cs="Georgia" w:eastAsia="Georgia"/>
-          <w:sz w:val="22"/>
-          <w:szCs w:val="22"/>
-          <w:b w:val="0"/>
-          <w:bCs w:val="0"/>
-          <w:strike w:val="0"/>
-          <w:color w:val="000000"/>
-        </w:rPr>
-        <w:t>Therefore</w:t>
+        <w:t>The study was conducted to determine the growth and yield performance of sweet potatoes treated with seaweed extract foliar spray from December 2023 to February 2024 in [REDACTED]. The experiment utilized a Randomized Complete Block Design (RCBD) with five treatments replicated four times. Based on the results of the study, there are significant differences in the length of vines at 60 days after planting (DAP), while other parameters showed no significant differences. These include length of vines at 30 DAP and 70 DAP, number of marketable tubers per plant, number of non-marketable tubers per plant, length of tubers per plant, weight of tubers per plant, diameter of tubers per plant, computed yield per hectare, and cost and return analysis among the seaweed extract treatments. The study found that sweet potatoes treated with different seaweed extract foliar sprays showed varying levels of growth and yield. According to the Super Bureau's VSP6, all treatments had the highest mean values across all parameters. However, the positive control had the highest mean values for vine length, weight of tubers per plant, and marketable yield per sample area. Therefore</w:t>
       </w:r>
       <w:r>
         <w:rPr>
@@ -27797,19 +27582,7 @@
           <w:strike w:val="0"/>
           <w:color w:val="000000"/>
         </w:rPr>
-        <w:t xml:space="preserve"> limited benefits. Throughout the study, plants in Treatments 2 and 4 exhibited more vigorous and healthier growth, with well-developed roots, expanded foliage, and stable shoot formation. The positive effects of rice hull and vermicompost were attributed to better nutrient availability, improved soil aeration, enhanced microbial activity, and more efficient moisture retention. </w:t>
-      </w:r>
-      <w:r>
-        <w:rPr>
-          <w:rFonts w:ascii="Georgia" w:hAnsi="Georgia" w:cs="Georgia" w:eastAsia="Georgia"/>
-          <w:sz w:val="22"/>
-          <w:szCs w:val="22"/>
-          <w:b w:val="0"/>
-          <w:bCs w:val="0"/>
-          <w:strike w:val="0"/>
-          <w:color w:val="000000"/>
-        </w:rPr>
-        <w:t>In conclusion</w:t>
+        <w:t xml:space="preserve"> limited benefits. Throughout the study, plants in Treatments 2 and 4 exhibited more vigorous and healthier growth, with well-developed roots, expanded foliage, and stable shoot formation. The positive effects of rice hull and vermicompost were attributed to better nutrient availability, improved soil aeration, enhanced microbial activity, and more efficient moisture retention. In conclusion</w:t>
       </w:r>
       <w:r>
         <w:rPr>
@@ -28271,19 +28044,7 @@
           <w:strike w:val="0"/>
           <w:color w:val="000000"/>
         </w:rPr>
-        <w:t xml:space="preserve"> conducted from January 2023 to April 2023 at [REDACTED] to evaluate the performance of rice as supplemented with foliar fertilizer. The experimental design used is a randomized complete block design (RCBD) with three treatments replicated three times. The following treatments were used: T1: recommended rate of NPK based on soil analysis; T2: recommended rate of NPK + 19-19-19; and T3: recommended rate of NPK + 14-14-14. The results of the study revealed the following: a significant difference was observed in the number of productive tillers, actual yield per sample area, and computed yield per ton/ha. No significant differences were observed in terms of the number of days from transplanting to flowering, plant height, number of unproductive tillers, length of panicle, number of filled grains, number of unfilled grains, and weight of 1,000 seeds. </w:t>
-      </w:r>
-      <w:r>
-        <w:rPr>
-          <w:rFonts w:ascii="Georgia" w:hAnsi="Georgia" w:cs="Georgia" w:eastAsia="Georgia"/>
-          <w:sz w:val="22"/>
-          <w:szCs w:val="22"/>
-          <w:b w:val="0"/>
-          <w:bCs w:val="0"/>
-          <w:strike w:val="0"/>
-          <w:color w:val="000000"/>
-        </w:rPr>
-        <w:t>In conclusion</w:t>
+        <w:t xml:space="preserve"> conducted from January 2023 to April 2023 at [REDACTED] to evaluate the performance of rice as supplemented with foliar fertilizer. The experimental design used is a randomized complete block design (RCBD) with three treatments replicated three times. The following treatments were used: T1: recommended rate of NPK based on soil analysis; T2: recommended rate of NPK + 19-19-19; and T3: recommended rate of NPK + 14-14-14. The results of the study revealed the following: a significant difference was observed in the number of productive tillers, actual yield per sample area, and computed yield per ton/ha. No significant differences were observed in terms of the number of days from transplanting to flowering, plant height, number of unproductive tillers, length of panicle, number of filled grains, number of unfilled grains, and weight of 1,000 seeds. In conclusion</w:t>
       </w:r>
       <w:r>
         <w:rPr>
@@ -28618,19 +28379,7 @@
           <w:strike w:val="0"/>
           <w:color w:val="000000"/>
         </w:rPr>
-        <w:t xml:space="preserve"> that treatments were comparable on parameters. However, final weight, gain in weight, average daily gain in weight and feed conversion ratio had highly significance differences at (P&lt;0.01). This indicates that ducks fed with 100% commercial feeds rice bran mixed with golden apple snail performed better in final weight, gain in weight, average daily gain in weight and feed conversion ratio. </w:t>
-      </w:r>
-      <w:r>
-        <w:rPr>
-          <w:rFonts w:ascii="Georgia" w:hAnsi="Georgia" w:cs="Georgia" w:eastAsia="Georgia"/>
-          <w:sz w:val="22"/>
-          <w:szCs w:val="22"/>
-          <w:b w:val="0"/>
-          <w:bCs w:val="0"/>
-          <w:strike w:val="0"/>
-          <w:color w:val="000000"/>
-        </w:rPr>
-        <w:t>In conclusion</w:t>
+        <w:t xml:space="preserve"> that treatments were comparable on parameters. However, final weight, gain in weight, average daily gain in weight and feed conversion ratio had highly significance differences at (P&lt;0.01). This indicates that ducks fed with 100% commercial feeds rice bran mixed with golden apple snail performed better in final weight, gain in weight, average daily gain in weight and feed conversion ratio. In conclusion</w:t>
       </w:r>
       <w:r>
         <w:rPr>
@@ -29091,19 +28840,7 @@
           <w:strike w:val="0"/>
           <w:color w:val="000000"/>
         </w:rPr>
-        <w:t xml:space="preserve">This study was conducted over a 35-day period from May 10, 2023, to June 14, 2023, at [REDACTED]. The present study aimed to determine the growth response of crossbred New Zealand rabbits as influenced by varying levels of fermented Madre De Agua leaves. Eighteen (18), 2 months of crossbreed New Zealand rabbits were used in the study which were divided into three (3) treatments: T1 = 70% concentrate + 30% paragrass, T2 = 70% concentrate + 20% paragrass + 10% fermented Madre De Agua, T3 = 60% concentrate + 20% paragrass + 20% fermented Madre De Agua. A Completely Randomized Design was employed, and data was analyzed through ANOVA by Statistical Tool for Agricultural Research (STAR). Statistical analysis showed that there was no significant difference but showed numerical trends among the treatments in relation to initial weight, final weight, gain in weight, average daily gain, dry matter intake, and feed conversion ratio of the experimental rabbits </w:t>
-      </w:r>
-      <w:r>
-        <w:rPr>
-          <w:rFonts w:ascii="Georgia" w:hAnsi="Georgia" w:cs="Georgia" w:eastAsia="Georgia"/>
-          <w:sz w:val="22"/>
-          <w:szCs w:val="22"/>
-          <w:b w:val="0"/>
-          <w:bCs w:val="0"/>
-          <w:strike w:val="0"/>
-          <w:color w:val="000000"/>
-        </w:rPr>
-        <w:t>In conclusion</w:t>
+        <w:t>This study was conducted over a 35-day period from May 10, 2023, to June 14, 2023, at [REDACTED]. The present study aimed to determine the growth response of crossbred New Zealand rabbits as influenced by varying levels of fermented Madre De Agua leaves. Eighteen (18), 2 months of crossbreed New Zealand rabbits were used in the study which were divided into three (3) treatments: T1 = 70% concentrate + 30% paragrass, T2 = 70% concentrate + 20% paragrass + 10% fermented Madre De Agua, T3 = 60% concentrate + 20% paragrass + 20% fermented Madre De Agua. A Completely Randomized Design was employed, and data was analyzed through ANOVA by Statistical Tool for Agricultural Research (STAR). Statistical analysis showed that there was no significant difference but showed numerical trends among the treatments in relation to initial weight, final weight, gain in weight, average daily gain, dry matter intake, and feed conversion ratio of the experimental rabbits In conclusion</w:t>
       </w:r>
       <w:r>
         <w:rPr>
@@ -29436,19 +29173,7 @@
           <w:strike w:val="0"/>
           <w:color w:val="000000"/>
         </w:rPr>
-        <w:t xml:space="preserve">The study was conducted at [REDACTED] from April 25 to April 30, 2023 to find out the [TITLE REDACTED] where a total of nine hundred maggots (900) were used. The experiment was laid out using Complete Randomized Design (CRD) with three (3) treatments, namely, T1 –Carbonated rice hull and saw dust, T2 – Diatomaceous Earth, and T3 –Neem tree extract. The nine hundred maggots were divided into three (3) treatments at one hundred maggots (100) per treatment each treatment was replicated three (3) times with one hundred maggots (100) per replication. The results disclosed that the percentage of mortality and moisture content were statistically significant at 1% (P&lt;0.01) and (P&lt;0.05) level with 48 hours after the post-treatment. However, mortality rate and moisture content were not significant after 6 hours and 24 hours. </w:t>
-      </w:r>
-      <w:r>
-        <w:rPr>
-          <w:rFonts w:ascii="Georgia" w:hAnsi="Georgia" w:cs="Georgia" w:eastAsia="Georgia"/>
-          <w:sz w:val="22"/>
-          <w:szCs w:val="22"/>
-          <w:b w:val="0"/>
-          <w:bCs w:val="0"/>
-          <w:strike w:val="0"/>
-          <w:color w:val="000000"/>
-        </w:rPr>
-        <w:t>Therefore</w:t>
+        <w:t>The study was conducted at [REDACTED] from April 25 to April 30, 2023 to find out the [TITLE REDACTED] where a total of nine hundred maggots (900) were used. The experiment was laid out using Complete Randomized Design (CRD) with three (3) treatments, namely, T1 –Carbonated rice hull and saw dust, T2 – Diatomaceous Earth, and T3 –Neem tree extract. The nine hundred maggots were divided into three (3) treatments at one hundred maggots (100) per treatment each treatment was replicated three (3) times with one hundred maggots (100) per replication. The results disclosed that the percentage of mortality and moisture content were statistically significant at 1% (P&lt;0.01) and (P&lt;0.05) level with 48 hours after the post-treatment. However, mortality rate and moisture content were not significant after 6 hours and 24 hours. Therefore</w:t>
       </w:r>
       <w:r>
         <w:rPr>
@@ -29553,19 +29278,7 @@
           <w:strike w:val="0"/>
           <w:color w:val="000000"/>
         </w:rPr>
-        <w:t xml:space="preserve">The study was conducted at [REDACTED], for 35 days, from April 16 to May 20, 2023. The study was carried out to search for alternatives to protein sources. The objective of the study was to determine the growth response of F1 New Zealand white rabbits as influenced by the roughage-to-concentrate ratio. A total of eighteen (18) heads of six (6)-week-old female New Zealand White Rabbits were selected and distributed into three (3) groups, each treatment replicated thrice with 2 rabbits per replication. Results showed no significant difference (P&lt;0.05) in final weight, gain in weight, and average daily gain in all the treatment groups. The control group (T1) was fed 70% guinea grass and 30% concentrates. For T2 and T3, the guinea grass was replaced with fresh azolla on an equi-weight basis at levels of 10 and 20 percent, respectively. </w:t>
-      </w:r>
-      <w:r>
-        <w:rPr>
-          <w:rFonts w:ascii="Georgia" w:hAnsi="Georgia" w:cs="Georgia" w:eastAsia="Georgia"/>
-          <w:sz w:val="22"/>
-          <w:szCs w:val="22"/>
-          <w:b w:val="0"/>
-          <w:bCs w:val="0"/>
-          <w:strike w:val="0"/>
-          <w:color w:val="000000"/>
-        </w:rPr>
-        <w:t>In conclusion</w:t>
+        <w:t>The study was conducted at [REDACTED], for 35 days, from April 16 to May 20, 2023. The study was carried out to search for alternatives to protein sources. The objective of the study was to determine the growth response of F1 New Zealand white rabbits as influenced by the roughage-to-concentrate ratio. A total of eighteen (18) heads of six (6)-week-old female New Zealand White Rabbits were selected and distributed into three (3) groups, each treatment replicated thrice with 2 rabbits per replication. Results showed no significant difference (P&lt;0.05) in final weight, gain in weight, and average daily gain in all the treatment groups. The control group (T1) was fed 70% guinea grass and 30% concentrates. For T2 and T3, the guinea grass was replaced with fresh azolla on an equi-weight basis at levels of 10 and 20 percent, respectively. In conclusion</w:t>
       </w:r>
       <w:r>
         <w:rPr>

</xml_diff>

<commit_message>
Draft_088: uniform left alignment on Appendix A minor headings
</commit_message>
<xml_diff>
--- a/thesis/003_ThesisProposal_Draft_088.docx
+++ b/thesis/003_ThesisProposal_Draft_088.docx
@@ -12304,7 +12304,6 @@
       <w:pPr>
         <w:keepNext w:val="1"/>
         <w:spacing w:before="60" w:after="40" w:line="220" w:lineRule="auto"/>
-        <w:ind w:firstLine="720"/>
         <w:jc w:val="left"/>
         <w:rPr/>
       </w:pPr>
@@ -12487,7 +12486,6 @@
       <w:pPr>
         <w:keepNext w:val="1"/>
         <w:spacing w:before="20" w:after="20" w:line="220" w:lineRule="auto"/>
-        <w:ind w:firstLine="720"/>
         <w:jc w:val="left"/>
         <w:rPr/>
       </w:pPr>
@@ -12592,7 +12590,6 @@
       <w:pPr>
         <w:keepNext w:val="1"/>
         <w:spacing w:before="20" w:after="20" w:line="220" w:lineRule="auto"/>
-        <w:ind w:firstLine="720"/>
         <w:jc w:val="left"/>
         <w:rPr/>
       </w:pPr>
@@ -12739,7 +12736,6 @@
       <w:pPr>
         <w:keepNext w:val="1"/>
         <w:spacing w:before="20" w:after="20" w:line="220" w:lineRule="auto"/>
-        <w:ind w:firstLine="720"/>
         <w:jc w:val="left"/>
         <w:rPr/>
       </w:pPr>
@@ -13256,7 +13252,7 @@
           <w:p>
             <w:pPr>
               <w:spacing w:before="20" w:after="20" w:line="220" w:lineRule="auto"/>
-              <w:jc w:val="both"/>
+              <w:jc w:val="left"/>
               <w:rPr/>
             </w:pPr>
             <w:r>
@@ -13326,7 +13322,7 @@
           <w:p>
             <w:pPr>
               <w:spacing w:before="20" w:after="20" w:line="220" w:lineRule="auto"/>
-              <w:jc w:val="both"/>
+              <w:jc w:val="left"/>
               <w:rPr/>
             </w:pPr>
             <w:r>
@@ -14027,8 +14023,7 @@
     <w:p>
       <w:pPr>
         <w:spacing w:before="120" w:after="60" w:line="360" w:lineRule="auto"/>
-        <w:ind w:firstLine="720"/>
-        <w:jc w:val="both"/>
+        <w:jc w:val="left"/>
         <w:rPr/>
       </w:pPr>
       <w:r>
@@ -17905,7 +17900,7 @@
       <w:pPr>
         <w:keepNext w:val="1"/>
         <w:spacing w:before="120" w:after="60" w:line="360" w:lineRule="auto"/>
-        <w:jc w:val="both"/>
+        <w:jc w:val="left"/>
         <w:rPr/>
       </w:pPr>
       <w:r>

</xml_diff>

<commit_message>
Draft_088: move CODING SHEET COLUMNS after Unhedged Assertions section
</commit_message>
<xml_diff>
--- a/thesis/003_ThesisProposal_Draft_088.docx
+++ b/thesis/003_ThesisProposal_Draft_088.docx
@@ -18060,6 +18060,584 @@
         <w:t xml:space="preserve">• Record the full clause in the coding sheet.</w:t>
       </w:r>
     </w:p>
+    <w:p>
+      <w:pPr>
+        <w:keepNext w:val="1"/>
+        <w:spacing w:before="0" w:after="0" w:line="240" w:lineRule="auto"/>
+        <w:ind w:firstLine="720"/>
+        <w:jc w:val="both"/>
+        <w:rPr/>
+      </w:pPr>
+      <w:r>
+        <w:rPr>
+          <w:rFonts w:ascii="Georgia" w:hAnsi="Georgia" w:cs="Georgia" w:eastAsia="Georgia"/>
+          <w:b w:val="0"/>
+          <w:bCs w:val="0"/>
+          <w:i w:val="0"/>
+          <w:iCs w:val="0"/>
+          <w:sz w:val="22"/>
+          <w:szCs w:val="22"/>
+          <w:rtl w:val="0"/>
+        </w:rPr>
+      </w:r>
+      <w:r>
+        <w:rPr>
+          <w:rtl w:val="0"/>
+        </w:rPr>
+      </w:r>
+    </w:p>
+    <w:tbl>
+      <w:tblPr>
+        <w:tblStyle w:val="Table10"/>
+        <w:tblW w:w="8304.0" w:type="dxa"/>
+        <w:jc w:val="left"/>
+        <w:tblInd w:w="-40.0" w:type="dxa"/>
+        <w:tblBorders>
+          <w:top w:color="000000" w:space="0" w:sz="18" w:val="single"/>
+          <w:left w:color="000000" w:space="0" w:sz="0" w:val="nil"/>
+          <w:bottom w:color="000000" w:space="0" w:sz="18" w:val="single"/>
+          <w:right w:color="000000" w:space="0" w:sz="0" w:val="nil"/>
+          <w:insideH w:color="000000" w:space="0" w:sz="0" w:val="nil"/>
+          <w:insideV w:color="000000" w:space="0" w:sz="0" w:val="nil"/>
+        </w:tblBorders>
+        <w:tblLayout w:type="fixed"/>
+        <w:tblLook w:val="0400"/>
+      </w:tblPr>
+      <w:tblGrid>
+        <w:gridCol w:w="2076"/>
+        <w:gridCol w:w="2076"/>
+        <w:gridCol w:w="2076"/>
+        <w:gridCol w:w="2076"/>
+        <w:tblGridChange w:id="0">
+          <w:tblGrid>
+            <w:gridCol w:w="2076"/>
+            <w:gridCol w:w="2076"/>
+            <w:gridCol w:w="2076"/>
+            <w:gridCol w:w="2076"/>
+          </w:tblGrid>
+        </w:tblGridChange>
+      </w:tblGrid>
+      <w:tr>
+        <w:trPr>
+          <w:cantSplit/>
+          <w:tblHeader/>
+        </w:trPr>
+        <w:tc>
+          <w:tcPr>
+            <w:tcBorders>
+              <w:bottom w:color="000000" w:space="0" w:sz="4" w:val="single"/>
+            </w:tcBorders>
+            <w:shd w:fill="f2f4f6" w:val="clear"/>
+          </w:tcPr>
+          <w:p>
+            <w:pPr>
+              <w:spacing w:before="0" w:after="0" w:line="240" w:lineRule="auto"/>
+              <w:jc w:val="both"/>
+              <w:rPr/>
+            </w:pPr>
+            <w:r>
+              <w:rPr>
+                <w:rFonts w:ascii="Georgia" w:cs="Georgia" w:eastAsia="Georgia" w:hAnsi="Georgia"/>
+                <w:b w:val="1"/>
+                <w:bCs w:val="1"/>
+                <w:sz w:val="20"/>
+                <w:szCs w:val="20"/>
+                <w:rtl w:val="0"/>
+              </w:rPr>
+              <w:t xml:space="preserve">Color</w:t>
+            </w:r>
+            <w:r>
+              <w:rPr>
+                <w:rtl w:val="0"/>
+                <w:sz w:val="20"/>
+                <w:szCs w:val="20"/>
+                <w:rFonts w:ascii="Georgia" w:hAnsi="Georgia"/>
+              </w:rPr>
+            </w:r>
+          </w:p>
+        </w:tc>
+        <w:tc>
+          <w:tcPr>
+            <w:tcBorders>
+              <w:bottom w:color="000000" w:space="0" w:sz="4" w:val="single"/>
+            </w:tcBorders>
+            <w:shd w:fill="f2f4f6" w:val="clear"/>
+          </w:tcPr>
+          <w:p>
+            <w:pPr>
+              <w:spacing w:before="0" w:after="0" w:line="240" w:lineRule="auto"/>
+              <w:jc w:val="both"/>
+              <w:rPr/>
+            </w:pPr>
+            <w:r>
+              <w:rPr>
+                <w:rFonts w:ascii="Georgia" w:cs="Georgia" w:eastAsia="Georgia" w:hAnsi="Georgia"/>
+                <w:b w:val="1"/>
+                <w:bCs w:val="1"/>
+                <w:sz w:val="20"/>
+                <w:szCs w:val="20"/>
+                <w:rtl w:val="0"/>
+              </w:rPr>
+              <w:t xml:space="preserve">Subtype</w:t>
+            </w:r>
+            <w:r>
+              <w:rPr>
+                <w:rtl w:val="0"/>
+                <w:sz w:val="20"/>
+                <w:szCs w:val="20"/>
+                <w:rFonts w:ascii="Georgia" w:hAnsi="Georgia"/>
+              </w:rPr>
+            </w:r>
+          </w:p>
+        </w:tc>
+        <w:tc>
+          <w:tcPr>
+            <w:tcBorders>
+              <w:bottom w:color="000000" w:space="0" w:sz="4" w:val="single"/>
+            </w:tcBorders>
+            <w:shd w:fill="f2f4f6" w:val="clear"/>
+          </w:tcPr>
+          <w:p>
+            <w:pPr>
+              <w:spacing w:before="0" w:after="0" w:line="240" w:lineRule="auto"/>
+              <w:jc w:val="both"/>
+              <w:rPr/>
+            </w:pPr>
+            <w:r>
+              <w:rPr>
+                <w:rFonts w:ascii="Georgia" w:cs="Georgia" w:eastAsia="Georgia" w:hAnsi="Georgia"/>
+                <w:b w:val="1"/>
+                <w:bCs w:val="1"/>
+                <w:sz w:val="20"/>
+                <w:szCs w:val="20"/>
+                <w:rtl w:val="0"/>
+              </w:rPr>
+              <w:t xml:space="preserve">Definition</w:t>
+            </w:r>
+            <w:r>
+              <w:rPr>
+                <w:rtl w:val="0"/>
+                <w:sz w:val="20"/>
+                <w:szCs w:val="20"/>
+                <w:rFonts w:ascii="Georgia" w:hAnsi="Georgia"/>
+              </w:rPr>
+            </w:r>
+          </w:p>
+        </w:tc>
+        <w:tc>
+          <w:tcPr>
+            <w:tcBorders>
+              <w:bottom w:color="000000" w:space="0" w:sz="4" w:val="single"/>
+            </w:tcBorders>
+            <w:shd w:fill="f2f4f6" w:val="clear"/>
+          </w:tcPr>
+          <w:p>
+            <w:pPr>
+              <w:spacing w:before="0" w:after="0" w:line="240" w:lineRule="auto"/>
+              <w:jc w:val="both"/>
+              <w:rPr/>
+            </w:pPr>
+            <w:r>
+              <w:rPr>
+                <w:rFonts w:ascii="Georgia" w:cs="Georgia" w:eastAsia="Georgia" w:hAnsi="Georgia"/>
+                <w:b w:val="1"/>
+                <w:bCs w:val="1"/>
+                <w:sz w:val="20"/>
+                <w:szCs w:val="20"/>
+                <w:rtl w:val="0"/>
+              </w:rPr>
+              <w:t xml:space="preserve">Highlighted Example</w:t>
+            </w:r>
+            <w:r>
+              <w:rPr>
+                <w:rtl w:val="0"/>
+                <w:sz w:val="20"/>
+                <w:szCs w:val="20"/>
+                <w:rFonts w:ascii="Georgia" w:hAnsi="Georgia"/>
+              </w:rPr>
+            </w:r>
+          </w:p>
+        </w:tc>
+      </w:tr>
+      <w:tr>
+        <w:trPr>
+          <w:tblHeader w:val="0"/>
+          <w:cantSplit/>
+        </w:trPr>
+        <w:tc>
+          <w:tcPr>
+            <w:shd w:fill="bfbfbf" w:val="clear"/>
+          </w:tcPr>
+          <w:p>
+            <w:pPr>
+              <w:spacing w:before="0" w:after="0" w:line="240" w:lineRule="auto"/>
+              <w:jc w:val="left"/>
+              <w:rPr/>
+            </w:pPr>
+            <w:r>
+              <w:rPr>
+                <w:rFonts w:ascii="Georgia" w:cs="Georgia" w:eastAsia="Georgia" w:hAnsi="Georgia"/>
+                <w:sz w:val="20"/>
+                <w:szCs w:val="20"/>
+                <w:rtl w:val="0"/>
+                <w:shd w:val="clear" w:color="auto" w:fill="bfbfbf"/>
+              </w:rPr>
+              <w:t xml:space="preserve">      </w:t>
+            </w:r>
+            <w:r>
+              <w:rPr>
+                <w:rtl w:val="0"/>
+                <w:sz w:val="20"/>
+                <w:szCs w:val="20"/>
+                <w:rFonts w:ascii="Georgia" w:hAnsi="Georgia"/>
+                <w:shd w:val="clear" w:color="auto" w:fill="bfbfbf"/>
+              </w:rPr>
+            </w:r>
+          </w:p>
+        </w:tc>
+        <w:tc>
+          <w:tcPr/>
+          <w:p>
+            <w:pPr>
+              <w:spacing w:before="0" w:after="0" w:line="240" w:lineRule="auto"/>
+              <w:jc w:val="both"/>
+              <w:rPr/>
+            </w:pPr>
+            <w:r>
+              <w:rPr>
+                <w:rFonts w:ascii="Georgia" w:cs="Georgia" w:eastAsia="Georgia" w:hAnsi="Georgia"/>
+                <w:sz w:val="20"/>
+                <w:szCs w:val="20"/>
+                <w:rtl w:val="0"/>
+              </w:rPr>
+              <w:t xml:space="preserve">Result Claim [R] — Not markable (bare results).</w:t>
+            </w:r>
+            <w:r>
+              <w:rPr>
+                <w:rtl w:val="0"/>
+                <w:sz w:val="20"/>
+                <w:szCs w:val="20"/>
+                <w:rFonts w:ascii="Georgia" w:hAnsi="Georgia"/>
+              </w:rPr>
+            </w:r>
+          </w:p>
+        </w:tc>
+        <w:tc>
+          <w:tcPr/>
+          <w:p>
+            <w:pPr>
+              <w:spacing w:before="0" w:after="0" w:line="240" w:lineRule="auto"/>
+              <w:jc w:val="both"/>
+              <w:rPr/>
+            </w:pPr>
+            <w:r>
+              <w:rPr>
+                <w:rFonts w:ascii="Georgia" w:cs="Georgia" w:eastAsia="Georgia" w:hAnsi="Georgia"/>
+                <w:sz w:val="20"/>
+                <w:szCs w:val="20"/>
+                <w:rtl w:val="0"/>
+              </w:rPr>
+              <w:t xml:space="preserve">Not markable.</w:t>
+            </w:r>
+            <w:r>
+              <w:rPr>
+                <w:rtl w:val="0"/>
+                <w:sz w:val="20"/>
+                <w:szCs w:val="20"/>
+                <w:rFonts w:ascii="Georgia" w:hAnsi="Georgia"/>
+              </w:rPr>
+            </w:r>
+          </w:p>
+        </w:tc>
+        <w:tc>
+          <w:tcPr/>
+          <w:p>
+            <w:pPr>
+              <w:spacing w:before="0" w:after="0" w:line="240" w:lineRule="auto"/>
+              <w:jc w:val="both"/>
+              <w:rPr/>
+            </w:pPr>
+            <w:r>
+              <w:rPr>
+                <w:rFonts w:ascii="Georgia" w:hAnsi="Georgia"/>
+                <w:sz w:val="20"/>
+                <w:szCs w:val="20"/>
+              </w:rPr>
+              <w:t xml:space="preserve">“</w:t>
+            </w:r>
+            <w:r>
+              <w:rPr>
+                <w:rFonts w:ascii="Georgia" w:hAnsi="Georgia"/>
+                <w:sz w:val="20"/>
+                <w:szCs w:val="20"/>
+                <w:shd w:val="clear" w:color="auto" w:fill="bfbfbf"/>
+              </w:rPr>
+              <w:t xml:space="preserve">was</w:t>
+            </w:r>
+            <w:r>
+              <w:rPr>
+                <w:rFonts w:ascii="Georgia" w:hAnsi="Georgia"/>
+                <w:sz w:val="20"/>
+                <w:szCs w:val="20"/>
+              </w:rPr>
+              <w:t xml:space="preserve"> [G] the most compelling…” (mark) vs “Yield higher (p &lt; .05)” (omit).</w:t>
+            </w:r>
+          </w:p>
+        </w:tc>
+      </w:tr>
+      <w:tr>
+        <w:trPr>
+          <w:tblHeader w:val="0"/>
+          <w:cantSplit/>
+        </w:trPr>
+        <w:tc>
+          <w:tcPr>
+            <w:shd w:fill="bfbfbf" w:val="clear"/>
+          </w:tcPr>
+          <w:p>
+            <w:pPr>
+              <w:spacing w:before="0" w:after="0" w:line="240" w:lineRule="auto"/>
+              <w:jc w:val="left"/>
+              <w:rPr/>
+            </w:pPr>
+            <w:r>
+              <w:rPr>
+                <w:rFonts w:ascii="Georgia" w:cs="Georgia" w:eastAsia="Georgia" w:hAnsi="Georgia"/>
+                <w:sz w:val="20"/>
+                <w:szCs w:val="20"/>
+                <w:rtl w:val="0"/>
+                <w:shd w:val="clear" w:color="auto" w:fill="bfbfbf"/>
+              </w:rPr>
+              <w:t xml:space="preserve">      </w:t>
+            </w:r>
+            <w:r>
+              <w:rPr>
+                <w:rtl w:val="0"/>
+                <w:sz w:val="20"/>
+                <w:szCs w:val="20"/>
+                <w:rFonts w:ascii="Georgia" w:hAnsi="Georgia"/>
+                <w:shd w:val="clear" w:color="auto" w:fill="bfbfbf"/>
+              </w:rPr>
+            </w:r>
+          </w:p>
+        </w:tc>
+        <w:tc>
+          <w:tcPr/>
+          <w:p>
+            <w:pPr>
+              <w:spacing w:before="0" w:after="0" w:line="240" w:lineRule="auto"/>
+              <w:jc w:val="both"/>
+              <w:rPr/>
+            </w:pPr>
+            <w:r>
+              <w:rPr>
+                <w:rFonts w:ascii="Georgia" w:cs="Georgia" w:eastAsia="Georgia" w:hAnsi="Georgia"/>
+                <w:sz w:val="20"/>
+                <w:szCs w:val="20"/>
+                <w:rtl w:val="0"/>
+              </w:rPr>
+              <w:t xml:space="preserve">Generalization [G]</w:t>
+            </w:r>
+            <w:r>
+              <w:rPr>
+                <w:rtl w:val="0"/>
+                <w:sz w:val="20"/>
+                <w:szCs w:val="20"/>
+                <w:rFonts w:ascii="Georgia" w:hAnsi="Georgia"/>
+              </w:rPr>
+            </w:r>
+          </w:p>
+        </w:tc>
+        <w:tc>
+          <w:tcPr/>
+          <w:p>
+            <w:pPr>
+              <w:spacing w:before="0" w:after="0" w:line="240" w:lineRule="auto"/>
+              <w:jc w:val="both"/>
+              <w:rPr/>
+            </w:pPr>
+            <w:r>
+              <w:rPr>
+                <w:rFonts w:ascii="Georgia" w:cs="Georgia" w:eastAsia="Georgia" w:hAnsi="Georgia"/>
+                <w:sz w:val="20"/>
+                <w:szCs w:val="20"/>
+                <w:rtl w:val="0"/>
+              </w:rPr>
+              <w:t xml:space="preserve">Inference or ranking beyond the data.</w:t>
+            </w:r>
+            <w:r>
+              <w:rPr>
+                <w:rtl w:val="0"/>
+                <w:sz w:val="20"/>
+                <w:szCs w:val="20"/>
+                <w:rFonts w:ascii="Georgia" w:hAnsi="Georgia"/>
+              </w:rPr>
+            </w:r>
+          </w:p>
+        </w:tc>
+        <w:tc>
+          <w:tcPr/>
+          <w:p>
+            <w:pPr>
+              <w:spacing w:before="0" w:after="0" w:line="240" w:lineRule="auto"/>
+              <w:jc w:val="both"/>
+              <w:rPr/>
+            </w:pPr>
+            <w:r>
+              <w:rPr>
+                <w:rFonts w:ascii="Georgia" w:hAnsi="Georgia"/>
+                <w:sz w:val="20"/>
+                <w:szCs w:val="20"/>
+              </w:rPr>
+              <w:t xml:space="preserve">“This </w:t>
+            </w:r>
+            <w:r>
+              <w:rPr>
+                <w:rFonts w:ascii="Georgia" w:hAnsi="Georgia"/>
+                <w:sz w:val="20"/>
+                <w:szCs w:val="20"/>
+                <w:shd w:val="clear" w:color="auto" w:fill="bfbfbf"/>
+              </w:rPr>
+              <w:t xml:space="preserve">led</w:t>
+            </w:r>
+            <w:r>
+              <w:rPr>
+                <w:rFonts w:ascii="Georgia" w:hAnsi="Georgia"/>
+                <w:sz w:val="20"/>
+                <w:szCs w:val="20"/>
+              </w:rPr>
+              <w:t xml:space="preserve"> [G] to the conclusion that all farms were free of it.”</w:t>
+            </w:r>
+          </w:p>
+        </w:tc>
+      </w:tr>
+      <w:tr>
+        <w:trPr>
+          <w:tblHeader w:val="0"/>
+          <w:cantSplit/>
+        </w:trPr>
+        <w:tc>
+          <w:tcPr>
+            <w:shd w:fill="bfbfbf" w:val="clear"/>
+          </w:tcPr>
+          <w:p>
+            <w:pPr>
+              <w:spacing w:before="0" w:after="0" w:line="240" w:lineRule="auto"/>
+              <w:jc w:val="left"/>
+              <w:rPr/>
+            </w:pPr>
+            <w:r>
+              <w:rPr>
+                <w:rFonts w:ascii="Georgia" w:cs="Georgia" w:eastAsia="Georgia" w:hAnsi="Georgia"/>
+                <w:sz w:val="20"/>
+                <w:szCs w:val="20"/>
+                <w:rtl w:val="0"/>
+                <w:shd w:val="clear" w:color="auto" w:fill="bfbfbf"/>
+              </w:rPr>
+              <w:t xml:space="preserve">      </w:t>
+            </w:r>
+            <w:r>
+              <w:rPr>
+                <w:rtl w:val="0"/>
+                <w:sz w:val="20"/>
+                <w:szCs w:val="20"/>
+                <w:rFonts w:ascii="Georgia" w:hAnsi="Georgia"/>
+                <w:shd w:val="clear" w:color="auto" w:fill="bfbfbf"/>
+              </w:rPr>
+            </w:r>
+          </w:p>
+        </w:tc>
+        <w:tc>
+          <w:tcPr/>
+          <w:p>
+            <w:pPr>
+              <w:spacing w:before="0" w:after="0" w:line="240" w:lineRule="auto"/>
+              <w:jc w:val="both"/>
+              <w:rPr/>
+            </w:pPr>
+            <w:r>
+              <w:rPr>
+                <w:rFonts w:ascii="Georgia" w:cs="Georgia" w:eastAsia="Georgia" w:hAnsi="Georgia"/>
+                <w:sz w:val="20"/>
+                <w:szCs w:val="20"/>
+                <w:rtl w:val="0"/>
+              </w:rPr>
+              <w:t xml:space="preserve">Causal Claim [C]</w:t>
+            </w:r>
+            <w:r>
+              <w:rPr>
+                <w:rtl w:val="0"/>
+                <w:sz w:val="20"/>
+                <w:szCs w:val="20"/>
+                <w:rFonts w:ascii="Georgia" w:hAnsi="Georgia"/>
+              </w:rPr>
+            </w:r>
+          </w:p>
+        </w:tc>
+        <w:tc>
+          <w:tcPr/>
+          <w:p>
+            <w:pPr>
+              <w:spacing w:before="0" w:after="0" w:line="240" w:lineRule="auto"/>
+              <w:jc w:val="both"/>
+              <w:rPr/>
+            </w:pPr>
+            <w:r>
+              <w:rPr>
+                <w:rFonts w:ascii="Georgia" w:cs="Georgia" w:eastAsia="Georgia" w:hAnsi="Georgia"/>
+                <w:sz w:val="20"/>
+                <w:szCs w:val="20"/>
+                <w:rtl w:val="0"/>
+              </w:rPr>
+              <w:t xml:space="preserve">Cause–effect stated as established.</w:t>
+            </w:r>
+            <w:r>
+              <w:rPr>
+                <w:rtl w:val="0"/>
+                <w:sz w:val="20"/>
+                <w:szCs w:val="20"/>
+                <w:rFonts w:ascii="Georgia" w:hAnsi="Georgia"/>
+              </w:rPr>
+            </w:r>
+          </w:p>
+        </w:tc>
+        <w:tc>
+          <w:tcPr/>
+          <w:p>
+            <w:pPr>
+              <w:spacing w:before="0" w:after="0" w:line="240" w:lineRule="auto"/>
+              <w:jc w:val="both"/>
+              <w:rPr/>
+            </w:pPr>
+            <w:r>
+              <w:rPr>
+                <w:rFonts w:ascii="Georgia" w:hAnsi="Georgia"/>
+                <w:sz w:val="20"/>
+                <w:szCs w:val="20"/>
+              </w:rPr>
+              <w:t xml:space="preserve">“Extracts </w:t>
+            </w:r>
+            <w:r>
+              <w:rPr>
+                <w:rFonts w:ascii="Georgia" w:hAnsi="Georgia"/>
+                <w:sz w:val="20"/>
+                <w:szCs w:val="20"/>
+                <w:shd w:val="clear" w:color="auto" w:fill="bfbfbf"/>
+              </w:rPr>
+              <w:t xml:space="preserve">produce</w:t>
+            </w:r>
+            <w:r>
+              <w:rPr>
+                <w:rFonts w:ascii="Georgia" w:hAnsi="Georgia"/>
+                <w:sz w:val="20"/>
+                <w:szCs w:val="20"/>
+              </w:rPr>
+              <w:t xml:space="preserve"> [C] comparable staining because they contain similar compounds.”</w:t>
+            </w:r>
+          </w:p>
+        </w:tc>
+      </w:tr>
+    </w:tbl>
     <w:p>
       <w:pPr>
         <w:keepNext w:val="1"/>
@@ -19561,584 +20139,6 @@
         </w:rPr>
       </w:r>
     </w:p>
-    <w:p>
-      <w:pPr>
-        <w:keepNext w:val="1"/>
-        <w:spacing w:before="0" w:after="0" w:line="240" w:lineRule="auto"/>
-        <w:ind w:firstLine="720"/>
-        <w:jc w:val="both"/>
-        <w:rPr/>
-      </w:pPr>
-      <w:r>
-        <w:rPr>
-          <w:rFonts w:ascii="Georgia" w:hAnsi="Georgia" w:cs="Georgia" w:eastAsia="Georgia"/>
-          <w:b w:val="0"/>
-          <w:bCs w:val="0"/>
-          <w:i w:val="0"/>
-          <w:iCs w:val="0"/>
-          <w:sz w:val="22"/>
-          <w:szCs w:val="22"/>
-          <w:rtl w:val="0"/>
-        </w:rPr>
-      </w:r>
-      <w:r>
-        <w:rPr>
-          <w:rtl w:val="0"/>
-        </w:rPr>
-      </w:r>
-    </w:p>
-    <w:tbl>
-      <w:tblPr>
-        <w:tblStyle w:val="Table10"/>
-        <w:tblW w:w="8304.0" w:type="dxa"/>
-        <w:jc w:val="left"/>
-        <w:tblInd w:w="-40.0" w:type="dxa"/>
-        <w:tblBorders>
-          <w:top w:color="000000" w:space="0" w:sz="18" w:val="single"/>
-          <w:left w:color="000000" w:space="0" w:sz="0" w:val="nil"/>
-          <w:bottom w:color="000000" w:space="0" w:sz="18" w:val="single"/>
-          <w:right w:color="000000" w:space="0" w:sz="0" w:val="nil"/>
-          <w:insideH w:color="000000" w:space="0" w:sz="0" w:val="nil"/>
-          <w:insideV w:color="000000" w:space="0" w:sz="0" w:val="nil"/>
-        </w:tblBorders>
-        <w:tblLayout w:type="fixed"/>
-        <w:tblLook w:val="0400"/>
-      </w:tblPr>
-      <w:tblGrid>
-        <w:gridCol w:w="2076"/>
-        <w:gridCol w:w="2076"/>
-        <w:gridCol w:w="2076"/>
-        <w:gridCol w:w="2076"/>
-        <w:tblGridChange w:id="0">
-          <w:tblGrid>
-            <w:gridCol w:w="2076"/>
-            <w:gridCol w:w="2076"/>
-            <w:gridCol w:w="2076"/>
-            <w:gridCol w:w="2076"/>
-          </w:tblGrid>
-        </w:tblGridChange>
-      </w:tblGrid>
-      <w:tr>
-        <w:trPr>
-          <w:cantSplit/>
-          <w:tblHeader/>
-        </w:trPr>
-        <w:tc>
-          <w:tcPr>
-            <w:tcBorders>
-              <w:bottom w:color="000000" w:space="0" w:sz="4" w:val="single"/>
-            </w:tcBorders>
-            <w:shd w:fill="f2f4f6" w:val="clear"/>
-          </w:tcPr>
-          <w:p>
-            <w:pPr>
-              <w:spacing w:before="0" w:after="0" w:line="240" w:lineRule="auto"/>
-              <w:jc w:val="both"/>
-              <w:rPr/>
-            </w:pPr>
-            <w:r>
-              <w:rPr>
-                <w:rFonts w:ascii="Georgia" w:cs="Georgia" w:eastAsia="Georgia" w:hAnsi="Georgia"/>
-                <w:b w:val="1"/>
-                <w:bCs w:val="1"/>
-                <w:sz w:val="20"/>
-                <w:szCs w:val="20"/>
-                <w:rtl w:val="0"/>
-              </w:rPr>
-              <w:t xml:space="preserve">Color</w:t>
-            </w:r>
-            <w:r>
-              <w:rPr>
-                <w:rtl w:val="0"/>
-                <w:sz w:val="20"/>
-                <w:szCs w:val="20"/>
-                <w:rFonts w:ascii="Georgia" w:hAnsi="Georgia"/>
-              </w:rPr>
-            </w:r>
-          </w:p>
-        </w:tc>
-        <w:tc>
-          <w:tcPr>
-            <w:tcBorders>
-              <w:bottom w:color="000000" w:space="0" w:sz="4" w:val="single"/>
-            </w:tcBorders>
-            <w:shd w:fill="f2f4f6" w:val="clear"/>
-          </w:tcPr>
-          <w:p>
-            <w:pPr>
-              <w:spacing w:before="0" w:after="0" w:line="240" w:lineRule="auto"/>
-              <w:jc w:val="both"/>
-              <w:rPr/>
-            </w:pPr>
-            <w:r>
-              <w:rPr>
-                <w:rFonts w:ascii="Georgia" w:cs="Georgia" w:eastAsia="Georgia" w:hAnsi="Georgia"/>
-                <w:b w:val="1"/>
-                <w:bCs w:val="1"/>
-                <w:sz w:val="20"/>
-                <w:szCs w:val="20"/>
-                <w:rtl w:val="0"/>
-              </w:rPr>
-              <w:t xml:space="preserve">Subtype</w:t>
-            </w:r>
-            <w:r>
-              <w:rPr>
-                <w:rtl w:val="0"/>
-                <w:sz w:val="20"/>
-                <w:szCs w:val="20"/>
-                <w:rFonts w:ascii="Georgia" w:hAnsi="Georgia"/>
-              </w:rPr>
-            </w:r>
-          </w:p>
-        </w:tc>
-        <w:tc>
-          <w:tcPr>
-            <w:tcBorders>
-              <w:bottom w:color="000000" w:space="0" w:sz="4" w:val="single"/>
-            </w:tcBorders>
-            <w:shd w:fill="f2f4f6" w:val="clear"/>
-          </w:tcPr>
-          <w:p>
-            <w:pPr>
-              <w:spacing w:before="0" w:after="0" w:line="240" w:lineRule="auto"/>
-              <w:jc w:val="both"/>
-              <w:rPr/>
-            </w:pPr>
-            <w:r>
-              <w:rPr>
-                <w:rFonts w:ascii="Georgia" w:cs="Georgia" w:eastAsia="Georgia" w:hAnsi="Georgia"/>
-                <w:b w:val="1"/>
-                <w:bCs w:val="1"/>
-                <w:sz w:val="20"/>
-                <w:szCs w:val="20"/>
-                <w:rtl w:val="0"/>
-              </w:rPr>
-              <w:t xml:space="preserve">Definition</w:t>
-            </w:r>
-            <w:r>
-              <w:rPr>
-                <w:rtl w:val="0"/>
-                <w:sz w:val="20"/>
-                <w:szCs w:val="20"/>
-                <w:rFonts w:ascii="Georgia" w:hAnsi="Georgia"/>
-              </w:rPr>
-            </w:r>
-          </w:p>
-        </w:tc>
-        <w:tc>
-          <w:tcPr>
-            <w:tcBorders>
-              <w:bottom w:color="000000" w:space="0" w:sz="4" w:val="single"/>
-            </w:tcBorders>
-            <w:shd w:fill="f2f4f6" w:val="clear"/>
-          </w:tcPr>
-          <w:p>
-            <w:pPr>
-              <w:spacing w:before="0" w:after="0" w:line="240" w:lineRule="auto"/>
-              <w:jc w:val="both"/>
-              <w:rPr/>
-            </w:pPr>
-            <w:r>
-              <w:rPr>
-                <w:rFonts w:ascii="Georgia" w:cs="Georgia" w:eastAsia="Georgia" w:hAnsi="Georgia"/>
-                <w:b w:val="1"/>
-                <w:bCs w:val="1"/>
-                <w:sz w:val="20"/>
-                <w:szCs w:val="20"/>
-                <w:rtl w:val="0"/>
-              </w:rPr>
-              <w:t xml:space="preserve">Highlighted Example</w:t>
-            </w:r>
-            <w:r>
-              <w:rPr>
-                <w:rtl w:val="0"/>
-                <w:sz w:val="20"/>
-                <w:szCs w:val="20"/>
-                <w:rFonts w:ascii="Georgia" w:hAnsi="Georgia"/>
-              </w:rPr>
-            </w:r>
-          </w:p>
-        </w:tc>
-      </w:tr>
-      <w:tr>
-        <w:trPr>
-          <w:tblHeader w:val="0"/>
-          <w:cantSplit/>
-        </w:trPr>
-        <w:tc>
-          <w:tcPr>
-            <w:shd w:fill="bfbfbf" w:val="clear"/>
-          </w:tcPr>
-          <w:p>
-            <w:pPr>
-              <w:spacing w:before="0" w:after="0" w:line="240" w:lineRule="auto"/>
-              <w:jc w:val="left"/>
-              <w:rPr/>
-            </w:pPr>
-            <w:r>
-              <w:rPr>
-                <w:rFonts w:ascii="Georgia" w:cs="Georgia" w:eastAsia="Georgia" w:hAnsi="Georgia"/>
-                <w:sz w:val="20"/>
-                <w:szCs w:val="20"/>
-                <w:rtl w:val="0"/>
-                <w:shd w:val="clear" w:color="auto" w:fill="bfbfbf"/>
-              </w:rPr>
-              <w:t xml:space="preserve">      </w:t>
-            </w:r>
-            <w:r>
-              <w:rPr>
-                <w:rtl w:val="0"/>
-                <w:sz w:val="20"/>
-                <w:szCs w:val="20"/>
-                <w:rFonts w:ascii="Georgia" w:hAnsi="Georgia"/>
-                <w:shd w:val="clear" w:color="auto" w:fill="bfbfbf"/>
-              </w:rPr>
-            </w:r>
-          </w:p>
-        </w:tc>
-        <w:tc>
-          <w:tcPr/>
-          <w:p>
-            <w:pPr>
-              <w:spacing w:before="0" w:after="0" w:line="240" w:lineRule="auto"/>
-              <w:jc w:val="both"/>
-              <w:rPr/>
-            </w:pPr>
-            <w:r>
-              <w:rPr>
-                <w:rFonts w:ascii="Georgia" w:cs="Georgia" w:eastAsia="Georgia" w:hAnsi="Georgia"/>
-                <w:sz w:val="20"/>
-                <w:szCs w:val="20"/>
-                <w:rtl w:val="0"/>
-              </w:rPr>
-              <w:t xml:space="preserve">Result Claim [R] — Not markable (bare results).</w:t>
-            </w:r>
-            <w:r>
-              <w:rPr>
-                <w:rtl w:val="0"/>
-                <w:sz w:val="20"/>
-                <w:szCs w:val="20"/>
-                <w:rFonts w:ascii="Georgia" w:hAnsi="Georgia"/>
-              </w:rPr>
-            </w:r>
-          </w:p>
-        </w:tc>
-        <w:tc>
-          <w:tcPr/>
-          <w:p>
-            <w:pPr>
-              <w:spacing w:before="0" w:after="0" w:line="240" w:lineRule="auto"/>
-              <w:jc w:val="both"/>
-              <w:rPr/>
-            </w:pPr>
-            <w:r>
-              <w:rPr>
-                <w:rFonts w:ascii="Georgia" w:cs="Georgia" w:eastAsia="Georgia" w:hAnsi="Georgia"/>
-                <w:sz w:val="20"/>
-                <w:szCs w:val="20"/>
-                <w:rtl w:val="0"/>
-              </w:rPr>
-              <w:t xml:space="preserve">Not markable.</w:t>
-            </w:r>
-            <w:r>
-              <w:rPr>
-                <w:rtl w:val="0"/>
-                <w:sz w:val="20"/>
-                <w:szCs w:val="20"/>
-                <w:rFonts w:ascii="Georgia" w:hAnsi="Georgia"/>
-              </w:rPr>
-            </w:r>
-          </w:p>
-        </w:tc>
-        <w:tc>
-          <w:tcPr/>
-          <w:p>
-            <w:pPr>
-              <w:spacing w:before="0" w:after="0" w:line="240" w:lineRule="auto"/>
-              <w:jc w:val="both"/>
-              <w:rPr/>
-            </w:pPr>
-            <w:r>
-              <w:rPr>
-                <w:rFonts w:ascii="Georgia" w:hAnsi="Georgia"/>
-                <w:sz w:val="20"/>
-                <w:szCs w:val="20"/>
-              </w:rPr>
-              <w:t xml:space="preserve">“</w:t>
-            </w:r>
-            <w:r>
-              <w:rPr>
-                <w:rFonts w:ascii="Georgia" w:hAnsi="Georgia"/>
-                <w:sz w:val="20"/>
-                <w:szCs w:val="20"/>
-                <w:shd w:val="clear" w:color="auto" w:fill="bfbfbf"/>
-              </w:rPr>
-              <w:t xml:space="preserve">was</w:t>
-            </w:r>
-            <w:r>
-              <w:rPr>
-                <w:rFonts w:ascii="Georgia" w:hAnsi="Georgia"/>
-                <w:sz w:val="20"/>
-                <w:szCs w:val="20"/>
-              </w:rPr>
-              <w:t xml:space="preserve"> [G] the most compelling…” (mark) vs “Yield higher (p &lt; .05)” (omit).</w:t>
-            </w:r>
-          </w:p>
-        </w:tc>
-      </w:tr>
-      <w:tr>
-        <w:trPr>
-          <w:tblHeader w:val="0"/>
-          <w:cantSplit/>
-        </w:trPr>
-        <w:tc>
-          <w:tcPr>
-            <w:shd w:fill="bfbfbf" w:val="clear"/>
-          </w:tcPr>
-          <w:p>
-            <w:pPr>
-              <w:spacing w:before="0" w:after="0" w:line="240" w:lineRule="auto"/>
-              <w:jc w:val="left"/>
-              <w:rPr/>
-            </w:pPr>
-            <w:r>
-              <w:rPr>
-                <w:rFonts w:ascii="Georgia" w:cs="Georgia" w:eastAsia="Georgia" w:hAnsi="Georgia"/>
-                <w:sz w:val="20"/>
-                <w:szCs w:val="20"/>
-                <w:rtl w:val="0"/>
-                <w:shd w:val="clear" w:color="auto" w:fill="bfbfbf"/>
-              </w:rPr>
-              <w:t xml:space="preserve">      </w:t>
-            </w:r>
-            <w:r>
-              <w:rPr>
-                <w:rtl w:val="0"/>
-                <w:sz w:val="20"/>
-                <w:szCs w:val="20"/>
-                <w:rFonts w:ascii="Georgia" w:hAnsi="Georgia"/>
-                <w:shd w:val="clear" w:color="auto" w:fill="bfbfbf"/>
-              </w:rPr>
-            </w:r>
-          </w:p>
-        </w:tc>
-        <w:tc>
-          <w:tcPr/>
-          <w:p>
-            <w:pPr>
-              <w:spacing w:before="0" w:after="0" w:line="240" w:lineRule="auto"/>
-              <w:jc w:val="both"/>
-              <w:rPr/>
-            </w:pPr>
-            <w:r>
-              <w:rPr>
-                <w:rFonts w:ascii="Georgia" w:cs="Georgia" w:eastAsia="Georgia" w:hAnsi="Georgia"/>
-                <w:sz w:val="20"/>
-                <w:szCs w:val="20"/>
-                <w:rtl w:val="0"/>
-              </w:rPr>
-              <w:t xml:space="preserve">Generalization [G]</w:t>
-            </w:r>
-            <w:r>
-              <w:rPr>
-                <w:rtl w:val="0"/>
-                <w:sz w:val="20"/>
-                <w:szCs w:val="20"/>
-                <w:rFonts w:ascii="Georgia" w:hAnsi="Georgia"/>
-              </w:rPr>
-            </w:r>
-          </w:p>
-        </w:tc>
-        <w:tc>
-          <w:tcPr/>
-          <w:p>
-            <w:pPr>
-              <w:spacing w:before="0" w:after="0" w:line="240" w:lineRule="auto"/>
-              <w:jc w:val="both"/>
-              <w:rPr/>
-            </w:pPr>
-            <w:r>
-              <w:rPr>
-                <w:rFonts w:ascii="Georgia" w:cs="Georgia" w:eastAsia="Georgia" w:hAnsi="Georgia"/>
-                <w:sz w:val="20"/>
-                <w:szCs w:val="20"/>
-                <w:rtl w:val="0"/>
-              </w:rPr>
-              <w:t xml:space="preserve">Inference or ranking beyond the data.</w:t>
-            </w:r>
-            <w:r>
-              <w:rPr>
-                <w:rtl w:val="0"/>
-                <w:sz w:val="20"/>
-                <w:szCs w:val="20"/>
-                <w:rFonts w:ascii="Georgia" w:hAnsi="Georgia"/>
-              </w:rPr>
-            </w:r>
-          </w:p>
-        </w:tc>
-        <w:tc>
-          <w:tcPr/>
-          <w:p>
-            <w:pPr>
-              <w:spacing w:before="0" w:after="0" w:line="240" w:lineRule="auto"/>
-              <w:jc w:val="both"/>
-              <w:rPr/>
-            </w:pPr>
-            <w:r>
-              <w:rPr>
-                <w:rFonts w:ascii="Georgia" w:hAnsi="Georgia"/>
-                <w:sz w:val="20"/>
-                <w:szCs w:val="20"/>
-              </w:rPr>
-              <w:t xml:space="preserve">“This </w:t>
-            </w:r>
-            <w:r>
-              <w:rPr>
-                <w:rFonts w:ascii="Georgia" w:hAnsi="Georgia"/>
-                <w:sz w:val="20"/>
-                <w:szCs w:val="20"/>
-                <w:shd w:val="clear" w:color="auto" w:fill="bfbfbf"/>
-              </w:rPr>
-              <w:t xml:space="preserve">led</w:t>
-            </w:r>
-            <w:r>
-              <w:rPr>
-                <w:rFonts w:ascii="Georgia" w:hAnsi="Georgia"/>
-                <w:sz w:val="20"/>
-                <w:szCs w:val="20"/>
-              </w:rPr>
-              <w:t xml:space="preserve"> [G] to the conclusion that all farms were free of it.”</w:t>
-            </w:r>
-          </w:p>
-        </w:tc>
-      </w:tr>
-      <w:tr>
-        <w:trPr>
-          <w:tblHeader w:val="0"/>
-          <w:cantSplit/>
-        </w:trPr>
-        <w:tc>
-          <w:tcPr>
-            <w:shd w:fill="bfbfbf" w:val="clear"/>
-          </w:tcPr>
-          <w:p>
-            <w:pPr>
-              <w:spacing w:before="0" w:after="0" w:line="240" w:lineRule="auto"/>
-              <w:jc w:val="left"/>
-              <w:rPr/>
-            </w:pPr>
-            <w:r>
-              <w:rPr>
-                <w:rFonts w:ascii="Georgia" w:cs="Georgia" w:eastAsia="Georgia" w:hAnsi="Georgia"/>
-                <w:sz w:val="20"/>
-                <w:szCs w:val="20"/>
-                <w:rtl w:val="0"/>
-                <w:shd w:val="clear" w:color="auto" w:fill="bfbfbf"/>
-              </w:rPr>
-              <w:t xml:space="preserve">      </w:t>
-            </w:r>
-            <w:r>
-              <w:rPr>
-                <w:rtl w:val="0"/>
-                <w:sz w:val="20"/>
-                <w:szCs w:val="20"/>
-                <w:rFonts w:ascii="Georgia" w:hAnsi="Georgia"/>
-                <w:shd w:val="clear" w:color="auto" w:fill="bfbfbf"/>
-              </w:rPr>
-            </w:r>
-          </w:p>
-        </w:tc>
-        <w:tc>
-          <w:tcPr/>
-          <w:p>
-            <w:pPr>
-              <w:spacing w:before="0" w:after="0" w:line="240" w:lineRule="auto"/>
-              <w:jc w:val="both"/>
-              <w:rPr/>
-            </w:pPr>
-            <w:r>
-              <w:rPr>
-                <w:rFonts w:ascii="Georgia" w:cs="Georgia" w:eastAsia="Georgia" w:hAnsi="Georgia"/>
-                <w:sz w:val="20"/>
-                <w:szCs w:val="20"/>
-                <w:rtl w:val="0"/>
-              </w:rPr>
-              <w:t xml:space="preserve">Causal Claim [C]</w:t>
-            </w:r>
-            <w:r>
-              <w:rPr>
-                <w:rtl w:val="0"/>
-                <w:sz w:val="20"/>
-                <w:szCs w:val="20"/>
-                <w:rFonts w:ascii="Georgia" w:hAnsi="Georgia"/>
-              </w:rPr>
-            </w:r>
-          </w:p>
-        </w:tc>
-        <w:tc>
-          <w:tcPr/>
-          <w:p>
-            <w:pPr>
-              <w:spacing w:before="0" w:after="0" w:line="240" w:lineRule="auto"/>
-              <w:jc w:val="both"/>
-              <w:rPr/>
-            </w:pPr>
-            <w:r>
-              <w:rPr>
-                <w:rFonts w:ascii="Georgia" w:cs="Georgia" w:eastAsia="Georgia" w:hAnsi="Georgia"/>
-                <w:sz w:val="20"/>
-                <w:szCs w:val="20"/>
-                <w:rtl w:val="0"/>
-              </w:rPr>
-              <w:t xml:space="preserve">Cause–effect stated as established.</w:t>
-            </w:r>
-            <w:r>
-              <w:rPr>
-                <w:rtl w:val="0"/>
-                <w:sz w:val="20"/>
-                <w:szCs w:val="20"/>
-                <w:rFonts w:ascii="Georgia" w:hAnsi="Georgia"/>
-              </w:rPr>
-            </w:r>
-          </w:p>
-        </w:tc>
-        <w:tc>
-          <w:tcPr/>
-          <w:p>
-            <w:pPr>
-              <w:spacing w:before="0" w:after="0" w:line="240" w:lineRule="auto"/>
-              <w:jc w:val="both"/>
-              <w:rPr/>
-            </w:pPr>
-            <w:r>
-              <w:rPr>
-                <w:rFonts w:ascii="Georgia" w:hAnsi="Georgia"/>
-                <w:sz w:val="20"/>
-                <w:szCs w:val="20"/>
-              </w:rPr>
-              <w:t xml:space="preserve">“Extracts </w:t>
-            </w:r>
-            <w:r>
-              <w:rPr>
-                <w:rFonts w:ascii="Georgia" w:hAnsi="Georgia"/>
-                <w:sz w:val="20"/>
-                <w:szCs w:val="20"/>
-                <w:shd w:val="clear" w:color="auto" w:fill="bfbfbf"/>
-              </w:rPr>
-              <w:t xml:space="preserve">produce</w:t>
-            </w:r>
-            <w:r>
-              <w:rPr>
-                <w:rFonts w:ascii="Georgia" w:hAnsi="Georgia"/>
-                <w:sz w:val="20"/>
-                <w:szCs w:val="20"/>
-              </w:rPr>
-              <w:t xml:space="preserve"> [C] comparable staining because they contain similar compounds.”</w:t>
-            </w:r>
-          </w:p>
-        </w:tc>
-      </w:tr>
-    </w:tbl>
     <w:p>
       <w:pPr>
         <w:spacing w:line="240" w:lineRule="auto" w:before="0" w:after="0"/>

</xml_diff>

<commit_message>
Draft_088: stop Appendix A tables forcing new pages after remaining space
</commit_message>
<xml_diff>
--- a/thesis/003_ThesisProposal_Draft_088.docx
+++ b/thesis/003_ThesisProposal_Draft_088.docx
@@ -12260,7 +12260,6 @@
     </w:p>
     <w:p>
       <w:pPr>
-        <w:keepNext w:val="1"/>
         <w:spacing w:before="60" w:after="40" w:line="220" w:lineRule="auto"/>
         <w:jc w:val="left"/>
         <w:rPr/>
@@ -12302,7 +12301,6 @@
     </w:p>
     <w:p>
       <w:pPr>
-        <w:keepNext w:val="1"/>
         <w:spacing w:before="60" w:after="40" w:line="220" w:lineRule="auto"/>
         <w:jc w:val="left"/>
         <w:rPr/>
@@ -12353,7 +12351,6 @@
     </w:p>
     <w:p>
       <w:pPr>
-        <w:keepNext w:val="1"/>
         <w:spacing w:before="20" w:after="20" w:line="220" w:lineRule="auto"/>
         <w:jc w:val="left"/>
         <w:rPr/>
@@ -12484,7 +12481,6 @@
     </w:p>
     <w:p>
       <w:pPr>
-        <w:keepNext w:val="1"/>
         <w:spacing w:before="20" w:after="20" w:line="220" w:lineRule="auto"/>
         <w:jc w:val="left"/>
         <w:rPr/>
@@ -12588,7 +12584,6 @@
     </w:p>
     <w:p>
       <w:pPr>
-        <w:keepNext w:val="1"/>
         <w:spacing w:before="20" w:after="20" w:line="220" w:lineRule="auto"/>
         <w:jc w:val="left"/>
         <w:rPr/>
@@ -12734,7 +12729,6 @@
     </w:p>
     <w:p>
       <w:pPr>
-        <w:keepNext w:val="1"/>
         <w:spacing w:before="20" w:after="20" w:line="220" w:lineRule="auto"/>
         <w:jc w:val="left"/>
         <w:rPr/>
@@ -12793,7 +12787,6 @@
     </w:p>
     <w:p>
       <w:pPr>
-        <w:keepNext w:val="1"/>
         <w:spacing w:before="60" w:after="40" w:line="220" w:lineRule="auto"/>
         <w:jc w:val="left"/>
         <w:rPr/>
@@ -12819,7 +12812,6 @@
     </w:p>
     <w:p>
       <w:pPr>
-        <w:keepNext w:val="1"/>
         <w:spacing w:before="20" w:after="20" w:line="220" w:lineRule="auto"/>
         <w:ind w:firstLine="720"/>
         <w:jc w:val="both"/>
@@ -12873,7 +12865,6 @@
       </w:tblGrid>
       <w:tr>
         <w:trPr>
-          <w:cantSplit/>
           <w:tblHeader/>
         </w:trPr>
         <w:tc>
@@ -12948,7 +12939,6 @@
       <w:tr>
         <w:trPr>
           <w:tblHeader w:val="0"/>
-          <w:cantSplit/>
         </w:trPr>
         <w:tc>
           <w:tcPr/>
@@ -13245,7 +13235,6 @@
       <w:tr>
         <w:trPr>
           <w:tblHeader w:val="0"/>
-          <w:cantSplit/>
         </w:trPr>
         <w:tc>
           <w:tcPr/>
@@ -13382,7 +13371,6 @@
     </w:tbl>
     <w:p>
       <w:pPr>
-        <w:keepNext w:val="1"/>
         <w:spacing w:before="20" w:after="20" w:line="220" w:lineRule="auto"/>
         <w:jc w:val="left"/>
         <w:rPr/>
@@ -13708,8 +13696,6 @@
     </w:p>
     <w:p>
       <w:pPr>
-        <w:pageBreakBefore/>
-        <w:keepNext w:val="1"/>
         <w:spacing w:before="0" w:after="60" w:line="276" w:lineRule="auto"/>
         <w:jc w:val="left"/>
         <w:rPr/>
@@ -13736,7 +13722,6 @@
     </w:p>
     <w:p>
       <w:pPr>
-        <w:keepNext w:val="1"/>
         <w:spacing w:before="120" w:after="60" w:line="360" w:lineRule="auto"/>
         <w:jc w:val="left"/>
         <w:rPr/>
@@ -13786,7 +13771,6 @@
     </w:p>
     <w:p>
       <w:pPr>
-        <w:keepNext w:val="1"/>
         <w:spacing w:before="120" w:after="60" w:line="360" w:lineRule="auto"/>
         <w:jc w:val="left"/>
         <w:rPr/>
@@ -14256,7 +14240,6 @@
     </w:p>
     <w:p>
       <w:pPr>
-        <w:keepNext w:val="1"/>
         <w:spacing w:before="60" w:after="20" w:line="360" w:lineRule="auto"/>
         <w:jc w:val="left"/>
         <w:rPr/>
@@ -14282,7 +14265,6 @@
     </w:p>
     <w:p>
       <w:pPr>
-        <w:keepNext w:val="1"/>
         <w:spacing w:before="80" w:after="40" w:line="360" w:lineRule="auto"/>
         <w:ind w:firstLine="720"/>
         <w:jc w:val="both"/>
@@ -14340,7 +14322,6 @@
       </w:tblGrid>
       <w:tr>
         <w:trPr>
-          <w:cantSplit/>
           <w:tblHeader/>
         </w:trPr>
         <w:tc>
@@ -14481,9 +14462,7 @@
         </w:tc>
       </w:tr>
       <w:tr>
-        <w:trPr>
-          <w:cantSplit/>
-        </w:trPr>
+        <w:trPr/>
         <w:tc>
           <w:tcPr>
             <w:shd w:fill="00b0f0" w:val="clear"/>
@@ -14630,9 +14609,7 @@
         </w:tc>
       </w:tr>
       <w:tr>
-        <w:trPr>
-          <w:cantSplit/>
-        </w:trPr>
+        <w:trPr/>
         <w:tc>
           <w:tcPr>
             <w:shd w:fill="ff0000" w:val="clear"/>
@@ -14779,9 +14756,7 @@
         </w:tc>
       </w:tr>
       <w:tr>
-        <w:trPr>
-          <w:cantSplit/>
-        </w:trPr>
+        <w:trPr/>
         <w:tc>
           <w:tcPr>
             <w:shd w:fill="ffff00" w:val="clear"/>
@@ -14928,9 +14903,7 @@
         </w:tc>
       </w:tr>
       <w:tr>
-        <w:trPr>
-          <w:cantSplit/>
-        </w:trPr>
+        <w:trPr/>
         <w:tc>
           <w:tcPr>
             <w:shd w:fill="00b050" w:val="clear"/>
@@ -15079,7 +15052,6 @@
     </w:tbl>
     <w:p>
       <w:pPr>
-        <w:keepNext w:val="1"/>
         <w:spacing w:before="60" w:after="60" w:line="360" w:lineRule="auto"/>
         <w:ind/>
         <w:jc w:val="both"/>
@@ -15133,7 +15105,6 @@
     </w:p>
     <w:p>
       <w:pPr>
-        <w:keepNext w:val="1"/>
         <w:spacing w:before="20" w:after="20" w:line="360" w:lineRule="auto"/>
         <w:ind w:left="360" w:hanging="360"/>
         <w:jc w:val="both"/>
@@ -15324,7 +15295,6 @@
     </w:p>
     <w:p>
       <w:pPr>
-        <w:keepNext w:val="1"/>
         <w:spacing w:before="20" w:after="20" w:line="360" w:lineRule="auto"/>
         <w:jc w:val="left"/>
         <w:rPr/>
@@ -15381,7 +15351,6 @@
       </w:tblGrid>
       <w:tr>
         <w:trPr>
-          <w:cantSplit/>
           <w:tblHeader/>
         </w:trPr>
         <w:tc>
@@ -15524,7 +15493,6 @@
       <w:tr>
         <w:trPr>
           <w:tblHeader w:val="0"/>
-          <w:cantSplit/>
         </w:trPr>
         <w:tc>
           <w:tcPr/>
@@ -15704,7 +15672,6 @@
       <w:tr>
         <w:trPr>
           <w:tblHeader w:val="0"/>
-          <w:cantSplit/>
         </w:trPr>
         <w:tc>
           <w:tcPr/>
@@ -15884,7 +15851,6 @@
       <w:tr>
         <w:trPr>
           <w:tblHeader w:val="0"/>
-          <w:cantSplit/>
         </w:trPr>
         <w:tc>
           <w:tcPr/>
@@ -16064,7 +16030,6 @@
     </w:tbl>
     <w:p>
       <w:pPr>
-        <w:keepNext w:val="1"/>
         <w:spacing w:before="120" w:after="60" w:line="360" w:lineRule="auto"/>
         <w:jc w:val="left"/>
         <w:rPr/>
@@ -16090,7 +16055,6 @@
     </w:p>
     <w:p>
       <w:pPr>
-        <w:keepNext w:val="1"/>
         <w:spacing w:before="0" w:after="0" w:line="360" w:lineRule="auto"/>
         <w:ind w:firstLine="720"/>
         <w:jc w:val="both"/>
@@ -16146,7 +16110,6 @@
       </w:tblGrid>
       <w:tr>
         <w:trPr>
-          <w:cantSplit/>
           <w:tblHeader/>
         </w:trPr>
         <w:tc>
@@ -16255,7 +16218,6 @@
       <w:tr>
         <w:trPr>
           <w:tblHeader w:val="0"/>
-          <w:cantSplit/>
         </w:trPr>
         <w:tc>
           <w:tcPr/>
@@ -16347,7 +16309,6 @@
       <w:tr>
         <w:trPr>
           <w:tblHeader w:val="0"/>
-          <w:cantSplit/>
         </w:trPr>
         <w:tc>
           <w:tcPr/>
@@ -16439,7 +16400,6 @@
       <w:tr>
         <w:trPr>
           <w:tblHeader w:val="0"/>
-          <w:cantSplit/>
         </w:trPr>
         <w:tc>
           <w:tcPr/>
@@ -16531,7 +16491,6 @@
       <w:tr>
         <w:trPr>
           <w:tblHeader w:val="0"/>
-          <w:cantSplit/>
         </w:trPr>
         <w:tc>
           <w:tcPr/>
@@ -16623,7 +16582,6 @@
       <w:tr>
         <w:trPr>
           <w:tblHeader w:val="0"/>
-          <w:cantSplit/>
         </w:trPr>
         <w:tc>
           <w:tcPr/>
@@ -16715,7 +16673,6 @@
       <w:tr>
         <w:trPr>
           <w:tblHeader w:val="0"/>
-          <w:cantSplit/>
         </w:trPr>
         <w:tc>
           <w:tcPr/>
@@ -16807,7 +16764,6 @@
       <w:tr>
         <w:trPr>
           <w:tblHeader w:val="0"/>
-          <w:cantSplit/>
         </w:trPr>
         <w:tc>
           <w:tcPr/>
@@ -16899,7 +16855,6 @@
       <w:tr>
         <w:trPr>
           <w:tblHeader w:val="0"/>
-          <w:cantSplit/>
         </w:trPr>
         <w:tc>
           <w:tcPr/>
@@ -17087,7 +17042,6 @@
     </w:p>
     <w:p>
       <w:pPr>
-        <w:keepNext w:val="1"/>
         <w:spacing w:before="120" w:after="60" w:line="360" w:lineRule="auto"/>
         <w:jc w:val="left"/>
         <w:rPr/>
@@ -17113,7 +17067,6 @@
     </w:p>
     <w:p>
       <w:pPr>
-        <w:keepNext w:val="1"/>
         <w:spacing w:before="0" w:after="0" w:line="360" w:lineRule="auto"/>
         <w:ind w:firstLine="720"/>
         <w:jc w:val="both"/>
@@ -17169,7 +17122,6 @@
       </w:tblGrid>
       <w:tr>
         <w:trPr>
-          <w:cantSplit/>
           <w:tblHeader/>
         </w:trPr>
         <w:tc>
@@ -17278,7 +17230,6 @@
       <w:tr>
         <w:trPr>
           <w:tblHeader w:val="0"/>
-          <w:cantSplit/>
         </w:trPr>
         <w:tc>
           <w:tcPr/>
@@ -17402,7 +17353,6 @@
       <w:tr>
         <w:trPr>
           <w:tblHeader w:val="0"/>
-          <w:cantSplit/>
         </w:trPr>
         <w:tc>
           <w:tcPr/>
@@ -17526,7 +17476,6 @@
       <w:tr>
         <w:trPr>
           <w:tblHeader w:val="0"/>
-          <w:cantSplit/>
         </w:trPr>
         <w:tc>
           <w:tcPr/>
@@ -17650,7 +17599,6 @@
       <w:tr>
         <w:trPr>
           <w:tblHeader w:val="0"/>
-          <w:cantSplit/>
         </w:trPr>
         <w:tc>
           <w:tcPr/>
@@ -17774,7 +17722,6 @@
       <w:tr>
         <w:trPr>
           <w:tblHeader w:val="0"/>
-          <w:cantSplit/>
         </w:trPr>
         <w:tc>
           <w:tcPr/>
@@ -17898,7 +17845,6 @@
     </w:tbl>
     <w:p>
       <w:pPr>
-        <w:keepNext w:val="1"/>
         <w:spacing w:before="120" w:after="60" w:line="360" w:lineRule="auto"/>
         <w:jc w:val="left"/>
         <w:rPr/>
@@ -17924,7 +17870,6 @@
     </w:p>
     <w:p>
       <w:pPr>
-        <w:keepNext w:val="1"/>
         <w:spacing w:before="0" w:after="0" w:line="360" w:lineRule="auto"/>
         <w:ind w:left="360" w:hanging="360"/>
         <w:jc w:val="both"/>
@@ -17947,7 +17892,6 @@
     </w:p>
     <w:p>
       <w:pPr>
-        <w:keepNext w:val="1"/>
         <w:spacing w:before="0" w:after="0" w:line="360" w:lineRule="auto"/>
         <w:ind w:left="360" w:hanging="360"/>
         <w:jc w:val="both"/>
@@ -17970,7 +17914,6 @@
     </w:p>
     <w:p>
       <w:pPr>
-        <w:keepNext w:val="1"/>
         <w:spacing w:before="0" w:after="0" w:line="360" w:lineRule="auto"/>
         <w:ind w:left="360" w:hanging="360"/>
         <w:jc w:val="both"/>
@@ -17993,7 +17936,6 @@
     </w:p>
     <w:p>
       <w:pPr>
-        <w:keepNext w:val="1"/>
         <w:spacing w:before="0" w:after="0" w:line="360" w:lineRule="auto"/>
         <w:ind w:left="360" w:hanging="360"/>
         <w:jc w:val="both"/>
@@ -18016,7 +17958,6 @@
     </w:p>
     <w:p>
       <w:pPr>
-        <w:keepNext w:val="1"/>
         <w:spacing w:before="0" w:after="0" w:line="360" w:lineRule="auto"/>
         <w:ind w:left="360" w:hanging="360"/>
         <w:jc w:val="both"/>
@@ -18039,7 +17980,6 @@
     </w:p>
     <w:p>
       <w:pPr>
-        <w:keepNext w:val="1"/>
         <w:spacing w:before="0" w:after="0" w:line="360" w:lineRule="auto"/>
         <w:ind w:left="360" w:hanging="360"/>
         <w:jc w:val="both"/>
@@ -18062,7 +18002,6 @@
     </w:p>
     <w:p>
       <w:pPr>
-        <w:keepNext w:val="1"/>
         <w:spacing w:before="0" w:after="0" w:line="240" w:lineRule="auto"/>
         <w:ind w:firstLine="720"/>
         <w:jc w:val="both"/>
@@ -18119,7 +18058,6 @@
       </w:tblGrid>
       <w:tr>
         <w:trPr>
-          <w:cantSplit/>
           <w:tblHeader/>
         </w:trPr>
         <w:tc>
@@ -18262,7 +18200,6 @@
       <w:tr>
         <w:trPr>
           <w:tblHeader w:val="0"/>
-          <w:cantSplit/>
         </w:trPr>
         <w:tc>
           <w:tcPr>
@@ -18388,7 +18325,6 @@
       <w:tr>
         <w:trPr>
           <w:tblHeader w:val="0"/>
-          <w:cantSplit/>
         </w:trPr>
         <w:tc>
           <w:tcPr>
@@ -18514,7 +18450,6 @@
       <w:tr>
         <w:trPr>
           <w:tblHeader w:val="0"/>
-          <w:cantSplit/>
         </w:trPr>
         <w:tc>
           <w:tcPr>
@@ -18640,7 +18575,6 @@
     </w:tbl>
     <w:p>
       <w:pPr>
-        <w:keepNext w:val="1"/>
         <w:spacing w:before="40" w:after="20" w:line="276" w:lineRule="auto"/>
         <w:jc w:val="left"/>
         <w:rPr/>
@@ -18701,7 +18635,6 @@
       </w:tblGrid>
       <w:tr>
         <w:trPr>
-          <w:cantSplit/>
           <w:tblHeader/>
         </w:trPr>
         <w:tc>
@@ -18912,7 +18845,6 @@
       <w:tr>
         <w:trPr>
           <w:tblHeader w:val="0"/>
-          <w:cantSplit/>
         </w:trPr>
         <w:tc>
           <w:tcPr/>
@@ -19115,7 +19047,6 @@
       </w:tblGrid>
       <w:tr>
         <w:trPr>
-          <w:cantSplit/>
           <w:tblHeader/>
         </w:trPr>
         <w:tc>
@@ -19326,7 +19257,6 @@
       <w:tr>
         <w:trPr>
           <w:tblHeader w:val="0"/>
-          <w:cantSplit/>
         </w:trPr>
         <w:tc>
           <w:tcPr/>
@@ -19533,7 +19463,6 @@
       </w:tblGrid>
       <w:tr>
         <w:trPr>
-          <w:cantSplit/>
           <w:tblHeader/>
         </w:trPr>
         <w:tc>
@@ -19812,7 +19741,6 @@
       <w:tr>
         <w:trPr>
           <w:tblHeader w:val="0"/>
-          <w:cantSplit/>
         </w:trPr>
         <w:tc>
           <w:tcPr/>
@@ -20034,7 +19962,6 @@
     </w:tbl>
     <w:p>
       <w:pPr>
-        <w:keepNext w:val="1"/>
         <w:spacing w:before="20" w:after="20" w:line="276" w:lineRule="auto"/>
         <w:ind w:firstLine="720"/>
         <w:jc w:val="both"/>
@@ -20115,7 +20042,6 @@
     </w:p>
     <w:p>
       <w:pPr>
-        <w:keepNext w:val="1"/>
         <w:spacing w:before="20" w:after="20" w:line="276" w:lineRule="auto"/>
         <w:jc w:val="left"/>
         <w:rPr/>
@@ -20149,11 +20075,9 @@
     </w:p>
     <w:p>
       <w:pPr>
-        <w:keepNext w:val="1"/>
         <w:spacing w:before="120" w:after="0" w:line="480" w:lineRule="auto"/>
         <w:jc w:val="left"/>
         <w:rPr/>
-        <w:pageBreakBefore/>
       </w:pPr>
       <w:r>
         <w:rPr>

</xml_diff>

<commit_message>
Draft_088: apply Carlo De Dios tracked edits (SOP, contradiction, Definition of Terms)
</commit_message>
<xml_diff>
--- a/thesis/003_ThesisProposal_Draft_088.docx
+++ b/thesis/003_ThesisProposal_Draft_088.docx
@@ -528,7 +528,7 @@
           <w:sz w:val="24"/>
           <w:szCs w:val="24"/>
         </w:rPr>
-        <w:t>Field norms shape expert hedging, but not along a simple hard/soft divide. Comparative work places humanities writers at the high end of hedge frequency and agriculture near the low end in one multi-field design (Afshar et al., 2014), while other pairings find scientists hedging more than applied linguists (Mohammed, 2011). Within life sciences, biology research articles often favor non-factive reporting verbs as the main hedge type (Souici &amp; Slougui, 2022), and clinical writing may edge slightly above basic science within medicine without a strong statistical separation (Hamidi et al., 2025). The mixed directions matter less as contradiction than as evidence that density tracks specific epistemic demands and coding choices rather than a single hard/soft divide.</w:t>
+        <w:t>Field norms shape expert hedging, but not along a simple hard/soft divide. Comparative work places humanities writers at the high end of hedge frequency and agriculture near the low end in one multi-field design (Afshar et al., 2014), while other pairings find scientists hedging more than applied linguists (Mohammed, 2011). Within life sciences, biology research articles often favor non-factive reporting verbs as the main hedge type (Souici &amp; Slougui, 2022), and clinical writing may edge slightly above basic science within medicine without a strong statistical separation (Hamidi et al., 2025). The mixed directions matter less as a contradiction than as evidence that density tracks specific epistemic demands and coding choices rather than a single hard/soft divide.</w:t>
       </w:r>
     </w:p>
     <w:p>
@@ -820,7 +820,7 @@
           <w:szCs w:val="22"/>
           <w:rtl w:val="0"/>
         </w:rPr>
-        <w:t xml:space="preserve">This study mapped hedging patterns in undergraduate thesis abstracts from Agriculture, Veterinary Medicine, and Biology at PSAU. It asks:</w:t>
+        <w:t xml:space="preserve">This study mapped hedging patterns in undergraduate thesis abstracts from Agriculture, Veterinary Medicine, and Biology at PSAU. Specifically, it asked the following questions:</w:t>
       </w:r>
       <w:r>
         <w:rPr>
@@ -1567,7 +1567,7 @@
           <w:b w:val="0"/>
           <w:bCs w:val="0"/>
         </w:rPr>
-        <w:t xml:space="preserve"> conceptually, an abstract is a concise, self-contained summary of a research work. Operationally, this refers to the complete English-language summary section of undergraduate theses archived in the PSAU institutional repository from 2023 to 2025. It contains research objectives, methods, results, and conclusions.</w:t>
+        <w:t xml:space="preserve"> conceptually, is a concise, self-contained summary of a research work. Operationally, this refers to the complete English-language summary section of undergraduate theses archived in the PSAU institutional repository from 2023 to 2025. It contains research objectives, methods, results, and conclusions.</w:t>
       </w:r>
     </w:p>
     <w:p>
@@ -1593,7 +1593,7 @@
           <w:b w:val="0"/>
           <w:bCs w:val="0"/>
         </w:rPr>
-        <w:t xml:space="preserve"> conceptually, adverbial hedges are adverbs or adverbial expressions that qualify the scope, frequency, or certainty of a proposition. Operationally, these include generally, typically, possibly, probably, relatively, and essentially. These are coded in this study when they restrict the generalizability of a claim rather than describe a procedural norm.</w:t>
+        <w:t xml:space="preserve"> conceptually, are adverbs or adverbial expressions that qualify the scope, frequency, or certainty of a proposition. Operationally, these include generally, typically, possibly, probably, relatively, and essentially. These are coded in this study when they restrict the generalizability of a claim rather than describe a procedural norm.</w:t>
       </w:r>
     </w:p>
     <w:p>
@@ -1619,7 +1619,7 @@
           <w:b w:val="0"/>
           <w:bCs w:val="0"/>
         </w:rPr>
-        <w:t xml:space="preserve"> conceptually, applied life sciences refer to disciplines that apply scientific knowledge to the study and management of living organisms and biological systems. Operationally, this refers to the three specific undergraduate programs at PSAU included in the study: Agriculture, Biology, and Veterinary Medicine.</w:t>
+        <w:t xml:space="preserve"> conceptually, refer to disciplines that apply scientific knowledge to the study and management of living organisms and biological systems. Operationally, this refers to the three specific undergraduate programs at PSAU included in the study: Agriculture, Biology, and Veterinary Medicine.</w:t>
       </w:r>
     </w:p>
     <w:p>
@@ -1645,7 +1645,7 @@
           <w:b w:val="0"/>
           <w:bCs w:val="0"/>
         </w:rPr>
-        <w:t xml:space="preserve"> conceptually, claim responsibility refers to the epistemic obligation a writer accepts for the accuracy, truth, or limitations of a statement (Salager-Meyer, 1994). Writers use hedges to distribute this responsibility between themselves, their data, or external factors. Operationally, this serves as the interpretive lens for analyzing why specific hedges were chosen in the abstracts.</w:t>
+        <w:t xml:space="preserve"> conceptually, refers to the epistemic obligation a writer accepts for the accuracy, truth, or limitations of a statement (Salager-Meyer, 1994). Writers use hedges to distribute this responsibility between themselves, their data, or external factors. Operationally, this serves as the interpretive lens for analyzing why specific hedges were chosen in the abstracts.</w:t>
       </w:r>
     </w:p>
     <w:p>
@@ -1671,7 +1671,7 @@
           <w:b w:val="0"/>
           <w:bCs w:val="0"/>
         </w:rPr>
-        <w:t xml:space="preserve"> conceptually, a chi-square test of independence evaluates whether two categorical variables are associated. Operationally, this study used it to test the association between discipline and zero-hedge status (zero vs. nonzero). The test statistic is χ² = Σ [(Oᵢ − Eᵢ)² / Eᵢ], where Oᵢ is the observed frequency in cell i and Eᵢ is the expected frequency under independence. Degrees of freedom = (rows − 1) × (columns − 1). The reported result was χ² = 5.07, df = 2, p = .079.</w:t>
+        <w:t xml:space="preserve"> conceptually, evaluates whether two categorical variables are associated. Operationally, this study used it to test the association between discipline and zero-hedge status (zero vs. nonzero). The test statistic is χ² = Σ [(Oᵢ − Eᵢ)² / Eᵢ], where Oᵢ is the observed frequency in cell i and Eᵢ is the expected frequency under independence. Degrees of freedom = (rows − 1) × (columns − 1). The reported result was χ² = 5.07, df = 2, p = .079.</w:t>
       </w:r>
     </w:p>
     <w:p>
@@ -1697,7 +1697,7 @@
           <w:b w:val="0"/>
           <w:bCs w:val="0"/>
         </w:rPr>
-        <w:t xml:space="preserve"> conceptually, clause-level hedges are syntactic structures that frame a proposition as tentative, approximate, or subject to qualification. Operationally, these include expressions such as it seems that, it is possible that, to some extent, and in our view. These are coded in this study when the entire clause functions to express the writer’s epistemic reservation about the following or embedded proposition.</w:t>
+        <w:t xml:space="preserve"> conceptually, are syntactic structures that frame a proposition as tentative, approximate, or subject to qualification. Operationally, these include expressions such as it seems that, it is possible that, to some extent, and in our view. These are coded in this study when the entire clause functions to express the writer’s epistemic reservation about the following or embedded proposition.</w:t>
       </w:r>
     </w:p>
     <w:p>
@@ -1723,7 +1723,7 @@
           <w:b w:val="0"/>
           <w:bCs w:val="0"/>
         </w:rPr>
-        <w:t xml:space="preserve"> conceptually, Cohen’s kappa measures inter- or intra-rater agreement for categorical coding beyond chance. Operationally, this study used it for intra-rater reliability on a second pass of six abstracts. The formula is κ = (Pₒ − Pₑ) / (1 − Pₑ), where Pₒ is the observed proportion of agreement and Pₑ is the expected agreement by chance. Landis and Koch (1977) interpret κ values as: &lt;0.00 poor, 0.00–0.20 slight, 0.21–0.40 fair, 0.41–0.60 moderate, 0.61–0.80 substantial, 0.81–1.00 almost perfect. The intra-rater result was κ = 0.89.</w:t>
+        <w:t xml:space="preserve"> conceptually, measures inter- or intra-rater agreement for categorical coding beyond chance. Operationally, this study used it for intra-rater reliability on a second pass of six abstracts. The formula is κ = (Pₒ − Pₑ) / (1 − Pₑ), where Pₒ is the observed proportion of agreement and Pₑ is the expected agreement by chance. Landis and Koch (1977) interpret κ values as: &lt;0.00 poor, 0.00–0.20 slight, 0.21–0.40 fair, 0.41–0.60 moderate, 0.61–0.80 substantial, 0.81–1.00 almost perfect. The intra-rater result was κ = 0.89.</w:t>
       </w:r>
     </w:p>
     <w:p>
@@ -1749,7 +1749,7 @@
           <w:b w:val="0"/>
           <w:bCs w:val="0"/>
         </w:rPr>
-        <w:t xml:space="preserve"> conceptually, corpus-assisted discourse analysis uses systematic text collections to identify linguistic patterns, combining quantitative frequency measures with qualitative functional interpretation. Operationally, this refers to the manual frequency counting, functional coding, and cross-disciplinary comparison of hedging devices across 60 PSAU thesis abstracts using a Google Sheets coding template.</w:t>
+        <w:t xml:space="preserve"> conceptually, uses systematic text collections to identify linguistic patterns, combining quantitative frequency measures with qualitative functional interpretation. Operationally, this refers to the manual frequency counting, functional coding, and cross-disciplinary comparison of hedging devices across 60 PSAU thesis abstracts using a Google Sheets coding template.</w:t>
       </w:r>
     </w:p>
     <w:p>
@@ -1775,7 +1775,7 @@
           <w:b w:val="0"/>
           <w:bCs w:val="0"/>
         </w:rPr>
-        <w:t xml:space="preserve"> conceptually, disciplinary variation refers to systematic differences in language use across academic fields arising from different epistemic norms, evidence types, and rhetorical conventions. Operationally, this refers to observable differences in hedging frequency, type, and function across Agriculture, Veterinary Medicine, and Biology abstracts in this corpus.</w:t>
+        <w:t xml:space="preserve"> conceptually, refers to systematic differences in language use across academic fields arising from different epistemic norms, evidence types, and rhetorical conventions. Operationally, this refers to observable differences in hedging frequency, type, and function across Agriculture, Veterinary Medicine, and Biology abstracts in this corpus.</w:t>
       </w:r>
     </w:p>
     <w:p>
@@ -1801,7 +1801,7 @@
           <w:b w:val="0"/>
           <w:bCs w:val="0"/>
         </w:rPr>
-        <w:t xml:space="preserve"> conceptually, epistemic stance refers to the linguistic expression of a writer’s degree of commitment to the truth, certainty, or reliability of a proposition. It signals the writer’s judgment about the status of the knowledge they are presenting. Operationally, this refers to the aggregate pattern of hedging devices used in an abstract. A high frequency of hedges indicates a cautious or tentative stance, while a low frequency or absence of hedges records fewer overt markers of caution. It does not by itself establish absolute commitment, especially where findings are binary or measured.</w:t>
+        <w:t xml:space="preserve"> conceptually, refers to the linguistic expression of a writer’s degree of commitment to the truth, certainty, or reliability of a proposition. It signals the writer’s judgment about the status of the knowledge they are presenting. Operationally, this refers to the aggregate pattern of hedging devices used in an abstract. A high frequency of hedges indicates a cautious or tentative stance, while a low frequency or absence of hedges records fewer overt markers of caution. It does not by itself establish absolute commitment, especially where findings are binary or measured.</w:t>
       </w:r>
     </w:p>
     <w:p>
@@ -1827,7 +1827,7 @@
           <w:b w:val="0"/>
           <w:bCs w:val="0"/>
         </w:rPr>
-        <w:t xml:space="preserve"> conceptually, epistemic weight is the strength of the writer’s commitment to the truth of a proposition (how certain or tentative the claim is). Operationally, a change in epistemic weight supports an EC function label at Step 3. Step 2 uses the broader force / directness test on knowledge claims (imposition only as interpersonal softening of a claim, not as a directive).</w:t>
+        <w:t xml:space="preserve"> conceptually, is the strength of the writer’s commitment to the truth of a proposition (how certain or tentative the claim is). Operationally, a change in epistemic weight supports an EC function label at Step 3. Step 2 uses the broader force / directness test on knowledge claims (imposition only as interpersonal softening of a claim, not as a directive).</w:t>
       </w:r>
     </w:p>
     <w:p>
@@ -1853,7 +1853,7 @@
           <w:b w:val="0"/>
           <w:bCs w:val="0"/>
         </w:rPr>
-        <w:t xml:space="preserve"> conceptually, hedge function refers to the rhetorical purpose a hedging device serves in its discourse context. Operationally, this refers to three categories adapted for this study from Hyland’s (1998) discussion of hedging functions (not a fixed published taxonomy). These are epistemic caution, which expresses uncertainty about a claim’s truth or accuracy, politeness, which shows deference to readers or prior research, and discourse organization, which structures text or manages reader expectations.</w:t>
+        <w:t xml:space="preserve"> conceptually, refers to the rhetorical purpose a hedging device serves in its discourse context. Operationally, this refers to three categories adapted for this study from Hyland’s (1998) discussion of hedging functions (not a fixed published taxonomy). These are epistemic caution, which expresses uncertainty about a claim’s truth or accuracy, politeness, which shows deference to readers or prior research, and discourse organization, which structures text or manages reader expectations.</w:t>
       </w:r>
     </w:p>
     <w:p>
@@ -1879,7 +1879,7 @@
           <w:b w:val="0"/>
           <w:bCs w:val="0"/>
         </w:rPr>
-        <w:t xml:space="preserve"> conceptually, hedging is the use of linguistic devices to express caution or tentativeness in academic writing, serving as a mechanism for managing claim responsibility (Salager-Meyer, 1994). Operationally, this refers to four device categories identified in the corpus following Hyland’s (1998) taxonomy. These categories are lexical hedges, modal verbs, adverbial hedges, and clause-level hedges.</w:t>
+        <w:t xml:space="preserve"> conceptually, is the use of linguistic devices to express caution or tentativeness in academic writing, serving as a mechanism for managing claim responsibility (Salager-Meyer, 1994). Operationally, this refers to four device categories identified in the corpus following Hyland’s (1998) taxonomy. These categories are lexical hedges, modal verbs, adverbial hedges, and clause-level hedges.</w:t>
       </w:r>
     </w:p>
     <w:p>
@@ -1905,7 +1905,7 @@
           <w:b w:val="0"/>
           <w:bCs w:val="0"/>
         </w:rPr>
-        <w:t xml:space="preserve"> conceptually, the Kruskal-Wallis test is a non-parametric rank-based alternative to one-way ANOVA for comparing distributions across three or more independent groups. Operationally, this study applied it to per-abstract hedge rates (hedges per 100 words) across the three disciplines. The test statistic is H = [12 / (N(N+1))] × Σ (Rⱼ² / nⱼ) − 3(N+1), where N is the total number of observations, nⱼ is the size of group j, and Rⱼ is the sum of ranks for group j. The reported result was H = 7.44, p = .024.</w:t>
+        <w:t xml:space="preserve"> conceptually, is a non-parametric rank-based alternative to one-way ANOVA for comparing distributions across three or more independent groups. Operationally, this study applied it to per-abstract hedge rates (hedges per 100 words) across the three disciplines. The test statistic is H = [12 / (N(N+1))] × Σ (Rⱼ² / nⱼ) − 3(N+1), where N is the total number of observations, nⱼ is the size of group j, and Rⱼ is the sum of ranks for group j. The reported result was H = 7.44, p = .024.</w:t>
       </w:r>
     </w:p>
     <w:p>
@@ -1931,7 +1931,7 @@
           <w:b w:val="0"/>
           <w:bCs w:val="0"/>
         </w:rPr>
-        <w:t xml:space="preserve"> conceptually, lexical hedges are verbs, adjectives, or nouns that introduce uncertainty or tentativeness at the propositional level. Operationally, these include verbs such as suggest, indicate, appear, and seem. They also include adjectives such as possible, probable, and likely, and nouns such as possibility and assumption. These are coded in this study when they express epistemic qualification of a claim rather than description or recommendation.</w:t>
+        <w:t xml:space="preserve"> conceptually, are verbs, adjectives, or nouns that introduce uncertainty or tentativeness at the propositional level. Operationally, these include verbs such as suggest, indicate, appear, and seem. They also include adjectives such as possible, probable, and likely, and nouns such as possibility and assumption. These are coded in this study when they express epistemic qualification of a claim rather than description or recommendation.</w:t>
       </w:r>
     </w:p>
     <w:p>
@@ -1957,7 +1957,7 @@
           <w:b w:val="0"/>
           <w:bCs w:val="0"/>
         </w:rPr>
-        <w:t xml:space="preserve"> conceptually, the Mann-Whitney U test (also called the Wilcoxon rank-sum test) is a non-parametric test that compares the distributions of a continuous or ordinal variable between two independent groups. Operationally, this study used it as a post hoc follow-up after the Kruskal-Wallis test, comparing per-abstract hedge rates (hedges per 100 words) for each pair of disciplines. The test statistic is U = n₁n₂ + [n₁(n₁+1)]/2 − R₁, where n₁ and n₂ are the sample sizes of the two groups and R₁ is the sum of ranks for group 1. A Bonferroni correction for three pairwise tests set α = .017. The reported results were Veterinary Medicine versus Biology p = .011, Veterinary Medicine versus Agriculture p = .034, and Agriculture versus Biology p = .72. Only the Biology–Veterinary Medicine contrast remained significant after correction.</w:t>
+        <w:t xml:space="preserve"> conceptually, is a non-parametric test that compares the distributions of a continuous or ordinal variable between two independent groups. Operationally, this study used it as a post hoc follow-up after the Kruskal-Wallis test, comparing per-abstract hedge rates (hedges per 100 words) for each pair of disciplines. The test statistic is U = n₁n₂ + [n₁(n₁+1)]/2 − R₁, where n₁ and n₂ are the sample sizes of the two groups and R₁ is the sum of ranks for group 1. A Bonferroni correction for three pairwise tests set α = .017. The reported results were Veterinary Medicine versus Biology p = .011, Veterinary Medicine versus Agriculture p = .034, and Agriculture versus Biology p = .72. Only the Biology–Veterinary Medicine contrast remained significant after correction.</w:t>
       </w:r>
     </w:p>
     <w:p>
@@ -1983,7 +1983,7 @@
           <w:b w:val="0"/>
           <w:bCs w:val="0"/>
         </w:rPr>
-        <w:t xml:space="preserve"> conceptually, modal verbs are auxiliary verbs that express degrees of possibility, probability, or conditionality. Operationally, these include may, might, could, would, should, and can. These are coded in this study when they signal epistemic uncertainty about a claim rather than capability, obligation, or future procedure.</w:t>
+        <w:t xml:space="preserve"> conceptually, are auxiliary verbs that express degrees of possibility, probability, or conditionality. Operationally, these include may, might, could, would, should, and can. These are coded in this study when they signal epistemic uncertainty about a claim rather than capability, obligation, or future procedure.</w:t>
       </w:r>
     </w:p>
     <w:p>
@@ -2009,7 +2009,7 @@
           <w:b w:val="0"/>
           <w:bCs w:val="0"/>
         </w:rPr>
-        <w:t xml:space="preserve"> conceptually, normalized frequency is a statistical method used to compare linguistic features across texts of different lengths by standardizing the count to a base unit. Operationally, this refers to the formula used in this study to compare hedge usage: Normalized Frequency = (Total Hedges / Total Word Count) x 100. For example, if an abstract contains 3 hedges and 258 words, the normalized frequency is (3/258) x 100 = 1.16 hedges per 100 words.</w:t>
+        <w:t xml:space="preserve"> conceptually, is a statistical method used to compare linguistic features across texts of different lengths by standardizing the count to a base unit. Operationally, this refers to the formula used in this study to compare hedge usage: Normalized Frequency = (Total Hedges / Total Word Count) x 100. For example, if an abstract contains 3 hedges and 258 words, the normalized frequency is (3/258) x 100 = 1.16 hedges per 100 words.</w:t>
       </w:r>
     </w:p>
     <w:p>
@@ -2087,7 +2087,7 @@
           <w:b w:val="0"/>
           <w:bCs w:val="0"/>
         </w:rPr>
-        <w:t xml:space="preserve"> conceptually, softening is the reduction of force, directness, imposition, or interpersonal impact in a statement. Operationally, Step 2 tracks softening of force or directness on knowledge claims (and interpersonal imposition on how claims are put forward). Step 3 labels retained hedges as epistemic (EC), interpersonal (P), and/or discourse-managing (DO) where co-occurrence applies. Directives remain excluded.</w:t>
+        <w:t xml:space="preserve"> conceptually, is the reduction of force, directness, imposition, or interpersonal impact in a statement. Operationally, Step 2 tracks softening of force or directness on knowledge claims (and interpersonal imposition on how claims are put forward). Step 3 labels retained hedges as epistemic (EC), interpersonal (P), and/or discourse-managing (DO) where co-occurrence applies. Directives remain excluded.</w:t>
       </w:r>
     </w:p>
     <w:p>

</xml_diff>

<commit_message>
Draft_088: uniform Georgia font per Thesis Companion (no table size changes)
</commit_message>
<xml_diff>
--- a/thesis/003_ThesisProposal_Draft_088.docx
+++ b/thesis/003_ThesisProposal_Draft_088.docx
@@ -592,7 +592,7 @@
       </w:pPr>
       <w:r>
         <w:rPr>
-          <w:rFonts w:ascii="Times New Roman" w:hAnsi="Times New Roman"/>
+          <w:rFonts w:ascii="Georgia" w:hAnsi="Georgia" w:cs="Georgia" w:eastAsia="Georgia"/>
           <w:sz w:val="24"/>
         </w:rPr>
         <w:t>English is the medium of academic writing at PSAU, but not the home language for most students. L2 writers typically use fewer hedges and less formal variety than L1 peers (Demir, 2018, and Mohammed, 2011), and publication context can amplify that gap: English-medium journal abstracts show markedly more hedges than Chinese-medium counterparts in the same field (Hu &amp; Cao, 2011). Explicit teaching can raise both frequency and variety among health-science undergraduates, though a preference for modals often remains even after training (Petchkij, 2019).</w:t>
@@ -11404,7 +11404,7 @@
       </w:pPr>
       <w:r>
         <w:rPr>
-          <w:rFonts w:ascii="Times New Roman" w:hAnsi="Times New Roman" w:eastAsia="Times New Roman"/>
+          <w:rFonts w:ascii="Georgia" w:hAnsi="Georgia" w:eastAsia="Georgia" w:cs="Georgia"/>
           <w:i w:val="0"/>
           <w:sz w:val="24"/>
         </w:rPr>
@@ -11412,7 +11412,7 @@
       </w:r>
       <w:r>
         <w:rPr>
-          <w:rFonts w:ascii="Times New Roman" w:hAnsi="Times New Roman" w:eastAsia="Times New Roman"/>
+          <w:rFonts w:ascii="Georgia" w:hAnsi="Georgia" w:eastAsia="Georgia" w:cs="Georgia"/>
           <w:i/>
           <w:sz w:val="24"/>
         </w:rPr>
@@ -11420,7 +11420,7 @@
       </w:r>
       <w:r>
         <w:rPr>
-          <w:rFonts w:ascii="Times New Roman" w:hAnsi="Times New Roman" w:eastAsia="Times New Roman"/>
+          <w:rFonts w:ascii="Georgia" w:hAnsi="Georgia" w:eastAsia="Georgia" w:cs="Georgia"/>
           <w:i w:val="0"/>
           <w:sz w:val="24"/>
         </w:rPr>
@@ -11436,7 +11436,7 @@
       </w:pPr>
       <w:r>
         <w:rPr>
-          <w:rFonts w:ascii="Times New Roman" w:hAnsi="Times New Roman" w:eastAsia="Times New Roman"/>
+          <w:rFonts w:ascii="Georgia" w:hAnsi="Georgia" w:eastAsia="Georgia" w:cs="Georgia"/>
           <w:i w:val="0"/>
           <w:sz w:val="24"/>
         </w:rPr>
@@ -11444,7 +11444,7 @@
       </w:r>
       <w:r>
         <w:rPr>
-          <w:rFonts w:ascii="Times New Roman" w:hAnsi="Times New Roman" w:eastAsia="Times New Roman"/>
+          <w:rFonts w:ascii="Georgia" w:hAnsi="Georgia" w:eastAsia="Georgia" w:cs="Georgia"/>
           <w:i/>
           <w:sz w:val="24"/>
         </w:rPr>
@@ -11452,7 +11452,7 @@
       </w:r>
       <w:r>
         <w:rPr>
-          <w:rFonts w:ascii="Times New Roman" w:hAnsi="Times New Roman" w:eastAsia="Times New Roman"/>
+          <w:rFonts w:ascii="Georgia" w:hAnsi="Georgia" w:eastAsia="Georgia" w:cs="Georgia"/>
           <w:i w:val="0"/>
           <w:sz w:val="24"/>
         </w:rPr>
@@ -11468,7 +11468,7 @@
       </w:pPr>
       <w:r>
         <w:rPr>
-          <w:rFonts w:ascii="Times New Roman" w:hAnsi="Times New Roman" w:eastAsia="Times New Roman"/>
+          <w:rFonts w:ascii="Georgia" w:hAnsi="Georgia" w:eastAsia="Georgia" w:cs="Georgia"/>
           <w:i w:val="0"/>
           <w:sz w:val="24"/>
         </w:rPr>
@@ -11476,7 +11476,7 @@
       </w:r>
       <w:r>
         <w:rPr>
-          <w:rFonts w:ascii="Times New Roman" w:hAnsi="Times New Roman" w:eastAsia="Times New Roman"/>
+          <w:rFonts w:ascii="Georgia" w:hAnsi="Georgia" w:eastAsia="Georgia" w:cs="Georgia"/>
           <w:i/>
           <w:sz w:val="24"/>
         </w:rPr>
@@ -11484,7 +11484,7 @@
       </w:r>
       <w:r>
         <w:rPr>
-          <w:rFonts w:ascii="Times New Roman" w:hAnsi="Times New Roman" w:eastAsia="Times New Roman"/>
+          <w:rFonts w:ascii="Georgia" w:hAnsi="Georgia" w:eastAsia="Georgia" w:cs="Georgia"/>
           <w:i w:val="0"/>
           <w:sz w:val="24"/>
         </w:rPr>
@@ -11500,7 +11500,7 @@
       </w:pPr>
       <w:r>
         <w:rPr>
-          <w:rFonts w:ascii="Times New Roman" w:hAnsi="Times New Roman" w:eastAsia="Times New Roman"/>
+          <w:rFonts w:ascii="Georgia" w:hAnsi="Georgia" w:eastAsia="Georgia" w:cs="Georgia"/>
           <w:i w:val="0"/>
           <w:sz w:val="24"/>
         </w:rPr>
@@ -11508,7 +11508,7 @@
       </w:r>
       <w:r>
         <w:rPr>
-          <w:rFonts w:ascii="Times New Roman" w:hAnsi="Times New Roman" w:eastAsia="Times New Roman"/>
+          <w:rFonts w:ascii="Georgia" w:hAnsi="Georgia" w:eastAsia="Georgia" w:cs="Georgia"/>
           <w:i/>
           <w:sz w:val="24"/>
         </w:rPr>
@@ -11516,7 +11516,7 @@
       </w:r>
       <w:r>
         <w:rPr>
-          <w:rFonts w:ascii="Times New Roman" w:hAnsi="Times New Roman" w:eastAsia="Times New Roman"/>
+          <w:rFonts w:ascii="Georgia" w:hAnsi="Georgia" w:eastAsia="Georgia" w:cs="Georgia"/>
           <w:i w:val="0"/>
           <w:sz w:val="24"/>
         </w:rPr>
@@ -11532,7 +11532,7 @@
       </w:pPr>
       <w:r>
         <w:rPr>
-          <w:rFonts w:ascii="Times New Roman" w:hAnsi="Times New Roman" w:eastAsia="Times New Roman"/>
+          <w:rFonts w:ascii="Georgia" w:hAnsi="Georgia" w:eastAsia="Georgia" w:cs="Georgia"/>
           <w:i w:val="0"/>
           <w:sz w:val="24"/>
         </w:rPr>
@@ -11540,7 +11540,7 @@
       </w:r>
       <w:r>
         <w:rPr>
-          <w:rFonts w:ascii="Times New Roman" w:hAnsi="Times New Roman" w:eastAsia="Times New Roman"/>
+          <w:rFonts w:ascii="Georgia" w:hAnsi="Georgia" w:eastAsia="Georgia" w:cs="Georgia"/>
           <w:i/>
           <w:sz w:val="24"/>
         </w:rPr>
@@ -11548,7 +11548,7 @@
       </w:r>
       <w:r>
         <w:rPr>
-          <w:rFonts w:ascii="Times New Roman" w:hAnsi="Times New Roman" w:eastAsia="Times New Roman"/>
+          <w:rFonts w:ascii="Georgia" w:hAnsi="Georgia" w:eastAsia="Georgia" w:cs="Georgia"/>
           <w:i w:val="0"/>
           <w:sz w:val="24"/>
         </w:rPr>
@@ -11564,7 +11564,7 @@
       </w:pPr>
       <w:r>
         <w:rPr>
-          <w:rFonts w:ascii="Times New Roman" w:hAnsi="Times New Roman" w:eastAsia="Times New Roman"/>
+          <w:rFonts w:ascii="Georgia" w:hAnsi="Georgia" w:eastAsia="Georgia" w:cs="Georgia"/>
           <w:i w:val="0"/>
           <w:sz w:val="24"/>
         </w:rPr>
@@ -11572,7 +11572,7 @@
       </w:r>
       <w:r>
         <w:rPr>
-          <w:rFonts w:ascii="Times New Roman" w:hAnsi="Times New Roman" w:eastAsia="Times New Roman"/>
+          <w:rFonts w:ascii="Georgia" w:hAnsi="Georgia" w:eastAsia="Georgia" w:cs="Georgia"/>
           <w:i/>
           <w:sz w:val="24"/>
         </w:rPr>
@@ -11580,7 +11580,7 @@
       </w:r>
       <w:r>
         <w:rPr>
-          <w:rFonts w:ascii="Times New Roman" w:hAnsi="Times New Roman" w:eastAsia="Times New Roman"/>
+          <w:rFonts w:ascii="Georgia" w:hAnsi="Georgia" w:eastAsia="Georgia" w:cs="Georgia"/>
           <w:i w:val="0"/>
           <w:sz w:val="24"/>
         </w:rPr>
@@ -11596,7 +11596,7 @@
       </w:pPr>
       <w:r>
         <w:rPr>
-          <w:rFonts w:ascii="Times New Roman" w:hAnsi="Times New Roman" w:eastAsia="Times New Roman"/>
+          <w:rFonts w:ascii="Georgia" w:hAnsi="Georgia" w:eastAsia="Georgia" w:cs="Georgia"/>
           <w:i w:val="0"/>
           <w:sz w:val="24"/>
         </w:rPr>
@@ -11604,7 +11604,7 @@
       </w:r>
       <w:r>
         <w:rPr>
-          <w:rFonts w:ascii="Times New Roman" w:hAnsi="Times New Roman" w:eastAsia="Times New Roman"/>
+          <w:rFonts w:ascii="Georgia" w:hAnsi="Georgia" w:eastAsia="Georgia" w:cs="Georgia"/>
           <w:i/>
           <w:sz w:val="24"/>
         </w:rPr>
@@ -11612,7 +11612,7 @@
       </w:r>
       <w:r>
         <w:rPr>
-          <w:rFonts w:ascii="Times New Roman" w:hAnsi="Times New Roman" w:eastAsia="Times New Roman"/>
+          <w:rFonts w:ascii="Georgia" w:hAnsi="Georgia" w:eastAsia="Georgia" w:cs="Georgia"/>
           <w:i w:val="0"/>
           <w:sz w:val="24"/>
         </w:rPr>
@@ -11628,7 +11628,7 @@
       </w:pPr>
       <w:r>
         <w:rPr>
-          <w:rFonts w:ascii="Times New Roman" w:hAnsi="Times New Roman" w:eastAsia="Times New Roman"/>
+          <w:rFonts w:ascii="Georgia" w:hAnsi="Georgia" w:eastAsia="Georgia" w:cs="Georgia"/>
           <w:i w:val="0"/>
           <w:sz w:val="24"/>
         </w:rPr>
@@ -11636,7 +11636,7 @@
       </w:r>
       <w:r>
         <w:rPr>
-          <w:rFonts w:ascii="Times New Roman" w:hAnsi="Times New Roman" w:eastAsia="Times New Roman"/>
+          <w:rFonts w:ascii="Georgia" w:hAnsi="Georgia" w:eastAsia="Georgia" w:cs="Georgia"/>
           <w:i/>
           <w:sz w:val="24"/>
         </w:rPr>
@@ -11644,7 +11644,7 @@
       </w:r>
       <w:r>
         <w:rPr>
-          <w:rFonts w:ascii="Times New Roman" w:hAnsi="Times New Roman" w:eastAsia="Times New Roman"/>
+          <w:rFonts w:ascii="Georgia" w:hAnsi="Georgia" w:eastAsia="Georgia" w:cs="Georgia"/>
           <w:i w:val="0"/>
           <w:sz w:val="24"/>
         </w:rPr>
@@ -11660,7 +11660,7 @@
       </w:pPr>
       <w:r>
         <w:rPr>
-          <w:rFonts w:ascii="Times New Roman" w:hAnsi="Times New Roman" w:eastAsia="Times New Roman"/>
+          <w:rFonts w:ascii="Georgia" w:hAnsi="Georgia" w:eastAsia="Georgia" w:cs="Georgia"/>
           <w:i w:val="0"/>
           <w:sz w:val="24"/>
         </w:rPr>
@@ -11668,7 +11668,7 @@
       </w:r>
       <w:r>
         <w:rPr>
-          <w:rFonts w:ascii="Times New Roman" w:hAnsi="Times New Roman" w:eastAsia="Times New Roman"/>
+          <w:rFonts w:ascii="Georgia" w:hAnsi="Georgia" w:eastAsia="Georgia" w:cs="Georgia"/>
           <w:i/>
           <w:sz w:val="24"/>
         </w:rPr>
@@ -11676,7 +11676,7 @@
       </w:r>
       <w:r>
         <w:rPr>
-          <w:rFonts w:ascii="Times New Roman" w:hAnsi="Times New Roman" w:eastAsia="Times New Roman"/>
+          <w:rFonts w:ascii="Georgia" w:hAnsi="Georgia" w:eastAsia="Georgia" w:cs="Georgia"/>
           <w:i w:val="0"/>
           <w:sz w:val="24"/>
         </w:rPr>
@@ -11692,7 +11692,7 @@
       </w:pPr>
       <w:r>
         <w:rPr>
-          <w:rFonts w:ascii="Times New Roman" w:hAnsi="Times New Roman" w:eastAsia="Times New Roman"/>
+          <w:rFonts w:ascii="Georgia" w:hAnsi="Georgia" w:eastAsia="Georgia" w:cs="Georgia"/>
           <w:i w:val="0"/>
           <w:sz w:val="24"/>
         </w:rPr>
@@ -11700,7 +11700,7 @@
       </w:r>
       <w:r>
         <w:rPr>
-          <w:rFonts w:ascii="Times New Roman" w:hAnsi="Times New Roman" w:eastAsia="Times New Roman"/>
+          <w:rFonts w:ascii="Georgia" w:hAnsi="Georgia" w:eastAsia="Georgia" w:cs="Georgia"/>
           <w:i/>
           <w:sz w:val="24"/>
         </w:rPr>
@@ -11708,7 +11708,7 @@
       </w:r>
       <w:r>
         <w:rPr>
-          <w:rFonts w:ascii="Times New Roman" w:hAnsi="Times New Roman" w:eastAsia="Times New Roman"/>
+          <w:rFonts w:ascii="Georgia" w:hAnsi="Georgia" w:eastAsia="Georgia" w:cs="Georgia"/>
           <w:i w:val="0"/>
           <w:sz w:val="24"/>
         </w:rPr>
@@ -11724,7 +11724,7 @@
       </w:pPr>
       <w:r>
         <w:rPr>
-          <w:rFonts w:ascii="Times New Roman" w:hAnsi="Times New Roman" w:eastAsia="Times New Roman"/>
+          <w:rFonts w:ascii="Georgia" w:hAnsi="Georgia" w:eastAsia="Georgia" w:cs="Georgia"/>
           <w:i w:val="0"/>
           <w:sz w:val="24"/>
         </w:rPr>
@@ -11732,7 +11732,7 @@
       </w:r>
       <w:r>
         <w:rPr>
-          <w:rFonts w:ascii="Times New Roman" w:hAnsi="Times New Roman" w:eastAsia="Times New Roman"/>
+          <w:rFonts w:ascii="Georgia" w:hAnsi="Georgia" w:eastAsia="Georgia" w:cs="Georgia"/>
           <w:i/>
           <w:sz w:val="24"/>
         </w:rPr>
@@ -11740,7 +11740,7 @@
       </w:r>
       <w:r>
         <w:rPr>
-          <w:rFonts w:ascii="Times New Roman" w:hAnsi="Times New Roman" w:eastAsia="Times New Roman"/>
+          <w:rFonts w:ascii="Georgia" w:hAnsi="Georgia" w:eastAsia="Georgia" w:cs="Georgia"/>
           <w:i w:val="0"/>
           <w:sz w:val="24"/>
         </w:rPr>
@@ -11756,7 +11756,7 @@
       </w:pPr>
       <w:r>
         <w:rPr>
-          <w:rFonts w:ascii="Times New Roman" w:hAnsi="Times New Roman" w:eastAsia="Times New Roman"/>
+          <w:rFonts w:ascii="Georgia" w:hAnsi="Georgia" w:eastAsia="Georgia" w:cs="Georgia"/>
           <w:i w:val="0"/>
           <w:sz w:val="24"/>
         </w:rPr>
@@ -11764,7 +11764,7 @@
       </w:r>
       <w:r>
         <w:rPr>
-          <w:rFonts w:ascii="Times New Roman" w:hAnsi="Times New Roman" w:eastAsia="Times New Roman"/>
+          <w:rFonts w:ascii="Georgia" w:hAnsi="Georgia" w:eastAsia="Georgia" w:cs="Georgia"/>
           <w:i/>
           <w:sz w:val="24"/>
         </w:rPr>
@@ -11772,7 +11772,7 @@
       </w:r>
       <w:r>
         <w:rPr>
-          <w:rFonts w:ascii="Times New Roman" w:hAnsi="Times New Roman" w:eastAsia="Times New Roman"/>
+          <w:rFonts w:ascii="Georgia" w:hAnsi="Georgia" w:eastAsia="Georgia" w:cs="Georgia"/>
           <w:i w:val="0"/>
           <w:sz w:val="24"/>
         </w:rPr>
@@ -11788,7 +11788,7 @@
       </w:pPr>
       <w:r>
         <w:rPr>
-          <w:rFonts w:ascii="Times New Roman" w:hAnsi="Times New Roman" w:eastAsia="Times New Roman"/>
+          <w:rFonts w:ascii="Georgia" w:hAnsi="Georgia" w:eastAsia="Georgia" w:cs="Georgia"/>
           <w:i w:val="0"/>
           <w:sz w:val="24"/>
         </w:rPr>
@@ -11796,7 +11796,7 @@
       </w:r>
       <w:r>
         <w:rPr>
-          <w:rFonts w:ascii="Times New Roman" w:hAnsi="Times New Roman" w:eastAsia="Times New Roman"/>
+          <w:rFonts w:ascii="Georgia" w:hAnsi="Georgia" w:eastAsia="Georgia" w:cs="Georgia"/>
           <w:i/>
           <w:sz w:val="24"/>
         </w:rPr>
@@ -11804,7 +11804,7 @@
       </w:r>
       <w:r>
         <w:rPr>
-          <w:rFonts w:ascii="Times New Roman" w:hAnsi="Times New Roman" w:eastAsia="Times New Roman"/>
+          <w:rFonts w:ascii="Georgia" w:hAnsi="Georgia" w:eastAsia="Georgia" w:cs="Georgia"/>
           <w:i w:val="0"/>
           <w:sz w:val="24"/>
         </w:rPr>
@@ -11820,7 +11820,7 @@
       </w:pPr>
       <w:r>
         <w:rPr>
-          <w:rFonts w:ascii="Times New Roman" w:hAnsi="Times New Roman" w:eastAsia="Times New Roman"/>
+          <w:rFonts w:ascii="Georgia" w:hAnsi="Georgia" w:eastAsia="Georgia" w:cs="Georgia"/>
           <w:i w:val="0"/>
           <w:sz w:val="24"/>
         </w:rPr>
@@ -11828,7 +11828,7 @@
       </w:r>
       <w:r>
         <w:rPr>
-          <w:rFonts w:ascii="Times New Roman" w:hAnsi="Times New Roman" w:eastAsia="Times New Roman"/>
+          <w:rFonts w:ascii="Georgia" w:hAnsi="Georgia" w:eastAsia="Georgia" w:cs="Georgia"/>
           <w:i/>
           <w:sz w:val="24"/>
         </w:rPr>
@@ -11836,7 +11836,7 @@
       </w:r>
       <w:r>
         <w:rPr>
-          <w:rFonts w:ascii="Times New Roman" w:hAnsi="Times New Roman" w:eastAsia="Times New Roman"/>
+          <w:rFonts w:ascii="Georgia" w:hAnsi="Georgia" w:eastAsia="Georgia" w:cs="Georgia"/>
           <w:i w:val="0"/>
           <w:sz w:val="24"/>
         </w:rPr>
@@ -11852,7 +11852,7 @@
       </w:pPr>
       <w:r>
         <w:rPr>
-          <w:rFonts w:ascii="Times New Roman" w:hAnsi="Times New Roman" w:eastAsia="Times New Roman"/>
+          <w:rFonts w:ascii="Georgia" w:hAnsi="Georgia" w:eastAsia="Georgia" w:cs="Georgia"/>
           <w:i w:val="0"/>
           <w:sz w:val="24"/>
         </w:rPr>
@@ -11860,7 +11860,7 @@
       </w:r>
       <w:r>
         <w:rPr>
-          <w:rFonts w:ascii="Times New Roman" w:hAnsi="Times New Roman" w:eastAsia="Times New Roman"/>
+          <w:rFonts w:ascii="Georgia" w:hAnsi="Georgia" w:eastAsia="Georgia" w:cs="Georgia"/>
           <w:i/>
           <w:sz w:val="24"/>
         </w:rPr>
@@ -11868,7 +11868,7 @@
       </w:r>
       <w:r>
         <w:rPr>
-          <w:rFonts w:ascii="Times New Roman" w:hAnsi="Times New Roman" w:eastAsia="Times New Roman"/>
+          <w:rFonts w:ascii="Georgia" w:hAnsi="Georgia" w:eastAsia="Georgia" w:cs="Georgia"/>
           <w:i w:val="0"/>
           <w:sz w:val="24"/>
         </w:rPr>
@@ -11884,7 +11884,7 @@
       </w:pPr>
       <w:r>
         <w:rPr>
-          <w:rFonts w:ascii="Times New Roman" w:hAnsi="Times New Roman" w:eastAsia="Times New Roman"/>
+          <w:rFonts w:ascii="Georgia" w:hAnsi="Georgia" w:eastAsia="Georgia" w:cs="Georgia"/>
           <w:i w:val="0"/>
           <w:sz w:val="24"/>
         </w:rPr>
@@ -11892,7 +11892,7 @@
       </w:r>
       <w:r>
         <w:rPr>
-          <w:rFonts w:ascii="Times New Roman" w:hAnsi="Times New Roman" w:eastAsia="Times New Roman"/>
+          <w:rFonts w:ascii="Georgia" w:hAnsi="Georgia" w:eastAsia="Georgia" w:cs="Georgia"/>
           <w:i/>
           <w:sz w:val="24"/>
         </w:rPr>
@@ -11900,7 +11900,7 @@
       </w:r>
       <w:r>
         <w:rPr>
-          <w:rFonts w:ascii="Times New Roman" w:hAnsi="Times New Roman" w:eastAsia="Times New Roman"/>
+          <w:rFonts w:ascii="Georgia" w:hAnsi="Georgia" w:eastAsia="Georgia" w:cs="Georgia"/>
           <w:i w:val="0"/>
           <w:sz w:val="24"/>
         </w:rPr>
@@ -11916,7 +11916,7 @@
       </w:pPr>
       <w:r>
         <w:rPr>
-          <w:rFonts w:ascii="Times New Roman" w:hAnsi="Times New Roman" w:eastAsia="Times New Roman"/>
+          <w:rFonts w:ascii="Georgia" w:hAnsi="Georgia" w:eastAsia="Georgia" w:cs="Georgia"/>
           <w:i w:val="0"/>
           <w:sz w:val="24"/>
         </w:rPr>
@@ -11924,7 +11924,7 @@
       </w:r>
       <w:r>
         <w:rPr>
-          <w:rFonts w:ascii="Times New Roman" w:hAnsi="Times New Roman" w:eastAsia="Times New Roman"/>
+          <w:rFonts w:ascii="Georgia" w:hAnsi="Georgia" w:eastAsia="Georgia" w:cs="Georgia"/>
           <w:i/>
           <w:sz w:val="24"/>
         </w:rPr>
@@ -11932,7 +11932,7 @@
       </w:r>
       <w:r>
         <w:rPr>
-          <w:rFonts w:ascii="Times New Roman" w:hAnsi="Times New Roman" w:eastAsia="Times New Roman"/>
+          <w:rFonts w:ascii="Georgia" w:hAnsi="Georgia" w:eastAsia="Georgia" w:cs="Georgia"/>
           <w:i w:val="0"/>
           <w:sz w:val="24"/>
         </w:rPr>
@@ -11948,7 +11948,7 @@
       </w:pPr>
       <w:r>
         <w:rPr>
-          <w:rFonts w:ascii="Times New Roman" w:hAnsi="Times New Roman" w:eastAsia="Times New Roman"/>
+          <w:rFonts w:ascii="Georgia" w:hAnsi="Georgia" w:eastAsia="Georgia" w:cs="Georgia"/>
           <w:i w:val="0"/>
           <w:sz w:val="24"/>
         </w:rPr>
@@ -11956,7 +11956,7 @@
       </w:r>
       <w:r>
         <w:rPr>
-          <w:rFonts w:ascii="Times New Roman" w:hAnsi="Times New Roman" w:eastAsia="Times New Roman"/>
+          <w:rFonts w:ascii="Georgia" w:hAnsi="Georgia" w:eastAsia="Georgia" w:cs="Georgia"/>
           <w:i/>
           <w:sz w:val="24"/>
         </w:rPr>
@@ -11964,7 +11964,7 @@
       </w:r>
       <w:r>
         <w:rPr>
-          <w:rFonts w:ascii="Times New Roman" w:hAnsi="Times New Roman" w:eastAsia="Times New Roman"/>
+          <w:rFonts w:ascii="Georgia" w:hAnsi="Georgia" w:eastAsia="Georgia" w:cs="Georgia"/>
           <w:i w:val="0"/>
           <w:sz w:val="24"/>
         </w:rPr>
@@ -11980,7 +11980,7 @@
       </w:pPr>
       <w:r>
         <w:rPr>
-          <w:rFonts w:ascii="Times New Roman" w:hAnsi="Times New Roman" w:eastAsia="Times New Roman"/>
+          <w:rFonts w:ascii="Georgia" w:hAnsi="Georgia" w:eastAsia="Georgia" w:cs="Georgia"/>
           <w:i w:val="0"/>
           <w:sz w:val="24"/>
         </w:rPr>
@@ -11988,7 +11988,7 @@
       </w:r>
       <w:r>
         <w:rPr>
-          <w:rFonts w:ascii="Times New Roman" w:hAnsi="Times New Roman" w:eastAsia="Times New Roman"/>
+          <w:rFonts w:ascii="Georgia" w:hAnsi="Georgia" w:eastAsia="Georgia" w:cs="Georgia"/>
           <w:i/>
           <w:sz w:val="24"/>
         </w:rPr>
@@ -11996,7 +11996,7 @@
       </w:r>
       <w:r>
         <w:rPr>
-          <w:rFonts w:ascii="Times New Roman" w:hAnsi="Times New Roman" w:eastAsia="Times New Roman"/>
+          <w:rFonts w:ascii="Georgia" w:hAnsi="Georgia" w:eastAsia="Georgia" w:cs="Georgia"/>
           <w:i w:val="0"/>
           <w:sz w:val="24"/>
         </w:rPr>
@@ -12012,7 +12012,7 @@
       </w:pPr>
       <w:r>
         <w:rPr>
-          <w:rFonts w:ascii="Times New Roman" w:hAnsi="Times New Roman" w:eastAsia="Times New Roman"/>
+          <w:rFonts w:ascii="Georgia" w:hAnsi="Georgia" w:eastAsia="Georgia" w:cs="Georgia"/>
           <w:i w:val="0"/>
           <w:sz w:val="24"/>
         </w:rPr>
@@ -12020,7 +12020,7 @@
       </w:r>
       <w:r>
         <w:rPr>
-          <w:rFonts w:ascii="Times New Roman" w:hAnsi="Times New Roman" w:eastAsia="Times New Roman"/>
+          <w:rFonts w:ascii="Georgia" w:hAnsi="Georgia" w:eastAsia="Georgia" w:cs="Georgia"/>
           <w:i/>
           <w:sz w:val="24"/>
         </w:rPr>
@@ -12028,7 +12028,7 @@
       </w:r>
       <w:r>
         <w:rPr>
-          <w:rFonts w:ascii="Times New Roman" w:hAnsi="Times New Roman" w:eastAsia="Times New Roman"/>
+          <w:rFonts w:ascii="Georgia" w:hAnsi="Georgia" w:eastAsia="Georgia" w:cs="Georgia"/>
           <w:i w:val="0"/>
           <w:sz w:val="24"/>
         </w:rPr>
@@ -12044,7 +12044,7 @@
       </w:pPr>
       <w:r>
         <w:rPr>
-          <w:rFonts w:ascii="Times New Roman" w:hAnsi="Times New Roman" w:eastAsia="Times New Roman"/>
+          <w:rFonts w:ascii="Georgia" w:hAnsi="Georgia" w:eastAsia="Georgia" w:cs="Georgia"/>
           <w:i w:val="0"/>
           <w:sz w:val="24"/>
         </w:rPr>
@@ -12052,7 +12052,7 @@
       </w:r>
       <w:r>
         <w:rPr>
-          <w:rFonts w:ascii="Times New Roman" w:hAnsi="Times New Roman" w:eastAsia="Times New Roman"/>
+          <w:rFonts w:ascii="Georgia" w:hAnsi="Georgia" w:eastAsia="Georgia" w:cs="Georgia"/>
           <w:i/>
           <w:sz w:val="24"/>
         </w:rPr>
@@ -12060,7 +12060,7 @@
       </w:r>
       <w:r>
         <w:rPr>
-          <w:rFonts w:ascii="Times New Roman" w:hAnsi="Times New Roman" w:eastAsia="Times New Roman"/>
+          <w:rFonts w:ascii="Georgia" w:hAnsi="Georgia" w:eastAsia="Georgia" w:cs="Georgia"/>
           <w:i w:val="0"/>
           <w:sz w:val="24"/>
         </w:rPr>
@@ -12076,7 +12076,7 @@
       </w:pPr>
       <w:r>
         <w:rPr>
-          <w:rFonts w:ascii="Times New Roman" w:hAnsi="Times New Roman" w:eastAsia="Times New Roman"/>
+          <w:rFonts w:ascii="Georgia" w:hAnsi="Georgia" w:eastAsia="Georgia" w:cs="Georgia"/>
           <w:i w:val="0"/>
           <w:sz w:val="24"/>
         </w:rPr>
@@ -12084,7 +12084,7 @@
       </w:r>
       <w:r>
         <w:rPr>
-          <w:rFonts w:ascii="Times New Roman" w:hAnsi="Times New Roman" w:eastAsia="Times New Roman"/>
+          <w:rFonts w:ascii="Georgia" w:hAnsi="Georgia" w:eastAsia="Georgia" w:cs="Georgia"/>
           <w:i/>
           <w:sz w:val="24"/>
         </w:rPr>
@@ -12092,7 +12092,7 @@
       </w:r>
       <w:r>
         <w:rPr>
-          <w:rFonts w:ascii="Times New Roman" w:hAnsi="Times New Roman" w:eastAsia="Times New Roman"/>
+          <w:rFonts w:ascii="Georgia" w:hAnsi="Georgia" w:eastAsia="Georgia" w:cs="Georgia"/>
           <w:i w:val="0"/>
           <w:sz w:val="24"/>
         </w:rPr>
@@ -12108,7 +12108,7 @@
       </w:pPr>
       <w:r>
         <w:rPr>
-          <w:rFonts w:ascii="Times New Roman" w:hAnsi="Times New Roman" w:eastAsia="Times New Roman"/>
+          <w:rFonts w:ascii="Georgia" w:hAnsi="Georgia" w:eastAsia="Georgia" w:cs="Georgia"/>
           <w:i w:val="0"/>
           <w:sz w:val="24"/>
         </w:rPr>
@@ -12116,7 +12116,7 @@
       </w:r>
       <w:r>
         <w:rPr>
-          <w:rFonts w:ascii="Times New Roman" w:hAnsi="Times New Roman" w:eastAsia="Times New Roman"/>
+          <w:rFonts w:ascii="Georgia" w:hAnsi="Georgia" w:eastAsia="Georgia" w:cs="Georgia"/>
           <w:i/>
           <w:sz w:val="24"/>
         </w:rPr>
@@ -12124,7 +12124,7 @@
       </w:r>
       <w:r>
         <w:rPr>
-          <w:rFonts w:ascii="Times New Roman" w:hAnsi="Times New Roman" w:eastAsia="Times New Roman"/>
+          <w:rFonts w:ascii="Georgia" w:hAnsi="Georgia" w:eastAsia="Georgia" w:cs="Georgia"/>
           <w:i w:val="0"/>
           <w:sz w:val="24"/>
         </w:rPr>
@@ -12140,7 +12140,7 @@
       </w:pPr>
       <w:r>
         <w:rPr>
-          <w:rFonts w:ascii="Times New Roman" w:hAnsi="Times New Roman" w:eastAsia="Times New Roman"/>
+          <w:rFonts w:ascii="Georgia" w:hAnsi="Georgia" w:eastAsia="Georgia" w:cs="Georgia"/>
           <w:i w:val="0"/>
           <w:sz w:val="24"/>
         </w:rPr>
@@ -12148,7 +12148,7 @@
       </w:r>
       <w:r>
         <w:rPr>
-          <w:rFonts w:ascii="Times New Roman" w:hAnsi="Times New Roman" w:eastAsia="Times New Roman"/>
+          <w:rFonts w:ascii="Georgia" w:hAnsi="Georgia" w:eastAsia="Georgia" w:cs="Georgia"/>
           <w:i/>
           <w:sz w:val="24"/>
         </w:rPr>
@@ -12156,7 +12156,7 @@
       </w:r>
       <w:r>
         <w:rPr>
-          <w:rFonts w:ascii="Times New Roman" w:hAnsi="Times New Roman" w:eastAsia="Times New Roman"/>
+          <w:rFonts w:ascii="Georgia" w:hAnsi="Georgia" w:eastAsia="Georgia" w:cs="Georgia"/>
           <w:i w:val="0"/>
           <w:sz w:val="24"/>
         </w:rPr>
@@ -12174,7 +12174,7 @@
       </w:pPr>
       <w:r>
         <w:rPr>
-          <w:rFonts w:ascii="Times New Roman" w:hAnsi="Times New Roman" w:eastAsia="Times New Roman"/>
+          <w:rFonts w:ascii="Georgia" w:hAnsi="Georgia" w:eastAsia="Georgia" w:cs="Georgia"/>
           <w:i w:val="0"/>
           <w:sz w:val="24"/>
         </w:rPr>
@@ -12182,7 +12182,7 @@
       </w:r>
       <w:r>
         <w:rPr>
-          <w:rFonts w:ascii="Times New Roman" w:hAnsi="Times New Roman" w:eastAsia="Times New Roman"/>
+          <w:rFonts w:ascii="Georgia" w:hAnsi="Georgia" w:eastAsia="Georgia" w:cs="Georgia"/>
           <w:i/>
           <w:sz w:val="24"/>
         </w:rPr>
@@ -12190,7 +12190,7 @@
       </w:r>
       <w:r>
         <w:rPr>
-          <w:rFonts w:ascii="Times New Roman" w:hAnsi="Times New Roman" w:eastAsia="Times New Roman"/>
+          <w:rFonts w:ascii="Georgia" w:hAnsi="Georgia" w:eastAsia="Georgia" w:cs="Georgia"/>
           <w:i w:val="0"/>
           <w:sz w:val="24"/>
         </w:rPr>
@@ -12208,7 +12208,7 @@
       </w:pPr>
       <w:r>
         <w:rPr>
-          <w:rFonts w:ascii="Times New Roman" w:hAnsi="Times New Roman" w:eastAsia="Times New Roman"/>
+          <w:rFonts w:ascii="Georgia" w:hAnsi="Georgia" w:eastAsia="Georgia" w:cs="Georgia"/>
           <w:i w:val="0"/>
           <w:sz w:val="24"/>
         </w:rPr>
@@ -12216,7 +12216,7 @@
       </w:r>
       <w:r>
         <w:rPr>
-          <w:rFonts w:ascii="Times New Roman" w:hAnsi="Times New Roman" w:eastAsia="Times New Roman"/>
+          <w:rFonts w:ascii="Georgia" w:hAnsi="Georgia" w:eastAsia="Georgia" w:cs="Georgia"/>
           <w:i/>
           <w:sz w:val="24"/>
         </w:rPr>
@@ -12224,7 +12224,7 @@
       </w:r>
       <w:r>
         <w:rPr>
-          <w:rFonts w:ascii="Times New Roman" w:hAnsi="Times New Roman" w:eastAsia="Times New Roman"/>
+          <w:rFonts w:ascii="Georgia" w:hAnsi="Georgia" w:eastAsia="Georgia" w:cs="Georgia"/>
           <w:i w:val="0"/>
           <w:sz w:val="24"/>
         </w:rPr>
@@ -18299,7 +18299,7 @@
             </w:pPr>
             <w:r>
               <w:rPr>
-                <w:rFonts w:ascii="Georgia" w:hAnsi="Georgia"/>
+                <w:rFonts w:ascii="Georgia" w:hAnsi="Georgia" w:cs="Georgia" w:eastAsia="Georgia"/>
                 <w:sz w:val="20"/>
                 <w:szCs w:val="20"/>
               </w:rPr>
@@ -18307,7 +18307,7 @@
             </w:r>
             <w:r>
               <w:rPr>
-                <w:rFonts w:ascii="Georgia" w:hAnsi="Georgia"/>
+                <w:rFonts w:ascii="Georgia" w:hAnsi="Georgia" w:cs="Georgia" w:eastAsia="Georgia"/>
                 <w:sz w:val="20"/>
                 <w:szCs w:val="20"/>
                 <w:shd w:val="clear" w:color="auto" w:fill="bfbfbf"/>
@@ -18316,7 +18316,7 @@
             </w:r>
             <w:r>
               <w:rPr>
-                <w:rFonts w:ascii="Georgia" w:hAnsi="Georgia"/>
+                <w:rFonts w:ascii="Georgia" w:hAnsi="Georgia" w:cs="Georgia" w:eastAsia="Georgia"/>
                 <w:sz w:val="20"/>
                 <w:szCs w:val="20"/>
               </w:rPr>
@@ -18424,7 +18424,7 @@
             </w:pPr>
             <w:r>
               <w:rPr>
-                <w:rFonts w:ascii="Georgia" w:hAnsi="Georgia"/>
+                <w:rFonts w:ascii="Georgia" w:hAnsi="Georgia" w:cs="Georgia" w:eastAsia="Georgia"/>
                 <w:sz w:val="20"/>
                 <w:szCs w:val="20"/>
               </w:rPr>
@@ -18432,7 +18432,7 @@
             </w:r>
             <w:r>
               <w:rPr>
-                <w:rFonts w:ascii="Georgia" w:hAnsi="Georgia"/>
+                <w:rFonts w:ascii="Georgia" w:hAnsi="Georgia" w:cs="Georgia" w:eastAsia="Georgia"/>
                 <w:sz w:val="20"/>
                 <w:szCs w:val="20"/>
                 <w:shd w:val="clear" w:color="auto" w:fill="bfbfbf"/>
@@ -18441,7 +18441,7 @@
             </w:r>
             <w:r>
               <w:rPr>
-                <w:rFonts w:ascii="Georgia" w:hAnsi="Georgia"/>
+                <w:rFonts w:ascii="Georgia" w:hAnsi="Georgia" w:cs="Georgia" w:eastAsia="Georgia"/>
                 <w:sz w:val="20"/>
                 <w:szCs w:val="20"/>
               </w:rPr>
@@ -18549,7 +18549,7 @@
             </w:pPr>
             <w:r>
               <w:rPr>
-                <w:rFonts w:ascii="Georgia" w:hAnsi="Georgia"/>
+                <w:rFonts w:ascii="Georgia" w:hAnsi="Georgia" w:cs="Georgia" w:eastAsia="Georgia"/>
                 <w:sz w:val="20"/>
                 <w:szCs w:val="20"/>
               </w:rPr>
@@ -18557,7 +18557,7 @@
             </w:r>
             <w:r>
               <w:rPr>
-                <w:rFonts w:ascii="Georgia" w:hAnsi="Georgia"/>
+                <w:rFonts w:ascii="Georgia" w:hAnsi="Georgia" w:cs="Georgia" w:eastAsia="Georgia"/>
                 <w:sz w:val="20"/>
                 <w:szCs w:val="20"/>
                 <w:shd w:val="clear" w:color="auto" w:fill="bfbfbf"/>
@@ -18566,7 +18566,7 @@
             </w:r>
             <w:r>
               <w:rPr>
-                <w:rFonts w:ascii="Georgia" w:hAnsi="Georgia"/>
+                <w:rFonts w:ascii="Georgia" w:hAnsi="Georgia" w:cs="Georgia" w:eastAsia="Georgia"/>
                 <w:sz w:val="20"/>
                 <w:szCs w:val="20"/>
               </w:rPr>

</xml_diff>

<commit_message>
Draft_088: italicize Filipino word dapat (local modal equivalent)
</commit_message>
<xml_diff>
--- a/thesis/003_ThesisProposal_Draft_088.docx
+++ b/thesis/003_ThesisProposal_Draft_088.docx
@@ -470,7 +470,25 @@
           <w:sz w:val="24"/>
           <w:szCs w:val="24"/>
         </w:rPr>
-        <w:t>Developing researchers tend to underuse hedges and rely on a narrow set of devices, most often modal verbs (Khunasathitchai et al., 2025, Suratno &amp; Aydawati, 2025, Ghia et al., 2022, and Mazidah et al., 2022). Across undergraduate and upper-level student writing, the same core pattern recurs: low hedge density, limited formal variety, and a default to modals such as may or local equivalents such as dapat, linked more to limited rhetorical exposure than to weak grammar. Thesis-abstract studies in Thai, Italian, and Indonesian L2 settings show averages near or below two hedges per abstract and, in some programs, heavier use of boosters than of hedges. Where disciplinary comparison is available among developing writers, as in Wang’s (2022) sixteen-field MICUSP analysis, variation appears, yet modal dominance persists even in fields that hedge more overall.</w:t>
+        <w:t xml:space="preserve">Developing researchers tend to underuse hedges and rely on a narrow set of devices, most often modal verbs (Khunasathitchai et al., 2025, Suratno &amp; Aydawati, 2025, Ghia et al., 2022, and Mazidah et al., 2022). Across undergraduate and upper-level student writing, the same core pattern recurs: low hedge density, limited formal variety, and a default to modals such as may or local equivalents such as </w:t>
+      </w:r>
+      <w:r>
+        <w:rPr>
+          <w:rFonts w:ascii="Georgia" w:hAnsi="Georgia" w:cs="Georgia" w:eastAsia="Georgia"/>
+          <w:sz w:val="24"/>
+          <w:szCs w:val="24"/>
+          <w:i/>
+          <w:iCs/>
+        </w:rPr>
+        <w:t xml:space="preserve">dapat</w:t>
+      </w:r>
+      <w:r>
+        <w:rPr>
+          <w:rFonts w:ascii="Georgia" w:hAnsi="Georgia" w:cs="Georgia" w:eastAsia="Georgia"/>
+          <w:sz w:val="24"/>
+          <w:szCs w:val="24"/>
+        </w:rPr>
+        <w:t xml:space="preserve">, linked more to limited rhetorical exposure than to weak grammar. Thesis-abstract studies in Thai, Italian, and Indonesian L2 settings show averages near or below two hedges per abstract and, in some programs, heavier use of boosters than of hedges. Where disciplinary comparison is available among developing writers, as in Wang’s (2022) sixteen-field MICUSP analysis, variation appears, yet modal dominance persists even in fields that hedge more overall.</w:t>
       </w:r>
     </w:p>
     <w:p>

</xml_diff>

<commit_message>
Draft_088: fit Appendix A QR+legend+Combined Example on one page; Full Codebook starts page 2
</commit_message>
<xml_diff>
--- a/thesis/003_ThesisProposal_Draft_088.docx
+++ b/thesis/003_ThesisProposal_Draft_088.docx
@@ -12467,7 +12467,7 @@
     </w:p>
     <w:p>
       <w:pPr>
-        <w:spacing w:before="60" w:after="40" w:line="220" w:lineRule="auto"/>
+        <w:spacing w:before="0" w:after="0" w:line="220" w:lineRule="auto"/>
         <w:jc w:val="left"/>
         <w:rPr/>
       </w:pPr>
@@ -12492,7 +12492,7 @@
     </w:p>
     <w:p>
       <w:pPr>
-        <w:spacing w:before="20" w:after="20" w:line="220" w:lineRule="auto"/>
+        <w:spacing w:before="0" w:after="0" w:line="220" w:lineRule="auto"/>
         <w:jc w:val="both"/>
         <w:rPr/>
       </w:pPr>
@@ -12517,7 +12517,7 @@
     </w:p>
     <w:p>
       <w:pPr>
-        <w:spacing w:before="20" w:after="20" w:line="220" w:lineRule="auto"/>
+        <w:spacing w:before="0" w:after="0" w:line="220" w:lineRule="auto"/>
         <w:jc w:val="left"/>
         <w:rPr/>
       </w:pPr>
@@ -12542,7 +12542,7 @@
     </w:p>
     <w:p>
       <w:pPr>
-        <w:spacing w:before="20" w:after="20" w:line="220" w:lineRule="auto"/>
+        <w:spacing w:before="0" w:after="0" w:line="220" w:lineRule="auto"/>
         <w:ind w:left="240" w:firstLine="0"/>
         <w:jc w:val="both"/>
         <w:rPr/>
@@ -12568,7 +12568,7 @@
     </w:p>
     <w:p>
       <w:pPr>
-        <w:spacing w:before="20" w:after="20" w:line="220" w:lineRule="auto"/>
+        <w:spacing w:before="0" w:after="0" w:line="220" w:lineRule="auto"/>
         <w:ind w:left="240" w:firstLine="0"/>
         <w:jc w:val="both"/>
         <w:rPr/>
@@ -12595,7 +12595,7 @@
     </w:p>
     <w:p>
       <w:pPr>
-        <w:spacing w:before="20" w:after="20" w:line="220" w:lineRule="auto"/>
+        <w:spacing w:before="0" w:after="0" w:line="220" w:lineRule="auto"/>
         <w:ind w:left="240" w:firstLine="0"/>
         <w:jc w:val="both"/>
         <w:rPr/>
@@ -12621,7 +12621,7 @@
     </w:p>
     <w:p>
       <w:pPr>
-        <w:spacing w:before="20" w:after="20" w:line="220" w:lineRule="auto"/>
+        <w:spacing w:before="0" w:after="0" w:line="220" w:lineRule="auto"/>
         <w:ind w:left="240" w:firstLine="0"/>
         <w:jc w:val="both"/>
         <w:rPr/>
@@ -12647,7 +12647,7 @@
     </w:p>
     <w:p>
       <w:pPr>
-        <w:spacing w:before="20" w:after="20" w:line="220" w:lineRule="auto"/>
+        <w:spacing w:before="0" w:after="0" w:line="220" w:lineRule="auto"/>
         <w:jc w:val="left"/>
         <w:rPr/>
       </w:pPr>
@@ -12656,101 +12656,16 @@
           <w:rFonts w:ascii="Georgia" w:hAnsi="Georgia" w:cs="Georgia" w:eastAsia="Georgia"/>
           <w:b/>
           <w:bCs w:val="1"/>
-          <w:sz w:val="24"/>
-          <w:szCs w:val="24"/>
-          <w:rtl w:val="0"/>
-        </w:rPr>
-        <w:t>Functions (retained hedges)</w:t>
-      </w:r>
-      <w:r>
-        <w:rPr>
-          <w:rtl w:val="0"/>
-          <w:sz w:val="24"/>
-          <w:szCs w:val="24"/>
-        </w:rPr>
-      </w:r>
-    </w:p>
-    <w:p>
-      <w:pPr>
-        <w:spacing w:before="20" w:after="20" w:line="220" w:lineRule="auto"/>
-        <w:ind w:left="240" w:firstLine="720"/>
-        <w:jc w:val="both"/>
-        <w:rPr/>
-      </w:pPr>
-      <w:r>
-        <w:rPr>
-          <w:rFonts w:ascii="Georgia" w:hAnsi="Georgia" w:cs="Georgia" w:eastAsia="Georgia"/>
-          <w:b w:val="0"/>
-          <w:bCs w:val="0"/>
-          <w:sz w:val="24"/>
-          <w:szCs w:val="24"/>
-          <w:rtl w:val="0"/>
-        </w:rPr>
-        <w:t>• EC: uncertainty about whether a claim is true.</w:t>
-      </w:r>
-      <w:r>
-        <w:rPr>
-          <w:rtl w:val="0"/>
-          <w:sz w:val="24"/>
-          <w:szCs w:val="24"/>
-        </w:rPr>
-      </w:r>
-    </w:p>
-    <w:p>
-      <w:pPr>
-        <w:spacing w:before="20" w:after="20" w:line="220" w:lineRule="auto"/>
-        <w:ind w:left="240" w:firstLine="720"/>
-        <w:jc w:val="both"/>
-        <w:rPr/>
-      </w:pPr>
-      <w:r>
-        <w:rPr>
-          <w:rFonts w:ascii="Georgia" w:hAnsi="Georgia" w:cs="Georgia" w:eastAsia="Georgia"/>
-          <w:b w:val="0"/>
-          <w:bCs w:val="0"/>
-          <w:sz w:val="24"/>
-          <w:szCs w:val="24"/>
-          <w:rtl w:val="0"/>
-        </w:rPr>
-        <w:t>• P: interpersonal softening or deference, not genuine doubt.</w:t>
-      </w:r>
-      <w:r>
-        <w:rPr>
-          <w:rtl w:val="0"/>
-          <w:sz w:val="24"/>
-          <w:szCs w:val="24"/>
-        </w:rPr>
-      </w:r>
-    </w:p>
-    <w:p>
-      <w:pPr>
-        <w:spacing w:before="20" w:after="20" w:line="220" w:lineRule="auto"/>
-        <w:ind w:left="240" w:firstLine="0"/>
-        <w:jc w:val="both"/>
-        <w:rPr/>
-      </w:pPr>
-      <w:r>
-        <w:rPr>
-          <w:rFonts w:ascii="Georgia" w:hAnsi="Georgia" w:cs="Georgia" w:eastAsia="Georgia"/>
-          <w:b w:val="0"/>
-          <w:bCs w:val="0"/>
-          <w:sz w:val="22"/>
-          <w:szCs w:val="22"/>
-          <w:rtl w:val="0"/>
-        </w:rPr>
-        <w:t>• DO: text framing or reader guidance (pure findings framing is logged only, not retained).</w:t>
-      </w:r>
-      <w:r>
-        <w:rPr>
-          <w:rtl w:val="0"/>
-          <w:sz w:val="22"/>
-          <w:szCs w:val="22"/>
-        </w:rPr>
-      </w:r>
-    </w:p>
-    <w:p>
-      <w:pPr>
-        <w:spacing w:before="20" w:after="20" w:line="220" w:lineRule="auto"/>
+          <w:sz w:val="20"/>
+          <w:szCs w:val="20"/>
+          <w:rtl w:val="0"/>
+        </w:rPr>
+        <w:t xml:space="preserve">Functions: EC = uncertainty about a claim’s truth. P = interpersonal softening/deference. DO = framing/reader guidance (pure framing logged only, not retained).</w:t>
+      </w:r>
+    </w:p>
+    <w:p>
+      <w:pPr>
+        <w:spacing w:before="0" w:after="0" w:line="220" w:lineRule="auto"/>
         <w:jc w:val="left"/>
         <w:rPr/>
       </w:pPr>
@@ -12759,201 +12674,22 @@
           <w:rFonts w:ascii="Georgia" w:hAnsi="Georgia" w:cs="Georgia" w:eastAsia="Georgia"/>
           <w:b/>
           <w:bCs w:val="1"/>
-          <w:sz w:val="24"/>
-          <w:szCs w:val="24"/>
-          <w:rtl w:val="0"/>
-        </w:rPr>
-        <w:t>Core rules</w:t>
-      </w:r>
-      <w:r>
-        <w:rPr>
-          <w:rtl w:val="0"/>
-          <w:sz w:val="24"/>
-          <w:szCs w:val="24"/>
-        </w:rPr>
-      </w:r>
-    </w:p>
-    <w:p>
-      <w:pPr>
-        <w:spacing w:before="20" w:after="20" w:line="220" w:lineRule="auto"/>
-        <w:ind w:left="240" w:firstLine="720"/>
-        <w:jc w:val="both"/>
-        <w:rPr/>
-      </w:pPr>
-      <w:r>
-        <w:rPr>
-          <w:rFonts w:ascii="Georgia" w:hAnsi="Georgia" w:cs="Georgia" w:eastAsia="Georgia"/>
-          <w:rtl w:val="0"/>
-          <w:b w:val="0"/>
-          <w:i/>
-          <w:iCs/>
-          <w:sz w:val="24"/>
-          <w:szCs w:val="24"/>
-        </w:rPr>
-        <w:t>• suggest/indicate: finding → hedge. Recommendation → FP-Rec.</w:t>
-      </w:r>
-      <w:r>
-        <w:rPr>
-          <w:rtl w:val="0"/>
-          <w:rFonts w:ascii="Georgia" w:hAnsi="Georgia"/>
-          <w:sz w:val="24"/>
-          <w:szCs w:val="24"/>
-          <w:i/>
-          <w:iCs/>
-        </w:rPr>
-      </w:r>
-    </w:p>
-    <w:p>
-      <w:pPr>
-        <w:spacing w:before="20" w:after="20" w:line="220" w:lineRule="auto"/>
-        <w:ind w:left="240" w:firstLine="720"/>
-        <w:jc w:val="both"/>
-        <w:rPr/>
-      </w:pPr>
-      <w:r>
-        <w:rPr>
-          <w:rFonts w:ascii="Georgia" w:hAnsi="Georgia" w:cs="Georgia" w:eastAsia="Georgia"/>
-          <w:rtl w:val="0"/>
-          <w:b w:val="0"/>
-          <w:i/>
-          <w:iCs/>
-          <w:sz w:val="24"/>
-          <w:szCs w:val="24"/>
-        </w:rPr>
-        <w:t>• can/may: possibility → hedge. Capability → FP-Cap.</w:t>
-      </w:r>
-      <w:r>
-        <w:rPr>
-          <w:rtl w:val="0"/>
-          <w:rFonts w:ascii="Georgia" w:hAnsi="Georgia"/>
-          <w:sz w:val="24"/>
-          <w:szCs w:val="24"/>
-          <w:i/>
-          <w:iCs/>
-        </w:rPr>
-      </w:r>
-    </w:p>
-    <w:p>
-      <w:pPr>
-        <w:spacing w:before="20" w:after="20" w:line="220" w:lineRule="auto"/>
-        <w:ind w:left="240" w:firstLine="720"/>
-        <w:jc w:val="both"/>
-        <w:rPr/>
-      </w:pPr>
-      <w:r>
-        <w:rPr>
-          <w:rFonts w:ascii="Georgia" w:hAnsi="Georgia" w:cs="Georgia" w:eastAsia="Georgia"/>
-          <w:rtl w:val="0"/>
-          <w:b w:val="0"/>
-          <w:i/>
-          <w:iCs/>
-          <w:sz w:val="24"/>
-          <w:szCs w:val="24"/>
-        </w:rPr>
-        <w:t>• generally/typically: limits a claim → hedge. Procedural norm → FP-Proc.</w:t>
-      </w:r>
-      <w:r>
-        <w:rPr>
-          <w:rtl w:val="0"/>
-          <w:rFonts w:ascii="Georgia" w:hAnsi="Georgia"/>
-          <w:sz w:val="24"/>
-          <w:szCs w:val="24"/>
-          <w:i/>
-          <w:iCs/>
-        </w:rPr>
-      </w:r>
-    </w:p>
-    <w:p>
-      <w:pPr>
-        <w:spacing w:before="20" w:after="20" w:line="220" w:lineRule="auto"/>
-        <w:ind w:left="240" w:firstLine="0"/>
-        <w:jc w:val="both"/>
-        <w:rPr/>
-      </w:pPr>
-      <w:r>
-        <w:rPr>
-          <w:rFonts w:ascii="Georgia" w:hAnsi="Georgia" w:cs="Georgia" w:eastAsia="Georgia"/>
-          <w:rtl w:val="0"/>
-          <w:b w:val="0"/>
-          <w:i/>
-          <w:iCs/>
-          <w:sz w:val="24"/>
-          <w:szCs w:val="24"/>
-        </w:rPr>
-        <w:t>• appear/seem: uncertainty about a result → hedge. Location pointer → FP-Gen.</w:t>
-      </w:r>
-      <w:r>
-        <w:rPr>
-          <w:rtl w:val="0"/>
-          <w:rFonts w:ascii="Georgia" w:hAnsi="Georgia"/>
-          <w:sz w:val="24"/>
-          <w:szCs w:val="24"/>
-          <w:i/>
-          <w:iCs/>
-        </w:rPr>
-      </w:r>
-    </w:p>
-    <w:p>
-      <w:pPr>
-        <w:spacing w:before="20" w:after="20" w:line="220" w:lineRule="auto"/>
-        <w:jc w:val="left"/>
-        <w:rPr/>
-      </w:pPr>
-      <w:r>
-        <w:rPr>
-          <w:rFonts w:ascii="Georgia" w:hAnsi="Georgia" w:cs="Georgia" w:eastAsia="Georgia"/>
-          <w:b/>
-          <w:bCs w:val="1"/>
-          <w:sz w:val="24"/>
-          <w:szCs w:val="24"/>
-          <w:rtl w:val="0"/>
-        </w:rPr>
-        <w:t>Steps 1–3 (short)</w:t>
-      </w:r>
-      <w:r>
-        <w:rPr>
-          <w:rtl w:val="0"/>
-          <w:sz w:val="24"/>
-          <w:szCs w:val="24"/>
-        </w:rPr>
-      </w:r>
-    </w:p>
-    <w:p>
-      <w:pPr>
-        <w:spacing w:before="20" w:after="20" w:line="220" w:lineRule="auto"/>
-        <w:jc w:val="both"/>
-        <w:rPr/>
-        <w:ind w:left="360" w:hanging="360"/>
-      </w:pPr>
-      <w:r>
-        <w:rPr>
-          <w:rFonts w:ascii="Georgia" w:hAnsi="Georgia" w:cs="Georgia" w:eastAsia="Georgia"/>
-          <w:i w:val="0"/>
-          <w:sz w:val="22"/>
-          <w:szCs w:val="22"/>
-          <w:rtl w:val="0"/>
-          <w:b w:val="0"/>
-          <w:bCs w:val="0"/>
-        </w:rPr>
-        <w:t>• Step 1: wide-net candidates (hedge-like, findings framing, FP-looking forms). • Step 2: retain only claim mitigation. Pure findings framing → DO log (outside the 65). FP = capability, recommendation, procedure, topic-naming, non-claim sequencing. • Step 3: label retained hedges EC/P/DO. Working Test supports EC only. • Never retained: ability, procedural must/should, deontic recommendations (FP-Rec).</w:t>
-      </w:r>
-      <w:r>
-        <w:rPr>
-          <w:rtl w:val="0"/>
-          <w:sz w:val="22"/>
-          <w:szCs w:val="22"/>
-        </w:rPr>
-      </w:r>
-    </w:p>
-    <w:p>
-      <w:pPr>
-        <w:spacing w:line="220" w:lineRule="auto" w:before="20" w:after="20"/>
+          <w:sz w:val="20"/>
+          <w:szCs w:val="20"/>
+          <w:rtl w:val="0"/>
+        </w:rPr>
+        <w:t xml:space="preserve">Core rules: suggest/indicate finding→hedge, recommendation→FP-Rec; can/may possibility→hedge, capability→FP-Cap; generally/typically claim-limit→hedge, procedural→FP-Proc; appear/seem result-uncertainty→hedge, location→FP-Gen.</w:t>
+      </w:r>
+    </w:p>
+    <w:p>
+      <w:pPr>
+        <w:spacing w:line="220" w:lineRule="auto" w:before="0" w:after="0"/>
       </w:pPr>
       <w:r/>
     </w:p>
     <w:p>
       <w:pPr>
-        <w:spacing w:before="60" w:after="40" w:line="220" w:lineRule="auto"/>
+        <w:spacing w:before="0" w:after="0" w:line="220" w:lineRule="auto"/>
         <w:jc w:val="left"/>
         <w:rPr/>
       </w:pPr>
@@ -12980,7 +12716,7 @@
     </w:p>
     <w:p>
       <w:pPr>
-        <w:spacing w:before="20" w:after="20" w:line="220" w:lineRule="auto"/>
+        <w:spacing w:before="0" w:after="0" w:line="220" w:lineRule="auto"/>
         <w:ind w:firstLine="720"/>
         <w:jc w:val="both"/>
         <w:rPr/>
@@ -13044,7 +12780,7 @@
           </w:tcPr>
           <w:p>
             <w:pPr>
-              <w:spacing w:before="20" w:after="20" w:line="220" w:lineRule="auto"/>
+              <w:spacing w:before="0" w:after="0" w:line="220" w:lineRule="auto"/>
               <w:jc w:val="both"/>
               <w:rPr/>
             </w:pPr>
@@ -13078,7 +12814,7 @@
           </w:tcPr>
           <w:p>
             <w:pPr>
-              <w:spacing w:before="20" w:after="20" w:line="220" w:lineRule="auto"/>
+              <w:spacing w:before="0" w:after="0" w:line="220" w:lineRule="auto"/>
               <w:jc w:val="both"/>
               <w:rPr/>
             </w:pPr>
@@ -13112,7 +12848,7 @@
           <w:tcPr/>
           <w:p>
             <w:pPr>
-              <w:spacing w:before="20" w:after="20" w:line="220" w:lineRule="auto"/>
+              <w:spacing w:before="0" w:after="0" w:line="220" w:lineRule="auto"/>
               <w:jc w:val="both"/>
               <w:rPr/>
             </w:pPr>
@@ -13151,7 +12887,7 @@
           </w:p>
           <w:p>
             <w:pPr>
-              <w:spacing w:before="20" w:after="20" w:line="220" w:lineRule="auto"/>
+              <w:spacing w:before="0" w:after="0" w:line="220" w:lineRule="auto"/>
               <w:jc w:val="both"/>
               <w:rPr/>
             </w:pPr>
@@ -13190,7 +12926,7 @@
           </w:p>
           <w:p>
             <w:pPr>
-              <w:spacing w:before="20" w:after="20" w:line="220" w:lineRule="auto"/>
+              <w:spacing w:before="0" w:after="0" w:line="220" w:lineRule="auto"/>
               <w:jc w:val="both"/>
               <w:rPr/>
             </w:pPr>
@@ -13229,7 +12965,7 @@
           </w:p>
           <w:p>
             <w:pPr>
-              <w:spacing w:before="20" w:after="20" w:line="220" w:lineRule="auto"/>
+              <w:spacing w:before="0" w:after="0" w:line="220" w:lineRule="auto"/>
               <w:jc w:val="both"/>
               <w:rPr/>
             </w:pPr>
@@ -13271,7 +13007,7 @@
           <w:tcPr/>
           <w:p>
             <w:pPr>
-              <w:spacing w:before="20" w:after="20" w:line="220" w:lineRule="auto"/>
+              <w:spacing w:before="0" w:after="0" w:line="220" w:lineRule="auto"/>
               <w:jc w:val="both"/>
               <w:rPr/>
             </w:pPr>
@@ -13314,7 +13050,7 @@
           </w:p>
           <w:p>
             <w:pPr>
-              <w:spacing w:before="20" w:after="20" w:line="220" w:lineRule="auto"/>
+              <w:spacing w:before="0" w:after="0" w:line="220" w:lineRule="auto"/>
               <w:jc w:val="both"/>
               <w:rPr/>
             </w:pPr>
@@ -13357,7 +13093,7 @@
           </w:p>
           <w:p>
             <w:pPr>
-              <w:spacing w:before="20" w:after="20" w:line="220" w:lineRule="auto"/>
+              <w:spacing w:before="0" w:after="0" w:line="220" w:lineRule="auto"/>
               <w:jc w:val="both"/>
               <w:rPr/>
             </w:pPr>
@@ -13408,7 +13144,7 @@
           <w:tcPr/>
           <w:p>
             <w:pPr>
-              <w:spacing w:before="20" w:after="20" w:line="220" w:lineRule="auto"/>
+              <w:spacing w:before="0" w:after="0" w:line="220" w:lineRule="auto"/>
               <w:jc w:val="left"/>
               <w:rPr/>
             </w:pPr>
@@ -13437,7 +13173,7 @@
           </w:p>
           <w:p>
             <w:pPr>
-              <w:spacing w:before="20" w:after="20" w:line="220" w:lineRule="auto"/>
+              <w:spacing w:before="0" w:after="0" w:line="220" w:lineRule="auto"/>
               <w:jc w:val="both"/>
               <w:rPr/>
             </w:pPr>
@@ -13478,7 +13214,7 @@
           <w:tcPr/>
           <w:p>
             <w:pPr>
-              <w:spacing w:before="20" w:after="20" w:line="220" w:lineRule="auto"/>
+              <w:spacing w:before="0" w:after="0" w:line="220" w:lineRule="auto"/>
               <w:jc w:val="left"/>
               <w:rPr/>
             </w:pPr>
@@ -13507,7 +13243,7 @@
           </w:p>
           <w:p>
             <w:pPr>
-              <w:spacing w:before="20" w:after="20" w:line="220" w:lineRule="auto"/>
+              <w:spacing w:before="0" w:after="0" w:line="220" w:lineRule="auto"/>
               <w:jc w:val="both"/>
               <w:rPr/>
             </w:pPr>
@@ -13539,9 +13275,10 @@
     </w:tbl>
     <w:p>
       <w:pPr>
-        <w:spacing w:before="20" w:after="20" w:line="220" w:lineRule="auto"/>
+        <w:spacing w:before="0" w:after="0" w:line="220" w:lineRule="auto"/>
         <w:jc w:val="left"/>
         <w:rPr/>
+        <w:keepLines/>
       </w:pPr>
       <w:r>
         <w:rPr>
@@ -13566,10 +13303,11 @@
     </w:p>
     <w:p>
       <w:pPr>
-        <w:spacing w:before="20" w:after="20" w:line="220" w:lineRule="auto"/>
+        <w:spacing w:before="0" w:after="0" w:line="220" w:lineRule="auto"/>
         <w:ind w:firstLine="720"/>
         <w:jc w:val="both"/>
         <w:rPr/>
+        <w:keepLines/>
       </w:pPr>
       <w:r>
         <w:rPr>
@@ -13583,252 +13321,12 @@
           <w:szCs w:val="22"/>
           <w:rtl w:val="0"/>
         </w:rPr>
-        <w:t>“The results suggested (EC) that extracts are potential (EC) alternative stains. PCR can (FP-Cap) also detect low concentrations.” Type colors on tokens. (EC) orange. FP struck. potential retained in results/conclusion only.</w:t>
-      </w:r>
-      <w:r>
-        <w:rPr>
-          <w:rFonts w:ascii="Georgia" w:cs="Georgia" w:eastAsia="Georgia" w:hAnsi="Georgia"/>
-          <w:b w:val="0"/>
-          <w:bCs w:val="0"/>
-          <w:i w:val="0"/>
-          <w:iCs w:val="0"/>
-          <w:color w:val="000000"/>
-          <w:sz w:val="22"/>
-          <w:szCs w:val="22"/>
-          <w:rtl w:val="0"/>
-        </w:rPr>
-      </w:r>
-      <w:r>
-        <w:rPr>
-          <w:rFonts w:ascii="Georgia" w:cs="Georgia" w:eastAsia="Georgia" w:hAnsi="Georgia"/>
-          <w:b w:val="1"/>
-          <w:bCs w:val="1"/>
-          <w:color w:val="ffffff"/>
-          <w:sz w:val="22"/>
-          <w:szCs w:val="22"/>
-          <w:highlight w:val="red"/>
-          <w:rtl w:val="0"/>
-        </w:rPr>
-      </w:r>
-      <w:r>
-        <w:rPr>
-          <w:rFonts w:ascii="Georgia" w:cs="Georgia" w:eastAsia="Georgia" w:hAnsi="Georgia"/>
-          <w:b w:val="0"/>
-          <w:bCs w:val="0"/>
-          <w:i w:val="0"/>
-          <w:iCs w:val="0"/>
-          <w:color w:val="000000"/>
-          <w:sz w:val="22"/>
-          <w:szCs w:val="22"/>
-          <w:rtl w:val="0"/>
-        </w:rPr>
-      </w:r>
-      <w:r>
-        <w:rPr>
-          <w:rFonts w:ascii="Georgia" w:cs="Georgia" w:eastAsia="Georgia" w:hAnsi="Georgia"/>
-          <w:b w:val="1"/>
-          <w:bCs w:val="1"/>
-          <w:i w:val="0"/>
-          <w:iCs w:val="0"/>
-          <w:color w:val="ed7d31"/>
-          <w:sz w:val="22"/>
-          <w:szCs w:val="22"/>
-          <w:rtl w:val="0"/>
-        </w:rPr>
-      </w:r>
-      <w:r>
-        <w:rPr>
-          <w:rFonts w:ascii="Georgia" w:hAnsi="Georgia" w:cs="Georgia" w:eastAsia="Georgia"/>
-          <w:color w:val="000000"/>
-        </w:rPr>
-      </w:r>
-      <w:r>
-        <w:rPr>
-          <w:rFonts w:ascii="Georgia" w:hAnsi="Georgia" w:cs="Georgia" w:eastAsia="Georgia"/>
-          <w:highlight w:val="red"/>
-          <w:color w:val="ffffff"/>
-        </w:rPr>
-      </w:r>
-      <w:r>
-        <w:rPr>
-          <w:rFonts w:ascii="Georgia" w:hAnsi="Georgia" w:cs="Georgia" w:eastAsia="Georgia"/>
-          <w:color w:val="000000"/>
-        </w:rPr>
-      </w:r>
-      <w:r>
-        <w:rPr>
-          <w:rFonts w:ascii="Georgia" w:hAnsi="Georgia" w:cs="Georgia" w:eastAsia="Georgia"/>
-          <w:color w:val="ed7d31"/>
-        </w:rPr>
-      </w:r>
-      <w:r>
-        <w:rPr>
-          <w:rFonts w:ascii="Georgia" w:hAnsi="Georgia" w:cs="Georgia" w:eastAsia="Georgia"/>
-          <w:color w:val="000000"/>
-        </w:rPr>
-      </w:r>
-      <w:r>
-        <w:rPr>
-          <w:rFonts w:ascii="Georgia" w:cs="Georgia" w:eastAsia="Georgia" w:hAnsi="Georgia"/>
-          <w:b w:val="1"/>
-          <w:bCs w:val="1"/>
-          <w:strike w:val="1"/>
-          <w:color w:val="000000"/>
-          <w:sz w:val="22"/>
-          <w:szCs w:val="22"/>
-          <w:rtl w:val="0"/>
-        </w:rPr>
-      </w:r>
-      <w:r>
-        <w:rPr>
-          <w:rFonts w:ascii="Georgia" w:cs="Georgia" w:eastAsia="Georgia" w:hAnsi="Georgia"/>
-          <w:b w:val="0"/>
-          <w:bCs w:val="0"/>
-          <w:i w:val="0"/>
-          <w:iCs w:val="0"/>
-          <w:color w:val="000000"/>
-          <w:sz w:val="22"/>
-          <w:szCs w:val="22"/>
-          <w:rtl w:val="0"/>
-        </w:rPr>
-      </w:r>
-      <w:r>
-        <w:rPr>
-          <w:rFonts w:ascii="Georgia" w:cs="Georgia" w:eastAsia="Georgia" w:hAnsi="Georgia"/>
-          <w:b w:val="0"/>
-          <w:bCs w:val="0"/>
-          <w:i w:val="0"/>
-          <w:iCs w:val="0"/>
-          <w:color w:val="808080"/>
-          <w:sz w:val="22"/>
-          <w:szCs w:val="22"/>
-          <w:rtl w:val="0"/>
-        </w:rPr>
-      </w:r>
-      <w:r>
-        <w:rPr>
-          <w:rFonts w:ascii="Georgia" w:cs="Georgia" w:eastAsia="Georgia" w:hAnsi="Georgia"/>
-          <w:b w:val="0"/>
-          <w:bCs w:val="0"/>
-          <w:i w:val="0"/>
-          <w:iCs w:val="0"/>
-          <w:color w:val="000000"/>
-          <w:sz w:val="22"/>
-          <w:szCs w:val="22"/>
-          <w:rtl w:val="0"/>
-        </w:rPr>
-      </w:r>
-      <w:r>
-        <w:rPr>
-          <w:rFonts w:ascii="Georgia" w:cs="Georgia" w:eastAsia="Georgia" w:hAnsi="Georgia"/>
-          <w:b w:val="1"/>
-          <w:bCs w:val="1"/>
-          <w:strike w:val="1"/>
-          <w:color w:val="000000"/>
-          <w:sz w:val="22"/>
-          <w:szCs w:val="22"/>
-          <w:rtl w:val="0"/>
-        </w:rPr>
-      </w:r>
-      <w:r>
-        <w:rPr>
-          <w:rFonts w:ascii="Georgia" w:cs="Georgia" w:eastAsia="Georgia" w:hAnsi="Georgia"/>
-          <w:b w:val="0"/>
-          <w:bCs w:val="0"/>
-          <w:i w:val="0"/>
-          <w:iCs w:val="0"/>
-          <w:color w:val="000000"/>
-          <w:sz w:val="22"/>
-          <w:szCs w:val="22"/>
-          <w:rtl w:val="0"/>
-        </w:rPr>
-      </w:r>
-      <w:r>
-        <w:rPr>
-          <w:rFonts w:ascii="Georgia" w:cs="Georgia" w:eastAsia="Georgia" w:hAnsi="Georgia"/>
-          <w:b w:val="0"/>
-          <w:bCs w:val="0"/>
-          <w:i w:val="0"/>
-          <w:iCs w:val="0"/>
-          <w:color w:val="808080"/>
-          <w:sz w:val="22"/>
-          <w:szCs w:val="22"/>
-          <w:rtl w:val="0"/>
-        </w:rPr>
-      </w:r>
-      <w:r>
-        <w:rPr>
-          <w:rFonts w:ascii="Georgia" w:cs="Georgia" w:eastAsia="Georgia" w:hAnsi="Georgia"/>
-          <w:b w:val="0"/>
-          <w:bCs w:val="0"/>
-          <w:i w:val="0"/>
-          <w:iCs w:val="0"/>
-          <w:color w:val="000000"/>
-          <w:sz w:val="22"/>
-          <w:szCs w:val="22"/>
-          <w:rtl w:val="0"/>
-        </w:rPr>
-      </w:r>
-      <w:r>
-        <w:rPr>
-          <w:rFonts w:ascii="Georgia" w:cs="Georgia" w:eastAsia="Georgia" w:hAnsi="Georgia"/>
-          <w:b w:val="1"/>
-          <w:bCs w:val="1"/>
-          <w:strike w:val="0"/>
-          <w:color w:val="000000"/>
-          <w:sz w:val="22"/>
-          <w:szCs w:val="22"/>
-          <w:rtl w:val="0"/>
-        </w:rPr>
-      </w:r>
-      <w:r>
-        <w:rPr>
-          <w:rFonts w:ascii="Georgia" w:cs="Georgia" w:eastAsia="Georgia" w:hAnsi="Georgia"/>
-          <w:b w:val="0"/>
-          <w:bCs w:val="0"/>
-          <w:i w:val="0"/>
-          <w:iCs w:val="0"/>
-          <w:color w:val="000000"/>
-          <w:sz w:val="22"/>
-          <w:szCs w:val="22"/>
-          <w:rtl w:val="0"/>
-        </w:rPr>
-      </w:r>
-      <w:r>
-        <w:rPr>
-          <w:rFonts w:ascii="Georgia" w:cs="Georgia" w:eastAsia="Georgia" w:hAnsi="Georgia"/>
-          <w:b w:val="1"/>
-          <w:bCs w:val="1"/>
-          <w:i w:val="0"/>
-          <w:iCs w:val="0"/>
-          <w:color w:val="000000"/>
-          <w:sz w:val="22"/>
-          <w:szCs w:val="22"/>
-          <w:rtl w:val="0"/>
-        </w:rPr>
-      </w:r>
-      <w:r>
-        <w:rPr>
-          <w:rFonts w:ascii="Georgia" w:cs="Georgia" w:eastAsia="Georgia" w:hAnsi="Georgia"/>
-          <w:b w:val="0"/>
-          <w:bCs w:val="0"/>
-          <w:i w:val="0"/>
-          <w:iCs w:val="0"/>
-          <w:color w:val="000000"/>
-          <w:sz w:val="22"/>
-          <w:szCs w:val="22"/>
-          <w:rtl w:val="0"/>
-        </w:rPr>
-      </w:r>
-      <w:r>
-        <w:rPr>
-          <w:rtl w:val="0"/>
-        </w:rPr>
-      </w:r>
-    </w:p>
-    <w:p>
-      <w:pPr>
-        <w:spacing w:before="20" w:after="20" w:line="220" w:lineRule="auto"/>
+        <w:t xml:space="preserve">“The results suggested (EC) that extracts are potential (EC) alternative stains. PCR can (FP-Cap) also detect low concentrations.” Type color = type; (EC) orange; FP struck.</w:t>
+      </w:r>
+    </w:p>
+    <w:p>
+      <w:pPr>
+        <w:spacing w:before="0" w:after="0" w:line="220" w:lineRule="auto"/>
         <w:ind w:firstLine="720"/>
         <w:jc w:val="both"/>
         <w:rPr/>
@@ -22192,19 +21690,7 @@
           <w:strike w:val="0"/>
           <w:color w:val="000000"/>
         </w:rPr>
-        <w:t xml:space="preserve"> [G]</w:t>
-      </w:r>
-      <w:r>
-        <w:rPr>
-          <w:rFonts w:ascii="Georgia" w:hAnsi="Georgia" w:cs="Georgia" w:eastAsia="Georgia"/>
-          <w:sz w:val="22"/>
-          <w:szCs w:val="22"/>
-          <w:b w:val="0"/>
-          <w:bCs w:val="0"/>
-          <w:strike w:val="0"/>
-          <w:color w:val="000000"/>
-        </w:rPr>
-        <w:t xml:space="preserve"> used, starting with UCO to SUPs 1:1 as treatment 1, a decreasing ratio of UCO to SUPs. At equal parts by weight of UCO and SUPs, optimization started at Treatment 1 with a 1:1 ratio. Treatments 2–5 proceeded similarly, increasing the ratio of UCO to SUPs. Density measurements, water absorption, and drop tests were all performed and observed. A self-testing protocol based on current literature was used. The density was calculated relative to mass and volume; however, the water absorption test yielded inconsistent findings. A drop test was also performed, which revealed that the eco-bricks from all treatments were significantly damaged at the height of one meter, making them a weak, unsuitable material to use in building walkways. This study is essential for getting insights into eco-brick manufacture because the workability of SUPs and UCOs as raw materials is proven. The research findings do not apply to buildings. Therefore</w:t>
+        <w:t xml:space="preserve"> [G] used, starting with UCO to SUPs 1:1 as treatment 1, a decreasing ratio of UCO to SUPs. At equal parts by weight of UCO and SUPs, optimization started at Treatment 1 with a 1:1 ratio. Treatments 2–5 proceeded similarly, increasing the ratio of UCO to SUPs. Density measurements, water absorption, and drop tests were all performed and observed. A self-testing protocol based on current literature was used. The density was calculated relative to mass and volume; however, the water absorption test yielded inconsistent findings. A drop test was also performed, which revealed that the eco-bricks from all treatments were significantly damaged at the height of one meter, making them a weak, unsuitable material to use in building walkways. This study is essential for getting insights into eco-brick manufacture because the workability of SUPs and UCOs as raw materials is proven. The research findings do not apply to buildings. Therefore</w:t>
       </w:r>
       <w:r>
         <w:rPr>
@@ -22771,19 +22257,7 @@
           <w:strike w:val="0"/>
           <w:color w:val="000000"/>
         </w:rPr>
-        <w:t xml:space="preserve"> [C]</w:t>
-      </w:r>
-      <w:r>
-        <w:rPr>
-          <w:rFonts w:ascii="Georgia" w:hAnsi="Georgia" w:cs="Georgia" w:eastAsia="Georgia"/>
-          <w:sz w:val="22"/>
-          <w:szCs w:val="22"/>
-          <w:b w:val="0"/>
-          <w:bCs w:val="0"/>
-          <w:strike w:val="0"/>
-          <w:color w:val="000000"/>
-        </w:rPr>
-        <w:t xml:space="preserve"> the lesions / aberrations to the liver and kidney. However, treatments with combination of MSG and pure ethanolic leaf extract of Z. talanai extract results for reduction of lesions / aberrations to the organ cytoarchitecture. Lesions / Aberrations that were observed under the microscope are cell degeneration, glomerular atrophy and glomerular hypertrophy.</w:t>
+        <w:t xml:space="preserve"> [C] the lesions / aberrations to the liver and kidney. However, treatments with combination of MSG and pure ethanolic leaf extract of Z. talanai extract results for reduction of lesions / aberrations to the organ cytoarchitecture. Lesions / Aberrations that were observed under the microscope are cell degeneration, glomerular atrophy and glomerular hypertrophy.</w:t>
       </w:r>
     </w:p>
     <w:p>
@@ -23096,19 +22570,7 @@
           <w:strike w:val="0"/>
           <w:color w:val="000000"/>
         </w:rPr>
-        <w:t xml:space="preserve"> [G]</w:t>
-      </w:r>
-      <w:r>
-        <w:rPr>
-          <w:rFonts w:ascii="Georgia" w:hAnsi="Georgia" w:cs="Georgia" w:eastAsia="Georgia"/>
-          <w:sz w:val="22"/>
-          <w:szCs w:val="22"/>
-          <w:b w:val="0"/>
-          <w:bCs w:val="0"/>
-          <w:strike w:val="0"/>
-          <w:color w:val="000000"/>
-        </w:rPr>
-        <w:t xml:space="preserve"> a comprehensive approach for diagnosing and studying mycobacteriosis in cultivated milkfish, offering insights that </w:t>
+        <w:t xml:space="preserve"> [G] a comprehensive approach for diagnosing and studying mycobacteriosis in cultivated milkfish, offering insights that </w:t>
       </w:r>
       <w:r>
         <w:rPr>
@@ -23277,19 +22739,7 @@
           <w:strike w:val="0"/>
           <w:color w:val="000000"/>
         </w:rPr>
-        <w:t xml:space="preserve"> [C]</w:t>
-      </w:r>
-      <w:r>
-        <w:rPr>
-          <w:rFonts w:ascii="Georgia" w:hAnsi="Georgia" w:cs="Georgia" w:eastAsia="Georgia"/>
-          <w:sz w:val="22"/>
-          <w:szCs w:val="22"/>
-          <w:b w:val="0"/>
-          <w:bCs w:val="0"/>
-          <w:strike w:val="0"/>
-          <w:color w:val="000000"/>
-        </w:rPr>
-        <w:t xml:space="preserve"> evaluated through spectrophotometric and turbidimetric analyses for the initial screening of gut isolates. Nine out of ten isolates exhibit quorum quenching activities by inhibiting the swarming motility of Pseudomonas aeruginosa. The metabolic compounds of the isolates were subjected to initial characterization using enzyme and pH neutralization, which revealed that organic acids were responsible for the inhibitory activity. The inhibition activity of LAB isolates against the quorum sensing-mediated swarming motility in P. aeruginosa was due to strong antibacterial activity.</w:t>
+        <w:t xml:space="preserve"> [C] evaluated through spectrophotometric and turbidimetric analyses for the initial screening of gut isolates. Nine out of ten isolates exhibit quorum quenching activities by inhibiting the swarming motility of Pseudomonas aeruginosa. The metabolic compounds of the isolates were subjected to initial characterization using enzyme and pH neutralization, which revealed that organic acids were responsible for the inhibitory activity. The inhibition activity of LAB isolates against the quorum sensing-mediated swarming motility in P. aeruginosa was due to strong antibacterial activity.</w:t>
       </w:r>
     </w:p>
     <w:p>
@@ -24932,19 +24382,7 @@
           <w:strike w:val="0"/>
           <w:color w:val="000000"/>
         </w:rPr>
-        <w:t xml:space="preserve"> [C]</w:t>
-      </w:r>
-      <w:r>
-        <w:rPr>
-          <w:rFonts w:ascii="Georgia" w:hAnsi="Georgia" w:cs="Georgia" w:eastAsia="Georgia"/>
-          <w:sz w:val="22"/>
-          <w:szCs w:val="22"/>
-          <w:b w:val="0"/>
-          <w:bCs w:val="0"/>
-          <w:strike w:val="0"/>
-          <w:color w:val="000000"/>
-        </w:rPr>
-        <w:t xml:space="preserve"> conducted to determine the anesthetic effect of Zoletil® in zebrafish (Danio rerio). A total of 25 zebrafish with similar body sizes were used for three treatments. Treatment 1 was Zoletil® waterbath. The dosage started at 10mg/L and it continued to increase by 10mg/L with a maximum of 50 mg/L. Stage 1 of anesthesia was observed in T1, but it did not progress to Stage 2 and Stage 3 of anesthesia. Treatment 2 was waterbath mixed with Sodium bicarbonate. The dosage that was used started at 20 g/L. In dosages 20 g/L and 30 g/L, Stage 1 and Stage 2 anesthesia was observed, but it failed to induce Stage 3. Whereas dosages 40 g/L, 50 g/L, and 60 g/L were able to induce all three stages of anesthesia, Treatment 3 was a combination of Zoletil® and sodium bicarbonate. In dosage of 5 mg/L of Zoletil® and 30 g/L of sodium bicarbonate, Stage 3 was observed. T1 revealed that Zoletil® alone is not enough to fully induce Stage 3 anesthesia in zebrafish. However, when sodium bicarbonate was added, Stage 3 was achieved, while using only a small amount of Zoletil®. Additionally, it was also revealed that 40 g/L of sodium bicarbonate was sufficient to induce Stage 3 anesthesia in zebrafish.</w:t>
+        <w:t xml:space="preserve"> [C] conducted to determine the anesthetic effect of Zoletil® in zebrafish (Danio rerio). A total of 25 zebrafish with similar body sizes were used for three treatments. Treatment 1 was Zoletil® waterbath. The dosage started at 10mg/L and it continued to increase by 10mg/L with a maximum of 50 mg/L. Stage 1 of anesthesia was observed in T1, but it did not progress to Stage 2 and Stage 3 of anesthesia. Treatment 2 was waterbath mixed with Sodium bicarbonate. The dosage that was used started at 20 g/L. In dosages 20 g/L and 30 g/L, Stage 1 and Stage 2 anesthesia was observed, but it failed to induce Stage 3. Whereas dosages 40 g/L, 50 g/L, and 60 g/L were able to induce all three stages of anesthesia, Treatment 3 was a combination of Zoletil® and sodium bicarbonate. In dosage of 5 mg/L of Zoletil® and 30 g/L of sodium bicarbonate, Stage 3 was observed. T1 revealed that Zoletil® alone is not enough to fully induce Stage 3 anesthesia in zebrafish. However, when sodium bicarbonate was added, Stage 3 was achieved, while using only a small amount of Zoletil®. Additionally, it was also revealed that 40 g/L of sodium bicarbonate was sufficient to induce Stage 3 anesthesia in zebrafish.</w:t>
       </w:r>
     </w:p>
     <w:p>
@@ -25174,19 +24612,7 @@
           <w:strike w:val="0"/>
           <w:color w:val="000000"/>
         </w:rPr>
-        <w:t xml:space="preserve"> [C]</w:t>
-      </w:r>
-      <w:r>
-        <w:rPr>
-          <w:rFonts w:ascii="Georgia" w:hAnsi="Georgia" w:cs="Georgia" w:eastAsia="Georgia"/>
-          <w:sz w:val="22"/>
-          <w:szCs w:val="22"/>
-          <w:b w:val="0"/>
-          <w:bCs w:val="0"/>
-          <w:strike w:val="0"/>
-          <w:color w:val="000000"/>
-        </w:rPr>
-        <w:t xml:space="preserve"> resistance to meropenem. On the other hand, the evaluation of retail egg vendors showed a major issue of reusing the egg trays across vendors which has been strongly linked to bacterial growth on eggshells, yolks and albumen, with p-values of 0.030 and 0.014, respectively. The findings </w:t>
+        <w:t xml:space="preserve"> [C] resistance to meropenem. On the other hand, the evaluation of retail egg vendors showed a major issue of reusing the egg trays across vendors which has been strongly linked to bacterial growth on eggshells, yolks and albumen, with p-values of 0.030 and 0.014, respectively. The findings </w:t>
       </w:r>
       <w:r>
         <w:rPr>
@@ -25952,19 +25378,7 @@
           <w:strike w:val="0"/>
           <w:color w:val="000000"/>
         </w:rPr>
-        <w:t xml:space="preserve"> [G]</w:t>
-      </w:r>
-      <w:r>
-        <w:rPr>
-          <w:rFonts w:ascii="Georgia" w:hAnsi="Georgia" w:cs="Georgia" w:eastAsia="Georgia"/>
-          <w:sz w:val="22"/>
-          <w:szCs w:val="22"/>
-          <w:b w:val="0"/>
-          <w:bCs w:val="0"/>
-          <w:strike w:val="0"/>
-          <w:color w:val="000000"/>
-        </w:rPr>
-        <w:t xml:space="preserve"> sensitive to all antibiotics except amoxicillin-clavulanic acid. However, liver samples were 100% susceptible to amikacin, cefotaxime, ceftazidime, ceftiofur, chloramphenicol gentamicin, imipenem, and meropenem. Nasal swabs were 100% susceptible to ceftiofur and florfenicol, with a lower susceptibility for amoxicillin-clavulanic acid at 50% and then amoxicillin only 33%. Tracheal swabs showed 100% susceptibility for amikacin, ceftazidime, cefotaxime chloramphenicol, gentamicin, imipenem, and meropenem. Nonetheless, they only were 50% sensitive to trimethoprim-sulfamethoxazole and tetracycline. Chick samples had different susceptibility meropenem, experienced as the most susceptible antibiotic (87%) and sulfamethoxazole / trimethoprim, while sulfamethoxazole was 25%. In contrast, the data showed that lung and chick samples exhibited marked resistance. In the lung samples, resistance was observed to all tested antibiotics, and only a few were susceptible to them, while chick specimens with high resistances were found against ceftazidime, chloramphenicol, ciprofloxacin, and tetracycline. Also, nasal swabs were highly resistant to multiple antibiotics. The lung samples were resistant to all antibiotics, apart from meropenem and streptomycin.</w:t>
+        <w:t xml:space="preserve"> [G] sensitive to all antibiotics except amoxicillin-clavulanic acid. However, liver samples were 100% susceptible to amikacin, cefotaxime, ceftazidime, ceftiofur, chloramphenicol gentamicin, imipenem, and meropenem. Nasal swabs were 100% susceptible to ceftiofur and florfenicol, with a lower susceptibility for amoxicillin-clavulanic acid at 50% and then amoxicillin only 33%. Tracheal swabs showed 100% susceptibility for amikacin, ceftazidime, cefotaxime chloramphenicol, gentamicin, imipenem, and meropenem. Nonetheless, they only were 50% sensitive to trimethoprim-sulfamethoxazole and tetracycline. Chick samples had different susceptibility meropenem, experienced as the most susceptible antibiotic (87%) and sulfamethoxazole / trimethoprim, while sulfamethoxazole was 25%. In contrast, the data showed that lung and chick samples exhibited marked resistance. In the lung samples, resistance was observed to all tested antibiotics, and only a few were susceptible to them, while chick specimens with high resistances were found against ceftazidime, chloramphenicol, ciprofloxacin, and tetracycline. Also, nasal swabs were highly resistant to multiple antibiotics. The lung samples were resistant to all antibiotics, apart from meropenem and streptomycin.</w:t>
       </w:r>
     </w:p>
     <w:p>
@@ -26513,19 +25927,7 @@
           <w:strike w:val="0"/>
           <w:color w:val="000000"/>
         </w:rPr>
-        <w:t xml:space="preserve"> [G]</w:t>
-      </w:r>
-      <w:r>
-        <w:rPr>
-          <w:rFonts w:ascii="Georgia" w:hAnsi="Georgia" w:cs="Georgia" w:eastAsia="Georgia"/>
-          <w:sz w:val="22"/>
-          <w:szCs w:val="22"/>
-          <w:b w:val="0"/>
-          <w:bCs w:val="0"/>
-          <w:strike w:val="0"/>
-          <w:color w:val="000000"/>
-        </w:rPr>
-        <w:t xml:space="preserve"> antibacterial property.</w:t>
+        <w:t xml:space="preserve"> [G] antibacterial property.</w:t>
       </w:r>
     </w:p>
     <w:p>
@@ -28060,19 +27462,7 @@
           <w:strike w:val="0"/>
           <w:color w:val="000000"/>
         </w:rPr>
-        <w:t xml:space="preserve"> [G]</w:t>
-      </w:r>
-      <w:r>
-        <w:rPr>
-          <w:rFonts w:ascii="Georgia" w:hAnsi="Georgia" w:cs="Georgia" w:eastAsia="Georgia"/>
-          <w:sz w:val="22"/>
-          <w:szCs w:val="22"/>
-          <w:b w:val="0"/>
-          <w:bCs w:val="0"/>
-          <w:strike w:val="0"/>
-          <w:color w:val="000000"/>
-        </w:rPr>
-        <w:t xml:space="preserve"> the plant height, weight of fruits, number of marketable and non-marketable fruits, and computed yield. The researcher </w:t>
+        <w:t xml:space="preserve"> [G] the plant height, weight of fruits, number of marketable and non-marketable fruits, and computed yield. The researcher </w:t>
       </w:r>
       <w:r>
         <w:rPr>
@@ -28301,19 +27691,7 @@
           <w:strike w:val="0"/>
           <w:color w:val="000000"/>
         </w:rPr>
-        <w:t xml:space="preserve"> [G]</w:t>
-      </w:r>
-      <w:r>
-        <w:rPr>
-          <w:rFonts w:ascii="Georgia" w:hAnsi="Georgia" w:cs="Georgia" w:eastAsia="Georgia"/>
-          <w:sz w:val="22"/>
-          <w:szCs w:val="22"/>
-          <w:b w:val="0"/>
-          <w:bCs w:val="0"/>
-          <w:strike w:val="0"/>
-          <w:color w:val="000000"/>
-        </w:rPr>
-        <w:t xml:space="preserve"> conducted from January 2023 to April 2023 at [REDACTED] to evaluate the performance of rice as supplemented with foliar fertilizer. The experimental design used is a randomized complete block design (RCBD) with three treatments replicated three times. The following treatments were used: T1: recommended rate of NPK based on soil analysis; T2: recommended rate of NPK + 19-19-19; and T3: recommended rate of NPK + 14-14-14. The results of the study revealed the following: a significant difference was observed in the number of productive tillers, actual yield per sample area, and computed yield per ton/ha. No significant differences were observed in terms of the number of days from transplanting to flowering, plant height, number of unproductive tillers, length of panicle, number of filled grains, number of unfilled grains, and weight of 1,000 seeds. In conclusion</w:t>
+        <w:t xml:space="preserve"> [G] conducted from January 2023 to April 2023 at [REDACTED] to evaluate the performance of rice as supplemented with foliar fertilizer. The experimental design used is a randomized complete block design (RCBD) with three treatments replicated three times. The following treatments were used: T1: recommended rate of NPK based on soil analysis; T2: recommended rate of NPK + 19-19-19; and T3: recommended rate of NPK + 14-14-14. The results of the study revealed the following: a significant difference was observed in the number of productive tillers, actual yield per sample area, and computed yield per ton/ha. No significant differences were observed in terms of the number of days from transplanting to flowering, plant height, number of unproductive tillers, length of panicle, number of filled grains, number of unfilled grains, and weight of 1,000 seeds. In conclusion</w:t>
       </w:r>
       <w:r>
         <w:rPr>
@@ -28439,19 +27817,7 @@
           <w:strike w:val="0"/>
           <w:color w:val="000000"/>
         </w:rPr>
-        <w:t xml:space="preserve"> [G]</w:t>
-      </w:r>
-      <w:r>
-        <w:rPr>
-          <w:rFonts w:ascii="Georgia" w:hAnsi="Georgia" w:cs="Georgia" w:eastAsia="Georgia"/>
-          <w:sz w:val="22"/>
-          <w:szCs w:val="22"/>
-          <w:b w:val="0"/>
-          <w:bCs w:val="0"/>
-          <w:strike w:val="0"/>
-          <w:color w:val="000000"/>
-        </w:rPr>
-        <w:t xml:space="preserve"> conducted for 35 days from April 6, to May 10, 2023 in [REDACTED], [REDACTED] to determine the effect of feeding para grass mixed with varying levels of Gmelina arborea on the growth performance of rabbits. The experimental design used was a randomized complete block design (RCBD) with three treatments replicated three times. The following treatments were used: T1 ([Control] 60% Para grass + 40% Concentrate Feeds), T2 (20% GA Leaves + 40% Para grass + 40% Concentrate Feeds), and T3 (30% GA Leaves + 30% Para grass + 40% Concentrate Feeds). The results of the study revealed the following: No significant differences were observed in terms of mean initial weight (kg), mean final weight (kg), mean gain in weight (kg), mean DM intake (kg), or feed conversion ratio. The student researcher concluded that T2 (20% GA Leaves + 40% Paragrass + 40% Concentrate Feeds) was the most compelling treatment among all treatments for the rabbits in terms of outperforming the data numerically. The 20% Gmelina arborea + 40% Para grass + 40% Concentrate Feeds greatly contributed to performances in terms of obtaining the highest mean final weight, mean gain in weight, and highest net income.</w:t>
+        <w:t xml:space="preserve"> [G] conducted for 35 days from April 6, to May 10, 2023 in [REDACTED], [REDACTED] to determine the effect of feeding para grass mixed with varying levels of Gmelina arborea on the growth performance of rabbits. The experimental design used was a randomized complete block design (RCBD) with three treatments replicated three times. The following treatments were used: T1 ([Control] 60% Para grass + 40% Concentrate Feeds), T2 (20% GA Leaves + 40% Para grass + 40% Concentrate Feeds), and T3 (30% GA Leaves + 30% Para grass + 40% Concentrate Feeds). The results of the study revealed the following: No significant differences were observed in terms of mean initial weight (kg), mean final weight (kg), mean gain in weight (kg), mean DM intake (kg), or feed conversion ratio. The student researcher concluded that T2 (20% GA Leaves + 40% Paragrass + 40% Concentrate Feeds) was the most compelling treatment among all treatments for the rabbits in terms of outperforming the data numerically. The 20% Gmelina arborea + 40% Para grass + 40% Concentrate Feeds greatly contributed to performances in terms of obtaining the highest mean final weight, mean gain in weight, and highest net income.</w:t>
       </w:r>
     </w:p>
     <w:p>
@@ -28523,19 +27889,7 @@
           <w:strike w:val="0"/>
           <w:color w:val="000000"/>
         </w:rPr>
-        <w:t xml:space="preserve"> [C]</w:t>
-      </w:r>
-      <w:r>
-        <w:rPr>
-          <w:rFonts w:ascii="Georgia" w:hAnsi="Georgia" w:cs="Georgia" w:eastAsia="Georgia"/>
-          <w:sz w:val="22"/>
-          <w:szCs w:val="22"/>
-          <w:b w:val="0"/>
-          <w:bCs w:val="0"/>
-          <w:strike w:val="0"/>
-          <w:color w:val="000000"/>
-        </w:rPr>
-        <w:t xml:space="preserve"> the biggest impact, resulting in the heaviest weight. Additionally, the total return result </w:t>
+        <w:t xml:space="preserve"> [C] the biggest impact, resulting in the heaviest weight. Additionally, the total return result </w:t>
       </w:r>
       <w:r>
         <w:rPr>
@@ -28560,19 +27914,7 @@
           <w:strike w:val="0"/>
           <w:color w:val="000000"/>
         </w:rPr>
-        <w:t xml:space="preserve"> [G]</w:t>
-      </w:r>
-      <w:r>
-        <w:rPr>
-          <w:rFonts w:ascii="Georgia" w:hAnsi="Georgia" w:cs="Georgia" w:eastAsia="Georgia"/>
-          <w:sz w:val="22"/>
-          <w:szCs w:val="22"/>
-          <w:b w:val="0"/>
-          <w:bCs w:val="0"/>
-          <w:strike w:val="0"/>
-          <w:color w:val="000000"/>
-        </w:rPr>
-        <w:t xml:space="preserve"> a promising future for fermented okara extract at a level of 60 ml (166.00 PHP).</w:t>
+        <w:t xml:space="preserve"> [G] a promising future for fermented okara extract at a level of 60 ml (166.00 PHP).</w:t>
       </w:r>
     </w:p>
     <w:p>
@@ -29066,19 +28408,7 @@
           <w:strike w:val="0"/>
           <w:color w:val="000000"/>
         </w:rPr>
-        <w:t xml:space="preserve"> [G]</w:t>
-      </w:r>
-      <w:r>
-        <w:rPr>
-          <w:rFonts w:ascii="Georgia" w:hAnsi="Georgia" w:cs="Georgia" w:eastAsia="Georgia"/>
-          <w:sz w:val="22"/>
-          <w:szCs w:val="22"/>
-          <w:b w:val="0"/>
-          <w:bCs w:val="0"/>
-          <w:strike w:val="0"/>
-          <w:color w:val="000000"/>
-        </w:rPr>
-        <w:t xml:space="preserve"> Treatment 3 (sand paper method). It was found to have a significant effect on the growth and germination rate of pigeon pea in terms of days to germinate, plant height, a number of leaves, and length of leaves. Sulfuric was second in terms of the scarification method effectiveness for pigeon pea, The study treatments overall proclaimed a not significant results based from the analyzed data from each treatments except from these group of data such as from the length of leaves from week 2 and week 3 and the length of roots that are all expressed a highly significant results at 1% level and also the plant height from week 3 that also expressed a significant result at 5% level.</w:t>
+        <w:t xml:space="preserve"> [G] Treatment 3 (sand paper method). It was found to have a significant effect on the growth and germination rate of pigeon pea in terms of days to germinate, plant height, a number of leaves, and length of leaves. Sulfuric was second in terms of the scarification method effectiveness for pigeon pea, The study treatments overall proclaimed a not significant results based from the analyzed data from each treatments except from these group of data such as from the length of leaves from week 2 and week 3 and the length of roots that are all expressed a highly significant results at 1% level and also the plant height from week 3 that also expressed a significant result at 5% level.</w:t>
       </w:r>
     </w:p>
     <w:p>

</xml_diff>

<commit_message>
Draft_088: restore QR Steps 1-3; no gap before QRL; unhedged table whole on next page
</commit_message>
<xml_diff>
--- a/thesis/003_ThesisProposal_Draft_088.docx
+++ b/thesis/003_ThesisProposal_Draft_088.docx
@@ -12683,13 +12683,20 @@
     </w:p>
     <w:p>
       <w:pPr>
-        <w:spacing w:line="220" w:lineRule="auto" w:before="0" w:after="0"/>
-      </w:pPr>
-      <w:r/>
-    </w:p>
-    <w:p>
-      <w:pPr>
-        <w:spacing w:before="0" w:after="0" w:line="220" w:lineRule="auto"/>
+        <w:spacing w:after="20" w:before="0" w:line="220" w:lineRule="auto"/>
+      </w:pPr>
+      <w:r>
+        <w:rPr>
+          <w:rFonts w:ascii="Georgia" w:hAnsi="Georgia" w:cs="Georgia" w:eastAsia="Georgia"/>
+          <w:sz w:val="20"/>
+          <w:szCs w:val="20"/>
+        </w:rPr>
+        <w:t xml:space="preserve">Steps 1–3: Step 1 wide-net candidates. Step 2 retain claim mitigation only (pure framing → DO log; FP = capability/recommendation/procedure/topic-naming). Step 3 label EC/P/DO. Working Test = EC only.</w:t>
+      </w:r>
+    </w:p>
+    <w:p>
+      <w:pPr>
+        <w:spacing w:before="0" w:after="40" w:line="220" w:lineRule="auto"/>
         <w:jc w:val="left"/>
         <w:rPr/>
       </w:pPr>
@@ -17546,6 +17553,11 @@
       </w:tr>
     </w:tbl>
     <w:p>
+      <w:r>
+        <w:br w:type="page"/>
+      </w:r>
+    </w:p>
+    <w:p>
       <w:pPr>
         <w:spacing w:before="120" w:after="60" w:line="360" w:lineRule="auto"/>
         <w:jc w:val="left"/>
@@ -17763,6 +17775,7 @@
       <w:tr>
         <w:trPr>
           <w:tblHeader/>
+          <w:cantSplit/>
         </w:trPr>
         <w:tc>
           <w:tcPr>
@@ -17904,6 +17917,7 @@
       <w:tr>
         <w:trPr>
           <w:tblHeader w:val="0"/>
+          <w:cantSplit/>
         </w:trPr>
         <w:tc>
           <w:tcPr>
@@ -18029,6 +18043,7 @@
       <w:tr>
         <w:trPr>
           <w:tblHeader w:val="0"/>
+          <w:cantSplit/>
         </w:trPr>
         <w:tc>
           <w:tcPr>
@@ -18154,6 +18169,7 @@
       <w:tr>
         <w:trPr>
           <w:tblHeader w:val="0"/>
+          <w:cantSplit/>
         </w:trPr>
         <w:tc>
           <w:tcPr>

</xml_diff>

<commit_message>
Draft_088: restore Appendix A QR/QRL spacing from Draft_087
</commit_message>
<xml_diff>
--- a/thesis/003_ThesisProposal_Draft_088.docx
+++ b/thesis/003_ThesisProposal_Draft_088.docx
@@ -12467,7 +12467,7 @@
     </w:p>
     <w:p>
       <w:pPr>
-        <w:spacing w:before="0" w:after="0" w:line="220" w:lineRule="auto"/>
+        <w:spacing w:before="0" w:after="20" w:line="240" w:lineRule="auto"/>
         <w:jc w:val="left"/>
         <w:rPr/>
       </w:pPr>
@@ -12492,7 +12492,7 @@
     </w:p>
     <w:p>
       <w:pPr>
-        <w:spacing w:before="0" w:after="0" w:line="220" w:lineRule="auto"/>
+        <w:spacing w:before="20" w:after="20" w:line="240" w:lineRule="auto"/>
         <w:jc w:val="both"/>
         <w:rPr/>
       </w:pPr>
@@ -12517,7 +12517,7 @@
     </w:p>
     <w:p>
       <w:pPr>
-        <w:spacing w:before="0" w:after="0" w:line="220" w:lineRule="auto"/>
+        <w:spacing w:before="20" w:after="20" w:line="240" w:lineRule="auto"/>
         <w:jc w:val="left"/>
         <w:rPr/>
       </w:pPr>
@@ -12542,7 +12542,7 @@
     </w:p>
     <w:p>
       <w:pPr>
-        <w:spacing w:before="0" w:after="0" w:line="220" w:lineRule="auto"/>
+        <w:spacing w:before="20" w:after="20" w:line="240" w:lineRule="auto"/>
         <w:ind w:left="240" w:firstLine="0"/>
         <w:jc w:val="both"/>
         <w:rPr/>
@@ -12568,7 +12568,7 @@
     </w:p>
     <w:p>
       <w:pPr>
-        <w:spacing w:before="0" w:after="0" w:line="220" w:lineRule="auto"/>
+        <w:spacing w:before="20" w:after="20" w:line="240" w:lineRule="auto"/>
         <w:ind w:left="240" w:firstLine="0"/>
         <w:jc w:val="both"/>
         <w:rPr/>
@@ -12595,7 +12595,7 @@
     </w:p>
     <w:p>
       <w:pPr>
-        <w:spacing w:before="0" w:after="0" w:line="220" w:lineRule="auto"/>
+        <w:spacing w:before="20" w:after="20" w:line="240" w:lineRule="auto"/>
         <w:ind w:left="240" w:firstLine="0"/>
         <w:jc w:val="both"/>
         <w:rPr/>
@@ -12621,7 +12621,7 @@
     </w:p>
     <w:p>
       <w:pPr>
-        <w:spacing w:before="0" w:after="0" w:line="220" w:lineRule="auto"/>
+        <w:spacing w:before="20" w:after="20" w:line="240" w:lineRule="auto"/>
         <w:ind w:left="240" w:firstLine="0"/>
         <w:jc w:val="both"/>
         <w:rPr/>
@@ -12647,7 +12647,7 @@
     </w:p>
     <w:p>
       <w:pPr>
-        <w:spacing w:before="0" w:after="0" w:line="220" w:lineRule="auto"/>
+        <w:spacing w:before="20" w:after="20" w:line="240" w:lineRule="auto"/>
         <w:jc w:val="left"/>
         <w:rPr/>
       </w:pPr>
@@ -12665,7 +12665,7 @@
     </w:p>
     <w:p>
       <w:pPr>
-        <w:spacing w:before="0" w:after="0" w:line="220" w:lineRule="auto"/>
+        <w:spacing w:before="20" w:after="20" w:line="240" w:lineRule="auto"/>
         <w:jc w:val="left"/>
         <w:rPr/>
       </w:pPr>
@@ -12683,7 +12683,7 @@
     </w:p>
     <w:p>
       <w:pPr>
-        <w:spacing w:after="20" w:before="0" w:line="220" w:lineRule="auto"/>
+        <w:spacing w:after="20" w:before="20" w:line="240" w:lineRule="auto"/>
       </w:pPr>
       <w:r>
         <w:rPr>
@@ -12696,7 +12696,7 @@
     </w:p>
     <w:p>
       <w:pPr>
-        <w:spacing w:before="0" w:after="40" w:line="220" w:lineRule="auto"/>
+        <w:spacing w:before="80" w:after="40" w:line="240" w:lineRule="auto"/>
         <w:jc w:val="left"/>
         <w:rPr/>
       </w:pPr>
@@ -12723,7 +12723,7 @@
     </w:p>
     <w:p>
       <w:pPr>
-        <w:spacing w:before="0" w:after="0" w:line="220" w:lineRule="auto"/>
+        <w:spacing w:before="20" w:after="20" w:line="240" w:lineRule="auto"/>
         <w:ind w:firstLine="720"/>
         <w:jc w:val="both"/>
         <w:rPr/>
@@ -12787,7 +12787,7 @@
           </w:tcPr>
           <w:p>
             <w:pPr>
-              <w:spacing w:before="0" w:after="0" w:line="220" w:lineRule="auto"/>
+              <w:spacing w:before="0" w:after="0" w:line="288" w:lineRule="auto"/>
               <w:jc w:val="both"/>
               <w:rPr/>
             </w:pPr>
@@ -12821,7 +12821,7 @@
           </w:tcPr>
           <w:p>
             <w:pPr>
-              <w:spacing w:before="0" w:after="0" w:line="220" w:lineRule="auto"/>
+              <w:spacing w:before="0" w:after="0" w:line="288" w:lineRule="auto"/>
               <w:jc w:val="both"/>
               <w:rPr/>
             </w:pPr>
@@ -12855,7 +12855,7 @@
           <w:tcPr/>
           <w:p>
             <w:pPr>
-              <w:spacing w:before="0" w:after="0" w:line="220" w:lineRule="auto"/>
+              <w:spacing w:before="0" w:after="0" w:line="288" w:lineRule="auto"/>
               <w:jc w:val="both"/>
               <w:rPr/>
             </w:pPr>
@@ -12894,7 +12894,7 @@
           </w:p>
           <w:p>
             <w:pPr>
-              <w:spacing w:before="0" w:after="0" w:line="220" w:lineRule="auto"/>
+              <w:spacing w:before="0" w:after="0" w:line="288" w:lineRule="auto"/>
               <w:jc w:val="both"/>
               <w:rPr/>
             </w:pPr>
@@ -12933,7 +12933,7 @@
           </w:p>
           <w:p>
             <w:pPr>
-              <w:spacing w:before="0" w:after="0" w:line="220" w:lineRule="auto"/>
+              <w:spacing w:before="0" w:after="0" w:line="288" w:lineRule="auto"/>
               <w:jc w:val="both"/>
               <w:rPr/>
             </w:pPr>
@@ -12972,7 +12972,7 @@
           </w:p>
           <w:p>
             <w:pPr>
-              <w:spacing w:before="0" w:after="0" w:line="220" w:lineRule="auto"/>
+              <w:spacing w:before="0" w:after="0" w:line="288" w:lineRule="auto"/>
               <w:jc w:val="both"/>
               <w:rPr/>
             </w:pPr>
@@ -13014,7 +13014,7 @@
           <w:tcPr/>
           <w:p>
             <w:pPr>
-              <w:spacing w:before="0" w:after="0" w:line="220" w:lineRule="auto"/>
+              <w:spacing w:before="0" w:after="0" w:line="288" w:lineRule="auto"/>
               <w:jc w:val="both"/>
               <w:rPr/>
             </w:pPr>
@@ -13057,7 +13057,7 @@
           </w:p>
           <w:p>
             <w:pPr>
-              <w:spacing w:before="0" w:after="0" w:line="220" w:lineRule="auto"/>
+              <w:spacing w:before="0" w:after="0" w:line="288" w:lineRule="auto"/>
               <w:jc w:val="both"/>
               <w:rPr/>
             </w:pPr>
@@ -13100,7 +13100,7 @@
           </w:p>
           <w:p>
             <w:pPr>
-              <w:spacing w:before="0" w:after="0" w:line="220" w:lineRule="auto"/>
+              <w:spacing w:before="0" w:after="0" w:line="288" w:lineRule="auto"/>
               <w:jc w:val="both"/>
               <w:rPr/>
             </w:pPr>
@@ -13151,7 +13151,7 @@
           <w:tcPr/>
           <w:p>
             <w:pPr>
-              <w:spacing w:before="0" w:after="0" w:line="220" w:lineRule="auto"/>
+              <w:spacing w:before="0" w:after="0" w:line="288" w:lineRule="auto"/>
               <w:jc w:val="left"/>
               <w:rPr/>
             </w:pPr>
@@ -13180,7 +13180,7 @@
           </w:p>
           <w:p>
             <w:pPr>
-              <w:spacing w:before="0" w:after="0" w:line="220" w:lineRule="auto"/>
+              <w:spacing w:before="0" w:after="0" w:line="288" w:lineRule="auto"/>
               <w:jc w:val="both"/>
               <w:rPr/>
             </w:pPr>
@@ -13221,7 +13221,7 @@
           <w:tcPr/>
           <w:p>
             <w:pPr>
-              <w:spacing w:before="0" w:after="0" w:line="220" w:lineRule="auto"/>
+              <w:spacing w:before="0" w:after="0" w:line="288" w:lineRule="auto"/>
               <w:jc w:val="left"/>
               <w:rPr/>
             </w:pPr>
@@ -13250,7 +13250,7 @@
           </w:p>
           <w:p>
             <w:pPr>
-              <w:spacing w:before="0" w:after="0" w:line="220" w:lineRule="auto"/>
+              <w:spacing w:before="0" w:after="0" w:line="288" w:lineRule="auto"/>
               <w:jc w:val="both"/>
               <w:rPr/>
             </w:pPr>
@@ -13282,7 +13282,7 @@
     </w:tbl>
     <w:p>
       <w:pPr>
-        <w:spacing w:before="0" w:after="0" w:line="220" w:lineRule="auto"/>
+        <w:spacing w:before="40" w:after="20" w:line="240" w:lineRule="auto"/>
         <w:jc w:val="left"/>
         <w:rPr/>
         <w:keepLines/>
@@ -13310,7 +13310,7 @@
     </w:p>
     <w:p>
       <w:pPr>
-        <w:spacing w:before="0" w:after="0" w:line="220" w:lineRule="auto"/>
+        <w:spacing w:before="20" w:after="20" w:line="240" w:lineRule="auto"/>
         <w:ind w:firstLine="720"/>
         <w:jc w:val="both"/>
         <w:rPr/>
@@ -13333,7 +13333,7 @@
     </w:p>
     <w:p>
       <w:pPr>
-        <w:spacing w:before="0" w:after="0" w:line="220" w:lineRule="auto"/>
+        <w:spacing w:before="20" w:after="20" w:line="240" w:lineRule="auto"/>
         <w:ind w:firstLine="720"/>
         <w:jc w:val="both"/>
         <w:rPr/>

</xml_diff>